<commit_message>
Fix VIX filter and head-to-head prose, rebuild docx
Corrected overstatement that VIX<30 is "worse on every metric" (max DD
is marginally better). Clarified VIX filter critique in head-to-head
summary to distinguish tight vs loose thresholds.

Co-Authored-By: Claude Opus 4.6 <noreply@anthropic.com>
</commit_message>
<xml_diff>
--- a/UPRO_Timing_Strategies_Article.docx
+++ b/UPRO_Timing_Strategies_Article.docx
@@ -2689,7 +2689,7 @@
     </w:p>
     <w:p>
       <w:r>
-        <w:t>The best VIX variant (VIX &lt; 30) produced a $3.7M end value with a 0.73 Sharpe and -72.7% max drawdown. That's worse than buy-and-hold on every metric. The threshold barely filters anything -- VIX is below 30 about 94% of the time -- so you get almost all of the downside with slightly less upside.</w:t>
+        <w:t>The best VIX variant (VIX &lt; 30) produced a $3.7M end value with a 0.73 Sharpe and -72.7% max drawdown. You sacrifice two-thirds of the terminal wealth for a max drawdown that's only 4 percentage points better. The threshold barely filters anything -- VIX is below 30 about 94% of the time -- so you get almost all of the downside with slightly less upside.</w:t>
       </w:r>
     </w:p>
     <w:p>
@@ -5307,7 +5307,7 @@
     </w:p>
     <w:p>
       <w:r>
-        <w:t>HFEA is a respectable second on Sharpe (0.87) thanks to its strong Sortino ratio, but its -70.6% max drawdown means it didn't solve the core problem. The rest sacrifice too much return (Dual Momentum, VIX filter) or don't reduce risk enough (VIX &lt; 30).</w:t>
+        <w:t>HFEA is a respectable second on Sharpe (0.87) thanks to its strong Sortino ratio, but its -70.6% max drawdown means it didn't solve the core problem. Dual Momentum and Composite sacrifice too much return for the risk reduction they provide. The VIX filter either destroys returns (tight thresholds) or barely reduces risk (VIX &lt; 30).</w:t>
       </w:r>
     </w:p>
     <w:p>

</xml_diff>

<commit_message>
Add bond cash alternative analysis (TLT vs TMF vs T-bills)
build_docx.py:
- Add run_dd_exit_bond() for bond ETF cash during cooling periods
- Add chart_bond_cash() for 09_bond_cash.png comparison chart
- Run TLT and TMF variants in main(), add to CSV output

article_draft.md:
- New section "What to Do With Idle Cash" between robustness and implementation
- TLT cash: best Sharpe (0.92), beats B&H on terminal wealth ($11.1M)
- TMF cash: highest return but gives back all drawdown protection (-77%)
- Cash period return table showing TLT/TMF during each cooling period
- Updated summary, conclusion, and How to Implement for TLT recommendation

tmf_cash_analysis.py: standalone exploration script (TLT/TMF comparison)

Co-Authored-By: Claude Opus 4.6 <noreply@anthropic.com>
</commit_message>
<xml_diff>
--- a/UPRO_Timing_Strategies_Article.docx
+++ b/UPRO_Timing_Strategies_Article.docx
@@ -49,6 +49,14 @@
       </w:pPr>
       <w:r>
         <w:t>The best risk-adjusted strategy -- a simple drawdown exit with a cooling period -- delivered a 0.90 Sharpe ratio and cut the maximum drawdown from -77% to -42%, at the cost of about 12% less terminal wealth. Robustness testing (walk-forward validation, parameter heatmaps, and a synthetic pre-2009 stress test) confirms the result is not a fragile optimum.</w:t>
+      </w:r>
+    </w:p>
+    <w:p>
+      <w:pPr>
+        <w:pStyle w:val="ListBullet"/>
+      </w:pPr>
+      <w:r>
+        <w:t>An enhancement: parking idle cash in TLT (long-term Treasuries) instead of T-bills during cooling periods pushes the Sharpe to 0.92 and terminal wealth to $11.1M -- actually beating UPRO buy-and-hold -- by harvesting flight-to-quality rallies when stocks crash. The 3x bond alternative (TMF) boosts returns further but gives back all the drawdown protection.</w:t>
       </w:r>
     </w:p>
     <w:p>
@@ -5289,7 +5297,7 @@
       <w:r>
         <w:drawing>
           <wp:inline xmlns:a="http://schemas.openxmlformats.org/drawingml/2006/main" xmlns:pic="http://schemas.openxmlformats.org/drawingml/2006/picture">
-            <wp:extent cx="5486400" cy="3834910"/>
+            <wp:extent cx="5486400" cy="3829079"/>
             <wp:docPr id="4" name="Picture 4"/>
             <wp:cNvGraphicFramePr>
               <a:graphicFrameLocks noChangeAspect="1"/>
@@ -5310,7 +5318,7 @@
                   <pic:spPr>
                     <a:xfrm>
                       <a:off x="0" y="0"/>
-                      <a:ext cx="5486400" cy="3834910"/>
+                      <a:ext cx="5486400" cy="3829079"/>
                     </a:xfrm>
                     <a:prstGeom prst="rect"/>
                   </pic:spPr>
@@ -6831,6 +6839,1849 @@
         <w:pStyle w:val="Heading1"/>
       </w:pPr>
       <w:r>
+        <w:t>What to Do With Idle Cash: T-Bills vs. Bonds</w:t>
+      </w:r>
+    </w:p>
+    <w:p>
+      <w:r>
+        <w:t>So far, the DD25%/Cool40 strategy parks cash in T-bills during cooling periods -- safe, boring, and earning whatever the prevailing short-term rate is. But cooling periods tend to coincide with stock market stress, which is exactly when long-term Treasuries rally (flight to quality). Can we exploit that?</w:t>
+      </w:r>
+    </w:p>
+    <w:p>
+      <w:r>
+        <w:t>I tested three cash vehicles during the cooling periods:</w:t>
+      </w:r>
+    </w:p>
+    <w:p>
+      <w:pPr>
+        <w:pStyle w:val="ListNumber"/>
+      </w:pPr>
+      <w:r>
+        <w:rPr>
+          <w:b/>
+        </w:rPr>
+        <w:t>T-bills</w:t>
+      </w:r>
+      <w:r>
+        <w:t xml:space="preserve"> (baseline): earn the 13-week T-bill rate, compounded daily. No price risk.</w:t>
+      </w:r>
+    </w:p>
+    <w:p>
+      <w:pPr>
+        <w:pStyle w:val="ListNumber"/>
+      </w:pPr>
+      <w:r>
+        <w:rPr>
+          <w:b/>
+        </w:rPr>
+        <w:t>TLT</w:t>
+      </w:r>
+      <w:r>
+        <w:t xml:space="preserve"> (iShares 20+ Year Treasury Bond ETF): buy TLT at the open when exiting UPRO, sell TLT at the open when re-entering UPRO. Unlevered long-term bonds.</w:t>
+      </w:r>
+    </w:p>
+    <w:p>
+      <w:pPr>
+        <w:pStyle w:val="ListNumber"/>
+      </w:pPr>
+      <w:r>
+        <w:rPr>
+          <w:b/>
+        </w:rPr>
+        <w:t>TMF</w:t>
+      </w:r>
+      <w:r>
+        <w:t xml:space="preserve"> (Direxion Daily 20+ Year Treasury Bull 3X): same as TLT but 3x leveraged. Maximum flight-to-quality exposure.</w:t>
+      </w:r>
+    </w:p>
+    <w:tbl>
+      <w:tblPr>
+        <w:tblStyle w:val="LightGrid-Accent1"/>
+        <w:tblW w:type="auto" w:w="0"/>
+        <w:jc w:val="center"/>
+        <w:tblLook w:firstColumn="1" w:firstRow="1" w:lastColumn="0" w:lastRow="0" w:noHBand="0" w:noVBand="1" w:val="04A0"/>
+      </w:tblPr>
+      <w:tblGrid>
+        <w:gridCol w:w="1255"/>
+        <w:gridCol w:w="1255"/>
+        <w:gridCol w:w="1255"/>
+        <w:gridCol w:w="1255"/>
+        <w:gridCol w:w="1255"/>
+        <w:gridCol w:w="1255"/>
+        <w:gridCol w:w="1255"/>
+      </w:tblGrid>
+      <w:tr>
+        <w:tc>
+          <w:tcPr>
+            <w:tcW w:type="dxa" w:w="1255"/>
+          </w:tcPr>
+          <w:p>
+            <w:pPr>
+              <w:jc w:val="center"/>
+            </w:pPr>
+            <w:r>
+              <w:rPr>
+                <w:b/>
+                <w:sz w:val="18"/>
+              </w:rPr>
+              <w:t>Cash Vehicle</w:t>
+            </w:r>
+          </w:p>
+        </w:tc>
+        <w:tc>
+          <w:tcPr>
+            <w:tcW w:type="dxa" w:w="1255"/>
+          </w:tcPr>
+          <w:p>
+            <w:pPr>
+              <w:jc w:val="center"/>
+            </w:pPr>
+            <w:r>
+              <w:rPr>
+                <w:b/>
+                <w:sz w:val="18"/>
+              </w:rPr>
+              <w:t>End Value</w:t>
+            </w:r>
+          </w:p>
+        </w:tc>
+        <w:tc>
+          <w:tcPr>
+            <w:tcW w:type="dxa" w:w="1255"/>
+          </w:tcPr>
+          <w:p>
+            <w:pPr>
+              <w:jc w:val="center"/>
+            </w:pPr>
+            <w:r>
+              <w:rPr>
+                <w:b/>
+                <w:sz w:val="18"/>
+              </w:rPr>
+              <w:t>CAGR</w:t>
+            </w:r>
+          </w:p>
+        </w:tc>
+        <w:tc>
+          <w:tcPr>
+            <w:tcW w:type="dxa" w:w="1255"/>
+          </w:tcPr>
+          <w:p>
+            <w:pPr>
+              <w:jc w:val="center"/>
+            </w:pPr>
+            <w:r>
+              <w:rPr>
+                <w:b/>
+                <w:sz w:val="18"/>
+              </w:rPr>
+              <w:t>Sharpe</w:t>
+            </w:r>
+          </w:p>
+        </w:tc>
+        <w:tc>
+          <w:tcPr>
+            <w:tcW w:type="dxa" w:w="1255"/>
+          </w:tcPr>
+          <w:p>
+            <w:pPr>
+              <w:jc w:val="center"/>
+            </w:pPr>
+            <w:r>
+              <w:rPr>
+                <w:b/>
+                <w:sz w:val="18"/>
+              </w:rPr>
+              <w:t>Sortino</w:t>
+            </w:r>
+          </w:p>
+        </w:tc>
+        <w:tc>
+          <w:tcPr>
+            <w:tcW w:type="dxa" w:w="1255"/>
+          </w:tcPr>
+          <w:p>
+            <w:pPr>
+              <w:jc w:val="center"/>
+            </w:pPr>
+            <w:r>
+              <w:rPr>
+                <w:b/>
+                <w:sz w:val="18"/>
+              </w:rPr>
+              <w:t>Max DD</w:t>
+            </w:r>
+          </w:p>
+        </w:tc>
+        <w:tc>
+          <w:tcPr>
+            <w:tcW w:type="dxa" w:w="1255"/>
+          </w:tcPr>
+          <w:p>
+            <w:pPr>
+              <w:jc w:val="center"/>
+            </w:pPr>
+            <w:r>
+              <w:rPr>
+                <w:b/>
+                <w:sz w:val="18"/>
+              </w:rPr>
+              <w:t>Calmar</w:t>
+            </w:r>
+          </w:p>
+        </w:tc>
+      </w:tr>
+      <w:tr>
+        <w:tc>
+          <w:tcPr>
+            <w:tcW w:type="dxa" w:w="1255"/>
+          </w:tcPr>
+          <w:p>
+            <w:pPr>
+              <w:jc w:val="left"/>
+            </w:pPr>
+            <w:r>
+              <w:rPr>
+                <w:sz w:val="18"/>
+              </w:rPr>
+              <w:t>T-bills</w:t>
+            </w:r>
+          </w:p>
+        </w:tc>
+        <w:tc>
+          <w:tcPr>
+            <w:tcW w:type="dxa" w:w="1255"/>
+          </w:tcPr>
+          <w:p>
+            <w:pPr>
+              <w:jc w:val="center"/>
+            </w:pPr>
+            <w:r>
+              <w:rPr>
+                <w:sz w:val="18"/>
+              </w:rPr>
+              <w:t>$9.0M</w:t>
+            </w:r>
+          </w:p>
+        </w:tc>
+        <w:tc>
+          <w:tcPr>
+            <w:tcW w:type="dxa" w:w="1255"/>
+          </w:tcPr>
+          <w:p>
+            <w:pPr>
+              <w:jc w:val="center"/>
+            </w:pPr>
+            <w:r>
+              <w:rPr>
+                <w:sz w:val="18"/>
+              </w:rPr>
+              <w:t>+31.0%</w:t>
+            </w:r>
+          </w:p>
+        </w:tc>
+        <w:tc>
+          <w:tcPr>
+            <w:tcW w:type="dxa" w:w="1255"/>
+          </w:tcPr>
+          <w:p>
+            <w:pPr>
+              <w:jc w:val="center"/>
+            </w:pPr>
+            <w:r>
+              <w:rPr>
+                <w:sz w:val="18"/>
+              </w:rPr>
+              <w:t>0.90</w:t>
+            </w:r>
+          </w:p>
+        </w:tc>
+        <w:tc>
+          <w:tcPr>
+            <w:tcW w:type="dxa" w:w="1255"/>
+          </w:tcPr>
+          <w:p>
+            <w:pPr>
+              <w:jc w:val="center"/>
+            </w:pPr>
+            <w:r>
+              <w:rPr>
+                <w:sz w:val="18"/>
+              </w:rPr>
+              <w:t>1.07</w:t>
+            </w:r>
+          </w:p>
+        </w:tc>
+        <w:tc>
+          <w:tcPr>
+            <w:tcW w:type="dxa" w:w="1255"/>
+          </w:tcPr>
+          <w:p>
+            <w:pPr>
+              <w:jc w:val="center"/>
+            </w:pPr>
+            <w:r>
+              <w:rPr>
+                <w:sz w:val="18"/>
+              </w:rPr>
+              <w:t>-41.8%</w:t>
+            </w:r>
+          </w:p>
+        </w:tc>
+        <w:tc>
+          <w:tcPr>
+            <w:tcW w:type="dxa" w:w="1255"/>
+          </w:tcPr>
+          <w:p>
+            <w:pPr>
+              <w:jc w:val="center"/>
+            </w:pPr>
+            <w:r>
+              <w:rPr>
+                <w:sz w:val="18"/>
+              </w:rPr>
+              <w:t>0.74</w:t>
+            </w:r>
+          </w:p>
+        </w:tc>
+      </w:tr>
+      <w:tr>
+        <w:tc>
+          <w:tcPr>
+            <w:tcW w:type="dxa" w:w="1255"/>
+          </w:tcPr>
+          <w:p>
+            <w:pPr>
+              <w:jc w:val="left"/>
+            </w:pPr>
+            <w:r>
+              <w:rPr>
+                <w:b/>
+                <w:sz w:val="18"/>
+              </w:rPr>
+              <w:t>TLT</w:t>
+            </w:r>
+          </w:p>
+        </w:tc>
+        <w:tc>
+          <w:tcPr>
+            <w:tcW w:type="dxa" w:w="1255"/>
+          </w:tcPr>
+          <w:p>
+            <w:pPr>
+              <w:jc w:val="center"/>
+            </w:pPr>
+            <w:r>
+              <w:rPr>
+                <w:b/>
+                <w:sz w:val="18"/>
+              </w:rPr>
+              <w:t>$11.1M</w:t>
+            </w:r>
+          </w:p>
+        </w:tc>
+        <w:tc>
+          <w:tcPr>
+            <w:tcW w:type="dxa" w:w="1255"/>
+          </w:tcPr>
+          <w:p>
+            <w:pPr>
+              <w:jc w:val="center"/>
+            </w:pPr>
+            <w:r>
+              <w:rPr>
+                <w:b/>
+                <w:sz w:val="18"/>
+              </w:rPr>
+              <w:t>+32.7%</w:t>
+            </w:r>
+          </w:p>
+        </w:tc>
+        <w:tc>
+          <w:tcPr>
+            <w:tcW w:type="dxa" w:w="1255"/>
+          </w:tcPr>
+          <w:p>
+            <w:pPr>
+              <w:jc w:val="center"/>
+            </w:pPr>
+            <w:r>
+              <w:rPr>
+                <w:b/>
+                <w:sz w:val="18"/>
+              </w:rPr>
+              <w:t>0.92</w:t>
+            </w:r>
+          </w:p>
+        </w:tc>
+        <w:tc>
+          <w:tcPr>
+            <w:tcW w:type="dxa" w:w="1255"/>
+          </w:tcPr>
+          <w:p>
+            <w:pPr>
+              <w:jc w:val="center"/>
+            </w:pPr>
+            <w:r>
+              <w:rPr>
+                <w:b/>
+                <w:sz w:val="18"/>
+              </w:rPr>
+              <w:t>1.17</w:t>
+            </w:r>
+          </w:p>
+        </w:tc>
+        <w:tc>
+          <w:tcPr>
+            <w:tcW w:type="dxa" w:w="1255"/>
+          </w:tcPr>
+          <w:p>
+            <w:pPr>
+              <w:jc w:val="center"/>
+            </w:pPr>
+            <w:r>
+              <w:rPr>
+                <w:b/>
+                <w:sz w:val="18"/>
+              </w:rPr>
+              <w:t>-55.3%</w:t>
+            </w:r>
+          </w:p>
+        </w:tc>
+        <w:tc>
+          <w:tcPr>
+            <w:tcW w:type="dxa" w:w="1255"/>
+          </w:tcPr>
+          <w:p>
+            <w:pPr>
+              <w:jc w:val="center"/>
+            </w:pPr>
+            <w:r>
+              <w:rPr>
+                <w:b/>
+                <w:sz w:val="18"/>
+              </w:rPr>
+              <w:t>0.59</w:t>
+            </w:r>
+          </w:p>
+        </w:tc>
+      </w:tr>
+      <w:tr>
+        <w:tc>
+          <w:tcPr>
+            <w:tcW w:type="dxa" w:w="1255"/>
+          </w:tcPr>
+          <w:p>
+            <w:pPr>
+              <w:jc w:val="left"/>
+            </w:pPr>
+            <w:r>
+              <w:rPr>
+                <w:sz w:val="18"/>
+              </w:rPr>
+              <w:t>TMF</w:t>
+            </w:r>
+          </w:p>
+        </w:tc>
+        <w:tc>
+          <w:tcPr>
+            <w:tcW w:type="dxa" w:w="1255"/>
+          </w:tcPr>
+          <w:p>
+            <w:pPr>
+              <w:jc w:val="center"/>
+            </w:pPr>
+            <w:r>
+              <w:rPr>
+                <w:sz w:val="18"/>
+              </w:rPr>
+              <w:t>$12.1M</w:t>
+            </w:r>
+          </w:p>
+        </w:tc>
+        <w:tc>
+          <w:tcPr>
+            <w:tcW w:type="dxa" w:w="1255"/>
+          </w:tcPr>
+          <w:p>
+            <w:pPr>
+              <w:jc w:val="center"/>
+            </w:pPr>
+            <w:r>
+              <w:rPr>
+                <w:sz w:val="18"/>
+              </w:rPr>
+              <w:t>+33.4%</w:t>
+            </w:r>
+          </w:p>
+        </w:tc>
+        <w:tc>
+          <w:tcPr>
+            <w:tcW w:type="dxa" w:w="1255"/>
+          </w:tcPr>
+          <w:p>
+            <w:pPr>
+              <w:jc w:val="center"/>
+            </w:pPr>
+            <w:r>
+              <w:rPr>
+                <w:sz w:val="18"/>
+              </w:rPr>
+              <w:t>0.87</w:t>
+            </w:r>
+          </w:p>
+        </w:tc>
+        <w:tc>
+          <w:tcPr>
+            <w:tcW w:type="dxa" w:w="1255"/>
+          </w:tcPr>
+          <w:p>
+            <w:pPr>
+              <w:jc w:val="center"/>
+            </w:pPr>
+            <w:r>
+              <w:rPr>
+                <w:sz w:val="18"/>
+              </w:rPr>
+              <w:t>1.13</w:t>
+            </w:r>
+          </w:p>
+        </w:tc>
+        <w:tc>
+          <w:tcPr>
+            <w:tcW w:type="dxa" w:w="1255"/>
+          </w:tcPr>
+          <w:p>
+            <w:pPr>
+              <w:jc w:val="center"/>
+            </w:pPr>
+            <w:r>
+              <w:rPr>
+                <w:sz w:val="18"/>
+              </w:rPr>
+              <w:t>-76.7%</w:t>
+            </w:r>
+          </w:p>
+        </w:tc>
+        <w:tc>
+          <w:tcPr>
+            <w:tcW w:type="dxa" w:w="1255"/>
+          </w:tcPr>
+          <w:p>
+            <w:pPr>
+              <w:jc w:val="center"/>
+            </w:pPr>
+            <w:r>
+              <w:rPr>
+                <w:sz w:val="18"/>
+              </w:rPr>
+              <w:t>0.43</w:t>
+            </w:r>
+          </w:p>
+        </w:tc>
+      </w:tr>
+      <w:tr>
+        <w:tc>
+          <w:tcPr>
+            <w:tcW w:type="dxa" w:w="1255"/>
+          </w:tcPr>
+          <w:p>
+            <w:pPr>
+              <w:jc w:val="left"/>
+            </w:pPr>
+            <w:r>
+              <w:rPr>
+                <w:sz w:val="18"/>
+              </w:rPr>
+              <w:t>*UPRO B&amp;H*</w:t>
+            </w:r>
+          </w:p>
+        </w:tc>
+        <w:tc>
+          <w:tcPr>
+            <w:tcW w:type="dxa" w:w="1255"/>
+          </w:tcPr>
+          <w:p>
+            <w:pPr>
+              <w:jc w:val="center"/>
+            </w:pPr>
+            <w:r>
+              <w:rPr>
+                <w:sz w:val="18"/>
+              </w:rPr>
+              <w:t>*$10.2M*</w:t>
+            </w:r>
+          </w:p>
+        </w:tc>
+        <w:tc>
+          <w:tcPr>
+            <w:tcW w:type="dxa" w:w="1255"/>
+          </w:tcPr>
+          <w:p>
+            <w:pPr>
+              <w:jc w:val="center"/>
+            </w:pPr>
+            <w:r>
+              <w:rPr>
+                <w:sz w:val="18"/>
+              </w:rPr>
+              <w:t>*+32.0%*</w:t>
+            </w:r>
+          </w:p>
+        </w:tc>
+        <w:tc>
+          <w:tcPr>
+            <w:tcW w:type="dxa" w:w="1255"/>
+          </w:tcPr>
+          <w:p>
+            <w:pPr>
+              <w:jc w:val="center"/>
+            </w:pPr>
+            <w:r>
+              <w:rPr>
+                <w:sz w:val="18"/>
+              </w:rPr>
+              <w:t>*0.80*</w:t>
+            </w:r>
+          </w:p>
+        </w:tc>
+        <w:tc>
+          <w:tcPr>
+            <w:tcW w:type="dxa" w:w="1255"/>
+          </w:tcPr>
+          <w:p>
+            <w:pPr>
+              <w:jc w:val="center"/>
+            </w:pPr>
+            <w:r>
+              <w:rPr>
+                <w:sz w:val="18"/>
+              </w:rPr>
+              <w:t>*0.99*</w:t>
+            </w:r>
+          </w:p>
+        </w:tc>
+        <w:tc>
+          <w:tcPr>
+            <w:tcW w:type="dxa" w:w="1255"/>
+          </w:tcPr>
+          <w:p>
+            <w:pPr>
+              <w:jc w:val="center"/>
+            </w:pPr>
+            <w:r>
+              <w:rPr>
+                <w:sz w:val="18"/>
+              </w:rPr>
+              <w:t>*-76.8%*</w:t>
+            </w:r>
+          </w:p>
+        </w:tc>
+        <w:tc>
+          <w:tcPr>
+            <w:tcW w:type="dxa" w:w="1255"/>
+          </w:tcPr>
+          <w:p>
+            <w:pPr>
+              <w:jc w:val="center"/>
+            </w:pPr>
+            <w:r>
+              <w:rPr>
+                <w:sz w:val="18"/>
+              </w:rPr>
+              <w:t>*0.42*</w:t>
+            </w:r>
+          </w:p>
+        </w:tc>
+      </w:tr>
+    </w:tbl>
+    <w:p/>
+    <w:p>
+      <w:r>
+        <w:t xml:space="preserve">The TLT variant is the standout. It achieves the highest Sharpe ratio in the entire analysis (0.92) and is the </w:t>
+      </w:r>
+      <w:r>
+        <w:rPr>
+          <w:i/>
+        </w:rPr>
+        <w:t>only</w:t>
+      </w:r>
+      <w:r>
+        <w:t xml:space="preserve"> timing variant that beats UPRO buy-and-hold on terminal wealth ($11.1M vs $10.2M). The Sortino ratio (1.17) is also the best, reflecting particularly good downside risk management.</w:t>
+      </w:r>
+    </w:p>
+    <w:p>
+      <w:pPr>
+        <w:pStyle w:val="Heading2"/>
+      </w:pPr>
+      <w:r>
+        <w:t>Why TLT Works</w:t>
+      </w:r>
+    </w:p>
+    <w:p>
+      <w:r>
+        <w:t>The logic is straightforward: the DD exit fires during stock market drawdowns, and long-term Treasuries tend to rally during exactly those periods. Here are the actual TLT and TMF returns during each cooling period:</w:t>
+      </w:r>
+    </w:p>
+    <w:tbl>
+      <w:tblPr>
+        <w:tblStyle w:val="LightGrid-Accent1"/>
+        <w:tblW w:type="auto" w:w="0"/>
+        <w:jc w:val="center"/>
+        <w:tblLook w:firstColumn="1" w:firstRow="1" w:lastColumn="0" w:lastRow="0" w:noHBand="0" w:noVBand="1" w:val="04A0"/>
+      </w:tblPr>
+      <w:tblGrid>
+        <w:gridCol w:w="2196"/>
+        <w:gridCol w:w="2196"/>
+        <w:gridCol w:w="2196"/>
+        <w:gridCol w:w="2196"/>
+      </w:tblGrid>
+      <w:tr>
+        <w:tc>
+          <w:tcPr>
+            <w:tcW w:type="dxa" w:w="2196"/>
+          </w:tcPr>
+          <w:p>
+            <w:pPr>
+              <w:jc w:val="center"/>
+            </w:pPr>
+            <w:r>
+              <w:rPr>
+                <w:b/>
+                <w:sz w:val="18"/>
+              </w:rPr>
+              <w:t>Period</w:t>
+            </w:r>
+          </w:p>
+        </w:tc>
+        <w:tc>
+          <w:tcPr>
+            <w:tcW w:type="dxa" w:w="2196"/>
+          </w:tcPr>
+          <w:p>
+            <w:pPr>
+              <w:jc w:val="center"/>
+            </w:pPr>
+            <w:r>
+              <w:rPr>
+                <w:b/>
+                <w:sz w:val="18"/>
+              </w:rPr>
+              <w:t>Days</w:t>
+            </w:r>
+          </w:p>
+        </w:tc>
+        <w:tc>
+          <w:tcPr>
+            <w:tcW w:type="dxa" w:w="2196"/>
+          </w:tcPr>
+          <w:p>
+            <w:pPr>
+              <w:jc w:val="center"/>
+            </w:pPr>
+            <w:r>
+              <w:rPr>
+                <w:b/>
+                <w:sz w:val="18"/>
+              </w:rPr>
+              <w:t>TLT Return</w:t>
+            </w:r>
+          </w:p>
+        </w:tc>
+        <w:tc>
+          <w:tcPr>
+            <w:tcW w:type="dxa" w:w="2196"/>
+          </w:tcPr>
+          <w:p>
+            <w:pPr>
+              <w:jc w:val="center"/>
+            </w:pPr>
+            <w:r>
+              <w:rPr>
+                <w:b/>
+                <w:sz w:val="18"/>
+              </w:rPr>
+              <w:t>TMF Return</w:t>
+            </w:r>
+          </w:p>
+        </w:tc>
+      </w:tr>
+      <w:tr>
+        <w:tc>
+          <w:tcPr>
+            <w:tcW w:type="dxa" w:w="2196"/>
+          </w:tcPr>
+          <w:p>
+            <w:pPr>
+              <w:jc w:val="left"/>
+            </w:pPr>
+            <w:r>
+              <w:rPr>
+                <w:sz w:val="18"/>
+              </w:rPr>
+              <w:t>May-Jul 2010</w:t>
+            </w:r>
+          </w:p>
+        </w:tc>
+        <w:tc>
+          <w:tcPr>
+            <w:tcW w:type="dxa" w:w="2196"/>
+          </w:tcPr>
+          <w:p>
+            <w:pPr>
+              <w:jc w:val="center"/>
+            </w:pPr>
+            <w:r>
+              <w:rPr>
+                <w:sz w:val="18"/>
+              </w:rPr>
+              <w:t>60</w:t>
+            </w:r>
+          </w:p>
+        </w:tc>
+        <w:tc>
+          <w:tcPr>
+            <w:tcW w:type="dxa" w:w="2196"/>
+          </w:tcPr>
+          <w:p>
+            <w:pPr>
+              <w:jc w:val="center"/>
+            </w:pPr>
+            <w:r>
+              <w:rPr>
+                <w:sz w:val="18"/>
+              </w:rPr>
+              <w:t>+1.7%</w:t>
+            </w:r>
+          </w:p>
+        </w:tc>
+        <w:tc>
+          <w:tcPr>
+            <w:tcW w:type="dxa" w:w="2196"/>
+          </w:tcPr>
+          <w:p>
+            <w:pPr>
+              <w:jc w:val="center"/>
+            </w:pPr>
+            <w:r>
+              <w:rPr>
+                <w:sz w:val="18"/>
+              </w:rPr>
+              <w:t>+3.4%</w:t>
+            </w:r>
+          </w:p>
+        </w:tc>
+      </w:tr>
+      <w:tr>
+        <w:tc>
+          <w:tcPr>
+            <w:tcW w:type="dxa" w:w="2196"/>
+          </w:tcPr>
+          <w:p>
+            <w:pPr>
+              <w:jc w:val="left"/>
+            </w:pPr>
+            <w:r>
+              <w:rPr>
+                <w:sz w:val="18"/>
+              </w:rPr>
+              <w:t>Aug-Oct 2011 (debt ceiling)</w:t>
+            </w:r>
+          </w:p>
+        </w:tc>
+        <w:tc>
+          <w:tcPr>
+            <w:tcW w:type="dxa" w:w="2196"/>
+          </w:tcPr>
+          <w:p>
+            <w:pPr>
+              <w:jc w:val="center"/>
+            </w:pPr>
+            <w:r>
+              <w:rPr>
+                <w:sz w:val="18"/>
+              </w:rPr>
+              <w:t>59</w:t>
+            </w:r>
+          </w:p>
+        </w:tc>
+        <w:tc>
+          <w:tcPr>
+            <w:tcW w:type="dxa" w:w="2196"/>
+          </w:tcPr>
+          <w:p>
+            <w:pPr>
+              <w:jc w:val="center"/>
+            </w:pPr>
+            <w:r>
+              <w:rPr>
+                <w:sz w:val="18"/>
+              </w:rPr>
+              <w:t>+18.5%</w:t>
+            </w:r>
+          </w:p>
+        </w:tc>
+        <w:tc>
+          <w:tcPr>
+            <w:tcW w:type="dxa" w:w="2196"/>
+          </w:tcPr>
+          <w:p>
+            <w:pPr>
+              <w:jc w:val="center"/>
+            </w:pPr>
+            <w:r>
+              <w:rPr>
+                <w:sz w:val="18"/>
+              </w:rPr>
+              <w:t>+58.4%</w:t>
+            </w:r>
+          </w:p>
+        </w:tc>
+      </w:tr>
+      <w:tr>
+        <w:tc>
+          <w:tcPr>
+            <w:tcW w:type="dxa" w:w="2196"/>
+          </w:tcPr>
+          <w:p>
+            <w:pPr>
+              <w:jc w:val="left"/>
+            </w:pPr>
+            <w:r>
+              <w:rPr>
+                <w:sz w:val="18"/>
+              </w:rPr>
+              <w:t>Nov 2011-Jan 2012</w:t>
+            </w:r>
+          </w:p>
+        </w:tc>
+        <w:tc>
+          <w:tcPr>
+            <w:tcW w:type="dxa" w:w="2196"/>
+          </w:tcPr>
+          <w:p>
+            <w:pPr>
+              <w:jc w:val="center"/>
+            </w:pPr>
+            <w:r>
+              <w:rPr>
+                <w:sz w:val="18"/>
+              </w:rPr>
+              <w:t>55</w:t>
+            </w:r>
+          </w:p>
+        </w:tc>
+        <w:tc>
+          <w:tcPr>
+            <w:tcW w:type="dxa" w:w="2196"/>
+          </w:tcPr>
+          <w:p>
+            <w:pPr>
+              <w:jc w:val="center"/>
+            </w:pPr>
+            <w:r>
+              <w:rPr>
+                <w:sz w:val="18"/>
+              </w:rPr>
+              <w:t>-1.5%</w:t>
+            </w:r>
+          </w:p>
+        </w:tc>
+        <w:tc>
+          <w:tcPr>
+            <w:tcW w:type="dxa" w:w="2196"/>
+          </w:tcPr>
+          <w:p>
+            <w:pPr>
+              <w:jc w:val="center"/>
+            </w:pPr>
+            <w:r>
+              <w:rPr>
+                <w:sz w:val="18"/>
+              </w:rPr>
+              <w:t>-5.9%</w:t>
+            </w:r>
+          </w:p>
+        </w:tc>
+      </w:tr>
+      <w:tr>
+        <w:tc>
+          <w:tcPr>
+            <w:tcW w:type="dxa" w:w="2196"/>
+          </w:tcPr>
+          <w:p>
+            <w:pPr>
+              <w:jc w:val="left"/>
+            </w:pPr>
+            <w:r>
+              <w:rPr>
+                <w:sz w:val="18"/>
+              </w:rPr>
+              <w:t>Jun-Jul 2012</w:t>
+            </w:r>
+          </w:p>
+        </w:tc>
+        <w:tc>
+          <w:tcPr>
+            <w:tcW w:type="dxa" w:w="2196"/>
+          </w:tcPr>
+          <w:p>
+            <w:pPr>
+              <w:jc w:val="center"/>
+            </w:pPr>
+            <w:r>
+              <w:rPr>
+                <w:sz w:val="18"/>
+              </w:rPr>
+              <w:t>57</w:t>
+            </w:r>
+          </w:p>
+        </w:tc>
+        <w:tc>
+          <w:tcPr>
+            <w:tcW w:type="dxa" w:w="2196"/>
+          </w:tcPr>
+          <w:p>
+            <w:pPr>
+              <w:jc w:val="center"/>
+            </w:pPr>
+            <w:r>
+              <w:rPr>
+                <w:sz w:val="18"/>
+              </w:rPr>
+              <w:t>+0.6%</w:t>
+            </w:r>
+          </w:p>
+        </w:tc>
+        <w:tc>
+          <w:tcPr>
+            <w:tcW w:type="dxa" w:w="2196"/>
+          </w:tcPr>
+          <w:p>
+            <w:pPr>
+              <w:jc w:val="center"/>
+            </w:pPr>
+            <w:r>
+              <w:rPr>
+                <w:sz w:val="18"/>
+              </w:rPr>
+              <w:t>+0.8%</w:t>
+            </w:r>
+          </w:p>
+        </w:tc>
+      </w:tr>
+      <w:tr>
+        <w:tc>
+          <w:tcPr>
+            <w:tcW w:type="dxa" w:w="2196"/>
+          </w:tcPr>
+          <w:p>
+            <w:pPr>
+              <w:jc w:val="left"/>
+            </w:pPr>
+            <w:r>
+              <w:rPr>
+                <w:sz w:val="18"/>
+              </w:rPr>
+              <w:t>Aug-Oct 2015</w:t>
+            </w:r>
+          </w:p>
+        </w:tc>
+        <w:tc>
+          <w:tcPr>
+            <w:tcW w:type="dxa" w:w="2196"/>
+          </w:tcPr>
+          <w:p>
+            <w:pPr>
+              <w:jc w:val="center"/>
+            </w:pPr>
+            <w:r>
+              <w:rPr>
+                <w:sz w:val="18"/>
+              </w:rPr>
+              <w:t>57</w:t>
+            </w:r>
+          </w:p>
+        </w:tc>
+        <w:tc>
+          <w:tcPr>
+            <w:tcW w:type="dxa" w:w="2196"/>
+          </w:tcPr>
+          <w:p>
+            <w:pPr>
+              <w:jc w:val="center"/>
+            </w:pPr>
+            <w:r>
+              <w:rPr>
+                <w:sz w:val="18"/>
+              </w:rPr>
+              <w:t>-0.3%</w:t>
+            </w:r>
+          </w:p>
+        </w:tc>
+        <w:tc>
+          <w:tcPr>
+            <w:tcW w:type="dxa" w:w="2196"/>
+          </w:tcPr>
+          <w:p>
+            <w:pPr>
+              <w:jc w:val="center"/>
+            </w:pPr>
+            <w:r>
+              <w:rPr>
+                <w:sz w:val="18"/>
+              </w:rPr>
+              <w:t>-2.1%</w:t>
+            </w:r>
+          </w:p>
+        </w:tc>
+      </w:tr>
+      <w:tr>
+        <w:tc>
+          <w:tcPr>
+            <w:tcW w:type="dxa" w:w="2196"/>
+          </w:tcPr>
+          <w:p>
+            <w:pPr>
+              <w:jc w:val="left"/>
+            </w:pPr>
+            <w:r>
+              <w:rPr>
+                <w:sz w:val="18"/>
+              </w:rPr>
+              <w:t>Jan-Mar 2016</w:t>
+            </w:r>
+          </w:p>
+        </w:tc>
+        <w:tc>
+          <w:tcPr>
+            <w:tcW w:type="dxa" w:w="2196"/>
+          </w:tcPr>
+          <w:p>
+            <w:pPr>
+              <w:jc w:val="center"/>
+            </w:pPr>
+            <w:r>
+              <w:rPr>
+                <w:sz w:val="18"/>
+              </w:rPr>
+              <w:t>60</w:t>
+            </w:r>
+          </w:p>
+        </w:tc>
+        <w:tc>
+          <w:tcPr>
+            <w:tcW w:type="dxa" w:w="2196"/>
+          </w:tcPr>
+          <w:p>
+            <w:pPr>
+              <w:jc w:val="center"/>
+            </w:pPr>
+            <w:r>
+              <w:rPr>
+                <w:sz w:val="18"/>
+              </w:rPr>
+              <w:t>+3.1%</w:t>
+            </w:r>
+          </w:p>
+        </w:tc>
+        <w:tc>
+          <w:tcPr>
+            <w:tcW w:type="dxa" w:w="2196"/>
+          </w:tcPr>
+          <w:p>
+            <w:pPr>
+              <w:jc w:val="center"/>
+            </w:pPr>
+            <w:r>
+              <w:rPr>
+                <w:sz w:val="18"/>
+              </w:rPr>
+              <w:t>+8.2%</w:t>
+            </w:r>
+          </w:p>
+        </w:tc>
+      </w:tr>
+      <w:tr>
+        <w:tc>
+          <w:tcPr>
+            <w:tcW w:type="dxa" w:w="2196"/>
+          </w:tcPr>
+          <w:p>
+            <w:pPr>
+              <w:jc w:val="left"/>
+            </w:pPr>
+            <w:r>
+              <w:rPr>
+                <w:sz w:val="18"/>
+              </w:rPr>
+              <w:t>Feb-Apr 2018</w:t>
+            </w:r>
+          </w:p>
+        </w:tc>
+        <w:tc>
+          <w:tcPr>
+            <w:tcW w:type="dxa" w:w="2196"/>
+          </w:tcPr>
+          <w:p>
+            <w:pPr>
+              <w:jc w:val="center"/>
+            </w:pPr>
+            <w:r>
+              <w:rPr>
+                <w:sz w:val="18"/>
+              </w:rPr>
+              <w:t>60</w:t>
+            </w:r>
+          </w:p>
+        </w:tc>
+        <w:tc>
+          <w:tcPr>
+            <w:tcW w:type="dxa" w:w="2196"/>
+          </w:tcPr>
+          <w:p>
+            <w:pPr>
+              <w:jc w:val="center"/>
+            </w:pPr>
+            <w:r>
+              <w:rPr>
+                <w:sz w:val="18"/>
+              </w:rPr>
+              <w:t>+3.0%</w:t>
+            </w:r>
+          </w:p>
+        </w:tc>
+        <w:tc>
+          <w:tcPr>
+            <w:tcW w:type="dxa" w:w="2196"/>
+          </w:tcPr>
+          <w:p>
+            <w:pPr>
+              <w:jc w:val="center"/>
+            </w:pPr>
+            <w:r>
+              <w:rPr>
+                <w:sz w:val="18"/>
+              </w:rPr>
+              <w:t>+8.6%</w:t>
+            </w:r>
+          </w:p>
+        </w:tc>
+      </w:tr>
+      <w:tr>
+        <w:tc>
+          <w:tcPr>
+            <w:tcW w:type="dxa" w:w="2196"/>
+          </w:tcPr>
+          <w:p>
+            <w:pPr>
+              <w:jc w:val="left"/>
+            </w:pPr>
+            <w:r>
+              <w:rPr>
+                <w:sz w:val="18"/>
+              </w:rPr>
+              <w:t>Oct-Dec 2018</w:t>
+            </w:r>
+          </w:p>
+        </w:tc>
+        <w:tc>
+          <w:tcPr>
+            <w:tcW w:type="dxa" w:w="2196"/>
+          </w:tcPr>
+          <w:p>
+            <w:pPr>
+              <w:jc w:val="center"/>
+            </w:pPr>
+            <w:r>
+              <w:rPr>
+                <w:sz w:val="18"/>
+              </w:rPr>
+              <w:t>60</w:t>
+            </w:r>
+          </w:p>
+        </w:tc>
+        <w:tc>
+          <w:tcPr>
+            <w:tcW w:type="dxa" w:w="2196"/>
+          </w:tcPr>
+          <w:p>
+            <w:pPr>
+              <w:jc w:val="center"/>
+            </w:pPr>
+            <w:r>
+              <w:rPr>
+                <w:sz w:val="18"/>
+              </w:rPr>
+              <w:t>+6.5%</w:t>
+            </w:r>
+          </w:p>
+        </w:tc>
+        <w:tc>
+          <w:tcPr>
+            <w:tcW w:type="dxa" w:w="2196"/>
+          </w:tcPr>
+          <w:p>
+            <w:pPr>
+              <w:jc w:val="center"/>
+            </w:pPr>
+            <w:r>
+              <w:rPr>
+                <w:sz w:val="18"/>
+              </w:rPr>
+              <w:t>+19.6%</w:t>
+            </w:r>
+          </w:p>
+        </w:tc>
+      </w:tr>
+      <w:tr>
+        <w:tc>
+          <w:tcPr>
+            <w:tcW w:type="dxa" w:w="2196"/>
+          </w:tcPr>
+          <w:p>
+            <w:pPr>
+              <w:jc w:val="left"/>
+            </w:pPr>
+            <w:r>
+              <w:rPr>
+                <w:sz w:val="18"/>
+              </w:rPr>
+              <w:t>Feb-Apr 2020 (COVID)</w:t>
+            </w:r>
+          </w:p>
+        </w:tc>
+        <w:tc>
+          <w:tcPr>
+            <w:tcW w:type="dxa" w:w="2196"/>
+          </w:tcPr>
+          <w:p>
+            <w:pPr>
+              <w:jc w:val="center"/>
+            </w:pPr>
+            <w:r>
+              <w:rPr>
+                <w:sz w:val="18"/>
+              </w:rPr>
+              <w:t>59</w:t>
+            </w:r>
+          </w:p>
+        </w:tc>
+        <w:tc>
+          <w:tcPr>
+            <w:tcW w:type="dxa" w:w="2196"/>
+          </w:tcPr>
+          <w:p>
+            <w:pPr>
+              <w:jc w:val="center"/>
+            </w:pPr>
+            <w:r>
+              <w:rPr>
+                <w:sz w:val="18"/>
+              </w:rPr>
+              <w:t>+10.2%</w:t>
+            </w:r>
+          </w:p>
+        </w:tc>
+        <w:tc>
+          <w:tcPr>
+            <w:tcW w:type="dxa" w:w="2196"/>
+          </w:tcPr>
+          <w:p>
+            <w:pPr>
+              <w:jc w:val="center"/>
+            </w:pPr>
+            <w:r>
+              <w:rPr>
+                <w:sz w:val="18"/>
+              </w:rPr>
+              <w:t>+20.4%</w:t>
+            </w:r>
+          </w:p>
+        </w:tc>
+      </w:tr>
+      <w:tr>
+        <w:tc>
+          <w:tcPr>
+            <w:tcW w:type="dxa" w:w="2196"/>
+          </w:tcPr>
+          <w:p>
+            <w:pPr>
+              <w:jc w:val="left"/>
+            </w:pPr>
+            <w:r>
+              <w:rPr>
+                <w:sz w:val="18"/>
+              </w:rPr>
+              <w:t>Sep-Nov 2020</w:t>
+            </w:r>
+          </w:p>
+        </w:tc>
+        <w:tc>
+          <w:tcPr>
+            <w:tcW w:type="dxa" w:w="2196"/>
+          </w:tcPr>
+          <w:p>
+            <w:pPr>
+              <w:jc w:val="center"/>
+            </w:pPr>
+            <w:r>
+              <w:rPr>
+                <w:sz w:val="18"/>
+              </w:rPr>
+              <w:t>54</w:t>
+            </w:r>
+          </w:p>
+        </w:tc>
+        <w:tc>
+          <w:tcPr>
+            <w:tcW w:type="dxa" w:w="2196"/>
+          </w:tcPr>
+          <w:p>
+            <w:pPr>
+              <w:jc w:val="center"/>
+            </w:pPr>
+            <w:r>
+              <w:rPr>
+                <w:sz w:val="18"/>
+              </w:rPr>
+              <w:t>-3.5%</w:t>
+            </w:r>
+          </w:p>
+        </w:tc>
+        <w:tc>
+          <w:tcPr>
+            <w:tcW w:type="dxa" w:w="2196"/>
+          </w:tcPr>
+          <w:p>
+            <w:pPr>
+              <w:jc w:val="center"/>
+            </w:pPr>
+            <w:r>
+              <w:rPr>
+                <w:sz w:val="18"/>
+              </w:rPr>
+              <w:t>-11.1%</w:t>
+            </w:r>
+          </w:p>
+        </w:tc>
+      </w:tr>
+      <w:tr>
+        <w:tc>
+          <w:tcPr>
+            <w:tcW w:type="dxa" w:w="2196"/>
+          </w:tcPr>
+          <w:p>
+            <w:pPr>
+              <w:jc w:val="left"/>
+            </w:pPr>
+            <w:r>
+              <w:rPr>
+                <w:sz w:val="18"/>
+              </w:rPr>
+              <w:t>Jan-Mar 2022 (rate hikes)</w:t>
+            </w:r>
+          </w:p>
+        </w:tc>
+        <w:tc>
+          <w:tcPr>
+            <w:tcW w:type="dxa" w:w="2196"/>
+          </w:tcPr>
+          <w:p>
+            <w:pPr>
+              <w:jc w:val="center"/>
+            </w:pPr>
+            <w:r>
+              <w:rPr>
+                <w:sz w:val="18"/>
+              </w:rPr>
+              <w:t>57</w:t>
+            </w:r>
+          </w:p>
+        </w:tc>
+        <w:tc>
+          <w:tcPr>
+            <w:tcW w:type="dxa" w:w="2196"/>
+          </w:tcPr>
+          <w:p>
+            <w:pPr>
+              <w:jc w:val="center"/>
+            </w:pPr>
+            <w:r>
+              <w:rPr>
+                <w:sz w:val="18"/>
+              </w:rPr>
+              <w:t>-8.6%</w:t>
+            </w:r>
+          </w:p>
+        </w:tc>
+        <w:tc>
+          <w:tcPr>
+            <w:tcW w:type="dxa" w:w="2196"/>
+          </w:tcPr>
+          <w:p>
+            <w:pPr>
+              <w:jc w:val="center"/>
+            </w:pPr>
+            <w:r>
+              <w:rPr>
+                <w:sz w:val="18"/>
+              </w:rPr>
+              <w:t>-25.5%</w:t>
+            </w:r>
+          </w:p>
+        </w:tc>
+      </w:tr>
+      <w:tr>
+        <w:tc>
+          <w:tcPr>
+            <w:tcW w:type="dxa" w:w="2196"/>
+          </w:tcPr>
+          <w:p>
+            <w:pPr>
+              <w:jc w:val="left"/>
+            </w:pPr>
+            <w:r>
+              <w:rPr>
+                <w:sz w:val="18"/>
+              </w:rPr>
+              <w:t>Apr-Jun 2022</w:t>
+            </w:r>
+          </w:p>
+        </w:tc>
+        <w:tc>
+          <w:tcPr>
+            <w:tcW w:type="dxa" w:w="2196"/>
+          </w:tcPr>
+          <w:p>
+            <w:pPr>
+              <w:jc w:val="center"/>
+            </w:pPr>
+            <w:r>
+              <w:rPr>
+                <w:sz w:val="18"/>
+              </w:rPr>
+              <w:t>58</w:t>
+            </w:r>
+          </w:p>
+        </w:tc>
+        <w:tc>
+          <w:tcPr>
+            <w:tcW w:type="dxa" w:w="2196"/>
+          </w:tcPr>
+          <w:p>
+            <w:pPr>
+              <w:jc w:val="center"/>
+            </w:pPr>
+            <w:r>
+              <w:rPr>
+                <w:sz w:val="18"/>
+              </w:rPr>
+              <w:t>-6.8%</w:t>
+            </w:r>
+          </w:p>
+        </w:tc>
+        <w:tc>
+          <w:tcPr>
+            <w:tcW w:type="dxa" w:w="2196"/>
+          </w:tcPr>
+          <w:p>
+            <w:pPr>
+              <w:jc w:val="center"/>
+            </w:pPr>
+            <w:r>
+              <w:rPr>
+                <w:sz w:val="18"/>
+              </w:rPr>
+              <w:t>-21.3%</w:t>
+            </w:r>
+          </w:p>
+        </w:tc>
+      </w:tr>
+      <w:tr>
+        <w:tc>
+          <w:tcPr>
+            <w:tcW w:type="dxa" w:w="2196"/>
+          </w:tcPr>
+          <w:p>
+            <w:pPr>
+              <w:jc w:val="left"/>
+            </w:pPr>
+            <w:r>
+              <w:rPr>
+                <w:sz w:val="18"/>
+              </w:rPr>
+              <w:t>Sep-Nov 2022</w:t>
+            </w:r>
+          </w:p>
+        </w:tc>
+        <w:tc>
+          <w:tcPr>
+            <w:tcW w:type="dxa" w:w="2196"/>
+          </w:tcPr>
+          <w:p>
+            <w:pPr>
+              <w:jc w:val="center"/>
+            </w:pPr>
+            <w:r>
+              <w:rPr>
+                <w:sz w:val="18"/>
+              </w:rPr>
+              <w:t>56</w:t>
+            </w:r>
+          </w:p>
+        </w:tc>
+        <w:tc>
+          <w:tcPr>
+            <w:tcW w:type="dxa" w:w="2196"/>
+          </w:tcPr>
+          <w:p>
+            <w:pPr>
+              <w:jc w:val="center"/>
+            </w:pPr>
+            <w:r>
+              <w:rPr>
+                <w:sz w:val="18"/>
+              </w:rPr>
+              <w:t>-10.1%</w:t>
+            </w:r>
+          </w:p>
+        </w:tc>
+        <w:tc>
+          <w:tcPr>
+            <w:tcW w:type="dxa" w:w="2196"/>
+          </w:tcPr>
+          <w:p>
+            <w:pPr>
+              <w:jc w:val="center"/>
+            </w:pPr>
+            <w:r>
+              <w:rPr>
+                <w:sz w:val="18"/>
+              </w:rPr>
+              <w:t>-29.8%</w:t>
+            </w:r>
+          </w:p>
+        </w:tc>
+      </w:tr>
+      <w:tr>
+        <w:tc>
+          <w:tcPr>
+            <w:tcW w:type="dxa" w:w="2196"/>
+          </w:tcPr>
+          <w:p>
+            <w:pPr>
+              <w:jc w:val="left"/>
+            </w:pPr>
+            <w:r>
+              <w:rPr>
+                <w:sz w:val="18"/>
+              </w:rPr>
+              <w:t>Oct-Dec 2023</w:t>
+            </w:r>
+          </w:p>
+        </w:tc>
+        <w:tc>
+          <w:tcPr>
+            <w:tcW w:type="dxa" w:w="2196"/>
+          </w:tcPr>
+          <w:p>
+            <w:pPr>
+              <w:jc w:val="center"/>
+            </w:pPr>
+            <w:r>
+              <w:rPr>
+                <w:sz w:val="18"/>
+              </w:rPr>
+              <w:t>49</w:t>
+            </w:r>
+          </w:p>
+        </w:tc>
+        <w:tc>
+          <w:tcPr>
+            <w:tcW w:type="dxa" w:w="2196"/>
+          </w:tcPr>
+          <w:p>
+            <w:pPr>
+              <w:jc w:val="center"/>
+            </w:pPr>
+            <w:r>
+              <w:rPr>
+                <w:sz w:val="18"/>
+              </w:rPr>
+              <w:t>+18.1%</w:t>
+            </w:r>
+          </w:p>
+        </w:tc>
+        <w:tc>
+          <w:tcPr>
+            <w:tcW w:type="dxa" w:w="2196"/>
+          </w:tcPr>
+          <w:p>
+            <w:pPr>
+              <w:jc w:val="center"/>
+            </w:pPr>
+            <w:r>
+              <w:rPr>
+                <w:sz w:val="18"/>
+              </w:rPr>
+              <w:t>+58.9%</w:t>
+            </w:r>
+          </w:p>
+        </w:tc>
+      </w:tr>
+      <w:tr>
+        <w:tc>
+          <w:tcPr>
+            <w:tcW w:type="dxa" w:w="2196"/>
+          </w:tcPr>
+          <w:p>
+            <w:pPr>
+              <w:jc w:val="left"/>
+            </w:pPr>
+            <w:r>
+              <w:rPr>
+                <w:sz w:val="18"/>
+              </w:rPr>
+              <w:t>Mar-May 2025</w:t>
+            </w:r>
+          </w:p>
+        </w:tc>
+        <w:tc>
+          <w:tcPr>
+            <w:tcW w:type="dxa" w:w="2196"/>
+          </w:tcPr>
+          <w:p>
+            <w:pPr>
+              <w:jc w:val="center"/>
+            </w:pPr>
+            <w:r>
+              <w:rPr>
+                <w:sz w:val="18"/>
+              </w:rPr>
+              <w:t>57</w:t>
+            </w:r>
+          </w:p>
+        </w:tc>
+        <w:tc>
+          <w:tcPr>
+            <w:tcW w:type="dxa" w:w="2196"/>
+          </w:tcPr>
+          <w:p>
+            <w:pPr>
+              <w:jc w:val="center"/>
+            </w:pPr>
+            <w:r>
+              <w:rPr>
+                <w:sz w:val="18"/>
+              </w:rPr>
+              <w:t>-1.5%</w:t>
+            </w:r>
+          </w:p>
+        </w:tc>
+        <w:tc>
+          <w:tcPr>
+            <w:tcW w:type="dxa" w:w="2196"/>
+          </w:tcPr>
+          <w:p>
+            <w:pPr>
+              <w:jc w:val="center"/>
+            </w:pPr>
+            <w:r>
+              <w:rPr>
+                <w:sz w:val="18"/>
+              </w:rPr>
+              <w:t>-7.4%</w:t>
+            </w:r>
+          </w:p>
+        </w:tc>
+      </w:tr>
+    </w:tbl>
+    <w:p/>
+    <w:p>
+      <w:r>
+        <w:t>The pattern is clear. During genuine flight-to-quality events (2011 debt ceiling, 2018 tightening scare, COVID, late 2023), TLT delivers strong positive returns while you're out of UPRO. During rate-hiking periods (2022), TLT loses money -- but the losses are manageable (-7% to -10%), not catastrophic.</w:t>
+      </w:r>
+    </w:p>
+    <w:p>
+      <w:r>
+        <w:t>TMF amplifies both sides: +58% during the 2011 debt ceiling, but -30% during the 2022 rate hikes. The 3x leverage turns a useful hedge into a coin flip.</w:t>
+      </w:r>
+    </w:p>
+    <w:p>
+      <w:pPr>
+        <w:pStyle w:val="Heading2"/>
+      </w:pPr>
+      <w:r>
+        <w:t>The Trade-Off</w:t>
+      </w:r>
+    </w:p>
+    <w:p>
+      <w:r>
+        <w:t>TLT cash adds roughly 13 percentage points of max drawdown risk (-55% vs -42%) compared to T-bill cash. That's real. The source is 2022: three consecutive cash periods where TLT lost ground instead of providing shelter. In a T-bill world, those periods earned 0-5%. In a TLT world, they lost 8-10% each.</w:t>
+      </w:r>
+    </w:p>
+    <w:p>
+      <w:r>
+        <w:t>But the risk is bounded. TLT's worst cooling-period return was -10.1% -- painful but not portfolio-threatening. TMF's worst was -29.8% -- genuinely dangerous. The 1x bond position bends during rate hikes; the 3x position breaks.</w:t>
+      </w:r>
+    </w:p>
+    <w:p>
+      <w:r>
+        <w:rPr>
+          <w:b/>
+        </w:rPr>
+        <w:t>Bottom line:</w:t>
+      </w:r>
+      <w:r>
+        <w:t xml:space="preserve"> TLT cash is the recommended variant for investors willing to accept a -55% max drawdown (vs -42%) in exchange for higher total returns and the best risk-adjusted performance in the analysis. For investors who prioritize minimizing drawdowns above all else, T-bill cash remains the safer choice. TMF is not recommended -- it gives back the entire drawdown advantage that makes the timing strategy worthwhile.</w:t>
+      </w:r>
+    </w:p>
+    <w:p>
+      <w:pPr>
+        <w:jc w:val="center"/>
+      </w:pPr>
+      <w:r>
+        <w:drawing>
+          <wp:inline xmlns:a="http://schemas.openxmlformats.org/drawingml/2006/main" xmlns:pic="http://schemas.openxmlformats.org/drawingml/2006/picture">
+            <wp:extent cx="5486400" cy="3267431"/>
+            <wp:docPr id="9" name="Picture 9"/>
+            <wp:cNvGraphicFramePr>
+              <a:graphicFrameLocks noChangeAspect="1"/>
+            </wp:cNvGraphicFramePr>
+            <a:graphic>
+              <a:graphicData uri="http://schemas.openxmlformats.org/drawingml/2006/picture">
+                <pic:pic>
+                  <pic:nvPicPr>
+                    <pic:cNvPr id="0" name="09_bond_cash.png"/>
+                    <pic:cNvPicPr/>
+                  </pic:nvPicPr>
+                  <pic:blipFill>
+                    <a:blip r:embed="rId17"/>
+                    <a:stretch>
+                      <a:fillRect/>
+                    </a:stretch>
+                  </pic:blipFill>
+                  <pic:spPr>
+                    <a:xfrm>
+                      <a:off x="0" y="0"/>
+                      <a:ext cx="5486400" cy="3267431"/>
+                    </a:xfrm>
+                    <a:prstGeom prst="rect"/>
+                  </pic:spPr>
+                </pic:pic>
+              </a:graphicData>
+            </a:graphic>
+          </wp:inline>
+        </w:drawing>
+      </w:r>
+    </w:p>
+    <w:p/>
+    <w:p>
+      <w:pPr>
+        <w:pStyle w:val="Heading1"/>
+      </w:pPr>
+      <w:r>
         <w:t>How to Implement the Drawdown Exit</w:t>
       </w:r>
     </w:p>
@@ -6878,7 +8729,7 @@
         <w:t>If the drawdown exceeds -25%</w:t>
       </w:r>
       <w:r>
-        <w:t>, sell all UPRO at the next market open. Move proceeds to a money market fund or short-term Treasuries.</w:t>
+        <w:t>, sell all UPRO at the next market open. Move proceeds to TLT (or a money market fund if you prefer the safer variant).</w:t>
       </w:r>
     </w:p>
     <w:p>
@@ -6955,10 +8806,10 @@
         <w:rPr>
           <w:b/>
         </w:rPr>
-        <w:t>Cash return.</w:t>
+        <w:t>Cash vehicle.</w:t>
       </w:r>
       <w:r>
-        <w:t xml:space="preserve"> Our backtest models T-bill rates during cash periods. In 2023-2024, money market funds yielded 5%+. The results already reflect this realistic assumption.</w:t>
+        <w:t xml:space="preserve"> The baseline backtest uses T-bill rates during cash periods. The TLT variant -- buying long-term Treasuries during cooling periods -- produced the highest Sharpe ratio (0.92) and actually beat buy-and-hold on terminal wealth. See the "What to Do With Idle Cash" section for the full comparison.</w:t>
       </w:r>
     </w:p>
     <w:p>
@@ -7168,17 +9019,22 @@
     </w:p>
     <w:p>
       <w:r>
-        <w:t>Simple drawdown-triggered exits can meaningfully improve UPRO's risk profile without exotic indicators, frequent trading, or complex portfolio construction. The DD25%/Cool40 rule -- exit at a 25% drawdown, wait 40 trading days before re-entering -- delivered the highest Sharpe ratio in the analysis (0.90) while cutting the maximum drawdown from -77% to -42%.</w:t>
+        <w:t>Simple drawdown-triggered exits can meaningfully improve UPRO's risk profile without exotic indicators, frequent trading, or complex portfolio construction. The DD25%/Cool40 rule -- exit at a 25% drawdown, wait 40 trading days before re-entering -- delivered a 0.90 Sharpe ratio while cutting the maximum drawdown from -77% to -42%.</w:t>
       </w:r>
     </w:p>
     <w:p>
       <w:r>
-        <w:t>The trade-off is real: approximately 12% less terminal wealth over 16+ years. You're giving up about $1.2 million on a $100K starting portfolio. Whether it's worth it depends on whether you'd actually hold through a -77% drawdown. If the honest answer is no, then a strategy that caps your pain at -42% and keeps 88% of the upside is a rational choice.</w:t>
+        <w:t>Parking idle cash in TLT during cooling periods pushes the result further: a 0.92 Sharpe ratio, $11.1M terminal wealth (beating buy-and-hold's $10.2M), and a -55% max drawdown. The TLT variant exploits the flight-to-quality effect -- when stocks crash, long-term Treasuries tend to rally -- turning the cooling period from dead time into a productive hedge.</w:t>
       </w:r>
     </w:p>
     <w:p>
       <w:r>
-        <w:t>Robustness testing supports this conclusion. A parameter heatmap shows DD25%/Cool40 sits in a broad region of strong performance, not on a fragile peak. Walk-forward validation (train 2009-2016, test 2017-2026) confirms the approach works out-of-sample. And a synthetic pre-2009 stress test shows the strategy provides modest benefit even through the worst decade in modern market history. Adding SMA re-entry gates, a natural "improvement," actually makes things worse -- the original rule is already well-tuned.</w:t>
+        <w:t>The trade-off is explicit. The T-bill variant caps max drawdown at -42% but gives up 12% of buy-and-hold's terminal wealth. The TLT variant beats buy-and-hold on wealth but accepts a -55% max drawdown. Pick the one that matches your risk tolerance.</w:t>
+      </w:r>
+    </w:p>
+    <w:p>
+      <w:r>
+        <w:t>Robustness testing supports both variants. A parameter heatmap shows the DD25%/Cool40 parameters sit in a broad region of strong performance, not on a fragile peak. Walk-forward validation (train 2009-2016, test 2017-2026) confirms the approach works out-of-sample. And a synthetic pre-2009 stress test shows the strategy provides modest benefit even through the worst decade in modern market history.</w:t>
       </w:r>
     </w:p>
     <w:p>

</xml_diff>

<commit_message>
Add options-based leverage comparison section to article
New section before Conclusion compares UPRO DD25/Cool40 to 80-delta
options approach. Rebuilt .docx with updated content.

Co-Authored-By: Claude Opus 4.6 <noreply@anthropic.com>
</commit_message>
<xml_diff>
--- a/UPRO_Timing_Strategies_Article.docx
+++ b/UPRO_Timing_Strategies_Article.docx
@@ -9007,6 +9007,38 @@
       </w:r>
       <w:r>
         <w:t xml:space="preserve"> When UPRO is ripping higher and you're sitting in cash because of the cooling period, you will want to override the rule. When UPRO has dropped 24.5% and you haven't sold because the threshold is 25%, you will want to override the rule. The strategy only works if you follow it mechanically. History suggests most people won't.</w:t>
+      </w:r>
+    </w:p>
+    <w:p>
+      <w:pPr>
+        <w:pStyle w:val="Heading1"/>
+      </w:pPr>
+      <w:r>
+        <w:t>How Does This Compare to Options-Based Leverage?</w:t>
+      </w:r>
+    </w:p>
+    <w:p>
+      <w:r>
+        <w:t>Not every investor can or wants to hold leveraged ETFs. Some IRA custodians restrict them, and many investors are uncomfortable with a product that resets leverage daily and is subject to volatility decay. An alternative approach to leveraged equity exposure is buying deep in-the-money (80-delta) SPY call options, which provide roughly 1.5-2x leverage through embedded leverage in the option premium. When combined with an SMA200 trend filter — buy only when SPY is above its 200-day moving average — the options approach avoids bear market exposure entirely by sitting in cash below the moving average.</w:t>
+      </w:r>
+    </w:p>
+    <w:p>
+      <w:r>
+        <w:t>Over the same 2015-2026 period with actual market data, the 80-delta options-only strategy produced a +24.7% CAGR (0.85 Sharpe, -39.1% max drawdown) compared to UPRO DD25/Cool40's +25.2% CAGR (0.79 Sharpe, -41.8% max drawdown). The returns are nearly identical, and the options approach actually edges ahead on risk-adjusted metrics. But the operational difference is enormous: 1,233 option trades over 11 years versus ~15 round-trips for the drawdown exit. UPRO DD25/Cool40 requires checking one number (the drawdown percentage) once a day. The 80-delta options strategy requires monitoring positions, rolling expirations, managing entries and exits across dozens of concurrent positions, and dealing with the occasional illiquid option chain.</w:t>
+      </w:r>
+    </w:p>
+    <w:p>
+      <w:r>
+        <w:t xml:space="preserve">If you </w:t>
+      </w:r>
+      <w:r>
+        <w:rPr>
+          <w:i/>
+        </w:rPr>
+        <w:t>can</w:t>
+      </w:r>
+      <w:r>
+        <w:t xml:space="preserve"> hold UPRO and have the discipline to follow the DD25/Cool40 rule mechanically, it's the simpler, better choice. The options-based approach is worth considering only if leveraged ETFs are unavailable in your account or if you have the infrastructure and temperament for active options management.</w:t>
       </w:r>
     </w:p>
     <w:p>

</xml_diff>

<commit_message>
Add stratification analysis, charts, and anomaly discussion to article
- Expand "How Does This Compare to Options-Based Leverage?" with regime
  summary table, 3 new charts, and "What the Data Reveals" subsection
- Add 3 stratification charts (10-12): returns by bucket, leverage ratios,
  regime summary
- Rebuild .docx with new content and charts embedded

Co-Authored-By: Claude Opus 4.6 <noreply@anthropic.com>
</commit_message>
<xml_diff>
--- a/UPRO_Timing_Strategies_Article.docx
+++ b/UPRO_Timing_Strategies_Article.docx
@@ -9024,7 +9024,648 @@
     </w:p>
     <w:p>
       <w:r>
-        <w:t>Over the same 2015-2026 period with actual market data, the 80-delta options-only strategy produced a +24.7% CAGR (0.85 Sharpe, -39.1% max drawdown) compared to UPRO DD25/Cool40's +25.2% CAGR (0.79 Sharpe, -41.8% max drawdown). The returns are nearly identical, and the options approach actually edges ahead on risk-adjusted metrics. But the operational difference is enormous: 1,233 option trades over 11 years versus ~15 round-trips for the drawdown exit. UPRO DD25/Cool40 requires checking one number (the drawdown percentage) once a day. The 80-delta options strategy requires monitoring positions, rolling expirations, managing entries and exits across dozens of concurrent positions, and dealing with the occasional illiquid option chain.</w:t>
+        <w:t>Over the same 2015-2026 period with actual market data, the 80-delta options-only strategy produced a +24.7% CAGR (0.85 Sharpe, -39.1% max drawdown) compared to UPRO DD25/Cool40's +25.2% CAGR (0.79 Sharpe, -41.8% max drawdown). The returns are nearly identical, and the options approach actually edges ahead on risk-adjusted metrics. But the operational difference is enormous: 1,233 option trades over 11 years versus ~15 round-trips for the drawdown exit.</w:t>
+      </w:r>
+    </w:p>
+    <w:p>
+      <w:pPr>
+        <w:pStyle w:val="Heading2"/>
+      </w:pPr>
+      <w:r>
+        <w:t>Stratifying Returns by Market Regime</w:t>
+      </w:r>
+    </w:p>
+    <w:p>
+      <w:r>
+        <w:t xml:space="preserve">To understand </w:t>
+      </w:r>
+      <w:r>
+        <w:rPr>
+          <w:i/>
+        </w:rPr>
+        <w:t>how</w:t>
+      </w:r>
+      <w:r>
+        <w:t xml:space="preserve"> these strategies differ — not just in aggregate, but across different market environments — I bucketed all 201 months from 2009-2026 by SPY's monthly return and computed average returns for each strategy within each bucket. The regime-level summary:</w:t>
+      </w:r>
+    </w:p>
+    <w:tbl>
+      <w:tblPr>
+        <w:tblStyle w:val="LightGrid-Accent1"/>
+        <w:tblW w:type="auto" w:w="0"/>
+        <w:jc w:val="center"/>
+        <w:tblLook w:firstColumn="1" w:firstRow="1" w:lastColumn="0" w:lastRow="0" w:noHBand="0" w:noVBand="1" w:val="04A0"/>
+      </w:tblPr>
+      <w:tblGrid>
+        <w:gridCol w:w="1464"/>
+        <w:gridCol w:w="1464"/>
+        <w:gridCol w:w="1464"/>
+        <w:gridCol w:w="1464"/>
+        <w:gridCol w:w="1464"/>
+        <w:gridCol w:w="1464"/>
+      </w:tblGrid>
+      <w:tr>
+        <w:tc>
+          <w:tcPr>
+            <w:tcW w:type="dxa" w:w="1464"/>
+          </w:tcPr>
+          <w:p>
+            <w:pPr>
+              <w:jc w:val="center"/>
+            </w:pPr>
+            <w:r>
+              <w:rPr>
+                <w:b/>
+                <w:sz w:val="18"/>
+              </w:rPr>
+              <w:t>Regime</w:t>
+            </w:r>
+          </w:p>
+        </w:tc>
+        <w:tc>
+          <w:tcPr>
+            <w:tcW w:type="dxa" w:w="1464"/>
+          </w:tcPr>
+          <w:p>
+            <w:pPr>
+              <w:jc w:val="center"/>
+            </w:pPr>
+            <w:r>
+              <w:rPr>
+                <w:b/>
+                <w:sz w:val="18"/>
+              </w:rPr>
+              <w:t>Count</w:t>
+            </w:r>
+          </w:p>
+        </w:tc>
+        <w:tc>
+          <w:tcPr>
+            <w:tcW w:type="dxa" w:w="1464"/>
+          </w:tcPr>
+          <w:p>
+            <w:pPr>
+              <w:jc w:val="center"/>
+            </w:pPr>
+            <w:r>
+              <w:rPr>
+                <w:b/>
+                <w:sz w:val="18"/>
+              </w:rPr>
+              <w:t>SPY Avg</w:t>
+            </w:r>
+          </w:p>
+        </w:tc>
+        <w:tc>
+          <w:tcPr>
+            <w:tcW w:type="dxa" w:w="1464"/>
+          </w:tcPr>
+          <w:p>
+            <w:pPr>
+              <w:jc w:val="center"/>
+            </w:pPr>
+            <w:r>
+              <w:rPr>
+                <w:b/>
+                <w:sz w:val="18"/>
+              </w:rPr>
+              <w:t>UPRO B&amp;H</w:t>
+            </w:r>
+          </w:p>
+        </w:tc>
+        <w:tc>
+          <w:tcPr>
+            <w:tcW w:type="dxa" w:w="1464"/>
+          </w:tcPr>
+          <w:p>
+            <w:pPr>
+              <w:jc w:val="center"/>
+            </w:pPr>
+            <w:r>
+              <w:rPr>
+                <w:b/>
+                <w:sz w:val="18"/>
+              </w:rPr>
+              <w:t>UPRO DD25</w:t>
+            </w:r>
+          </w:p>
+        </w:tc>
+        <w:tc>
+          <w:tcPr>
+            <w:tcW w:type="dxa" w:w="1464"/>
+          </w:tcPr>
+          <w:p>
+            <w:pPr>
+              <w:jc w:val="center"/>
+            </w:pPr>
+            <w:r>
+              <w:rPr>
+                <w:b/>
+                <w:sz w:val="18"/>
+              </w:rPr>
+              <w:t>80D Opts</w:t>
+            </w:r>
+          </w:p>
+        </w:tc>
+      </w:tr>
+      <w:tr>
+        <w:tc>
+          <w:tcPr>
+            <w:tcW w:type="dxa" w:w="1464"/>
+          </w:tcPr>
+          <w:p>
+            <w:pPr>
+              <w:jc w:val="left"/>
+            </w:pPr>
+            <w:r>
+              <w:rPr>
+                <w:sz w:val="18"/>
+              </w:rPr>
+              <w:t>Bear (SPY &lt; -2%)</w:t>
+            </w:r>
+          </w:p>
+        </w:tc>
+        <w:tc>
+          <w:tcPr>
+            <w:tcW w:type="dxa" w:w="1464"/>
+          </w:tcPr>
+          <w:p>
+            <w:pPr>
+              <w:jc w:val="center"/>
+            </w:pPr>
+            <w:r>
+              <w:rPr>
+                <w:sz w:val="18"/>
+              </w:rPr>
+              <w:t>39</w:t>
+            </w:r>
+          </w:p>
+        </w:tc>
+        <w:tc>
+          <w:tcPr>
+            <w:tcW w:type="dxa" w:w="1464"/>
+          </w:tcPr>
+          <w:p>
+            <w:pPr>
+              <w:jc w:val="center"/>
+            </w:pPr>
+            <w:r>
+              <w:rPr>
+                <w:sz w:val="18"/>
+              </w:rPr>
+              <w:t>-5.2%</w:t>
+            </w:r>
+          </w:p>
+        </w:tc>
+        <w:tc>
+          <w:tcPr>
+            <w:tcW w:type="dxa" w:w="1464"/>
+          </w:tcPr>
+          <w:p>
+            <w:pPr>
+              <w:jc w:val="center"/>
+            </w:pPr>
+            <w:r>
+              <w:rPr>
+                <w:sz w:val="18"/>
+              </w:rPr>
+              <w:t>-16.2%</w:t>
+            </w:r>
+          </w:p>
+        </w:tc>
+        <w:tc>
+          <w:tcPr>
+            <w:tcW w:type="dxa" w:w="1464"/>
+          </w:tcPr>
+          <w:p>
+            <w:pPr>
+              <w:jc w:val="center"/>
+            </w:pPr>
+            <w:r>
+              <w:rPr>
+                <w:sz w:val="18"/>
+              </w:rPr>
+              <w:t>-12.3%</w:t>
+            </w:r>
+          </w:p>
+        </w:tc>
+        <w:tc>
+          <w:tcPr>
+            <w:tcW w:type="dxa" w:w="1464"/>
+          </w:tcPr>
+          <w:p>
+            <w:pPr>
+              <w:jc w:val="center"/>
+            </w:pPr>
+            <w:r>
+              <w:rPr>
+                <w:sz w:val="18"/>
+              </w:rPr>
+              <w:t>-5.6%</w:t>
+            </w:r>
+          </w:p>
+        </w:tc>
+      </w:tr>
+      <w:tr>
+        <w:tc>
+          <w:tcPr>
+            <w:tcW w:type="dxa" w:w="1464"/>
+          </w:tcPr>
+          <w:p>
+            <w:pPr>
+              <w:jc w:val="left"/>
+            </w:pPr>
+            <w:r>
+              <w:rPr>
+                <w:sz w:val="18"/>
+              </w:rPr>
+              <w:t>Flat (-2% to +2%)</w:t>
+            </w:r>
+          </w:p>
+        </w:tc>
+        <w:tc>
+          <w:tcPr>
+            <w:tcW w:type="dxa" w:w="1464"/>
+          </w:tcPr>
+          <w:p>
+            <w:pPr>
+              <w:jc w:val="center"/>
+            </w:pPr>
+            <w:r>
+              <w:rPr>
+                <w:sz w:val="18"/>
+              </w:rPr>
+              <w:t>71</w:t>
+            </w:r>
+          </w:p>
+        </w:tc>
+        <w:tc>
+          <w:tcPr>
+            <w:tcW w:type="dxa" w:w="1464"/>
+          </w:tcPr>
+          <w:p>
+            <w:pPr>
+              <w:jc w:val="center"/>
+            </w:pPr>
+            <w:r>
+              <w:rPr>
+                <w:sz w:val="18"/>
+              </w:rPr>
+              <w:t>+0.3%</w:t>
+            </w:r>
+          </w:p>
+        </w:tc>
+        <w:tc>
+          <w:tcPr>
+            <w:tcW w:type="dxa" w:w="1464"/>
+          </w:tcPr>
+          <w:p>
+            <w:pPr>
+              <w:jc w:val="center"/>
+            </w:pPr>
+            <w:r>
+              <w:rPr>
+                <w:sz w:val="18"/>
+              </w:rPr>
+              <w:t>+0.2%</w:t>
+            </w:r>
+          </w:p>
+        </w:tc>
+        <w:tc>
+          <w:tcPr>
+            <w:tcW w:type="dxa" w:w="1464"/>
+          </w:tcPr>
+          <w:p>
+            <w:pPr>
+              <w:jc w:val="center"/>
+            </w:pPr>
+            <w:r>
+              <w:rPr>
+                <w:sz w:val="18"/>
+              </w:rPr>
+              <w:t>+0.4%</w:t>
+            </w:r>
+          </w:p>
+        </w:tc>
+        <w:tc>
+          <w:tcPr>
+            <w:tcW w:type="dxa" w:w="1464"/>
+          </w:tcPr>
+          <w:p>
+            <w:pPr>
+              <w:jc w:val="center"/>
+            </w:pPr>
+            <w:r>
+              <w:rPr>
+                <w:sz w:val="18"/>
+              </w:rPr>
+              <w:t>+0.1%</w:t>
+            </w:r>
+          </w:p>
+        </w:tc>
+      </w:tr>
+      <w:tr>
+        <w:tc>
+          <w:tcPr>
+            <w:tcW w:type="dxa" w:w="1464"/>
+          </w:tcPr>
+          <w:p>
+            <w:pPr>
+              <w:jc w:val="left"/>
+            </w:pPr>
+            <w:r>
+              <w:rPr>
+                <w:sz w:val="18"/>
+              </w:rPr>
+              <w:t>Bull (SPY &gt;= +2%)</w:t>
+            </w:r>
+          </w:p>
+        </w:tc>
+        <w:tc>
+          <w:tcPr>
+            <w:tcW w:type="dxa" w:w="1464"/>
+          </w:tcPr>
+          <w:p>
+            <w:pPr>
+              <w:jc w:val="center"/>
+            </w:pPr>
+            <w:r>
+              <w:rPr>
+                <w:sz w:val="18"/>
+              </w:rPr>
+              <w:t>91</w:t>
+            </w:r>
+          </w:p>
+        </w:tc>
+        <w:tc>
+          <w:tcPr>
+            <w:tcW w:type="dxa" w:w="1464"/>
+          </w:tcPr>
+          <w:p>
+            <w:pPr>
+              <w:jc w:val="center"/>
+            </w:pPr>
+            <w:r>
+              <w:rPr>
+                <w:sz w:val="18"/>
+              </w:rPr>
+              <w:t>+4.5%</w:t>
+            </w:r>
+          </w:p>
+        </w:tc>
+        <w:tc>
+          <w:tcPr>
+            <w:tcW w:type="dxa" w:w="1464"/>
+          </w:tcPr>
+          <w:p>
+            <w:pPr>
+              <w:jc w:val="center"/>
+            </w:pPr>
+            <w:r>
+              <w:rPr>
+                <w:sz w:val="18"/>
+              </w:rPr>
+              <w:t>+13.1%</w:t>
+            </w:r>
+          </w:p>
+        </w:tc>
+        <w:tc>
+          <w:tcPr>
+            <w:tcW w:type="dxa" w:w="1464"/>
+          </w:tcPr>
+          <w:p>
+            <w:pPr>
+              <w:jc w:val="center"/>
+            </w:pPr>
+            <w:r>
+              <w:rPr>
+                <w:sz w:val="18"/>
+              </w:rPr>
+              <w:t>+10.5%</w:t>
+            </w:r>
+          </w:p>
+        </w:tc>
+        <w:tc>
+          <w:tcPr>
+            <w:tcW w:type="dxa" w:w="1464"/>
+          </w:tcPr>
+          <w:p>
+            <w:pPr>
+              <w:jc w:val="center"/>
+            </w:pPr>
+            <w:r>
+              <w:rPr>
+                <w:sz w:val="18"/>
+              </w:rPr>
+              <w:t>+5.2%</w:t>
+            </w:r>
+          </w:p>
+        </w:tc>
+      </w:tr>
+    </w:tbl>
+    <w:p/>
+    <w:p>
+      <w:r>
+        <w:t>The full bucket-by-bucket breakdown reveals how each strategy's leverage ratio shifts across the return distribution:</w:t>
+      </w:r>
+    </w:p>
+    <w:p>
+      <w:pPr>
+        <w:jc w:val="center"/>
+      </w:pPr>
+      <w:r>
+        <w:drawing>
+          <wp:inline xmlns:a="http://schemas.openxmlformats.org/drawingml/2006/main" xmlns:pic="http://schemas.openxmlformats.org/drawingml/2006/picture">
+            <wp:extent cx="5486400" cy="2324813"/>
+            <wp:docPr id="10" name="Picture 10"/>
+            <wp:cNvGraphicFramePr>
+              <a:graphicFrameLocks noChangeAspect="1"/>
+            </wp:cNvGraphicFramePr>
+            <a:graphic>
+              <a:graphicData uri="http://schemas.openxmlformats.org/drawingml/2006/picture">
+                <pic:pic>
+                  <pic:nvPicPr>
+                    <pic:cNvPr id="0" name="10_stratification_returns.png"/>
+                    <pic:cNvPicPr/>
+                  </pic:nvPicPr>
+                  <pic:blipFill>
+                    <a:blip r:embed="rId18"/>
+                    <a:stretch>
+                      <a:fillRect/>
+                    </a:stretch>
+                  </pic:blipFill>
+                  <pic:spPr>
+                    <a:xfrm>
+                      <a:off x="0" y="0"/>
+                      <a:ext cx="5486400" cy="2324813"/>
+                    </a:xfrm>
+                    <a:prstGeom prst="rect"/>
+                  </pic:spPr>
+                </pic:pic>
+              </a:graphicData>
+            </a:graphic>
+          </wp:inline>
+        </w:drawing>
+      </w:r>
+    </w:p>
+    <w:p/>
+    <w:p>
+      <w:pPr>
+        <w:jc w:val="center"/>
+      </w:pPr>
+      <w:r>
+        <w:drawing>
+          <wp:inline xmlns:a="http://schemas.openxmlformats.org/drawingml/2006/main" xmlns:pic="http://schemas.openxmlformats.org/drawingml/2006/picture">
+            <wp:extent cx="5486400" cy="2325649"/>
+            <wp:docPr id="11" name="Picture 11"/>
+            <wp:cNvGraphicFramePr>
+              <a:graphicFrameLocks noChangeAspect="1"/>
+            </wp:cNvGraphicFramePr>
+            <a:graphic>
+              <a:graphicData uri="http://schemas.openxmlformats.org/drawingml/2006/picture">
+                <pic:pic>
+                  <pic:nvPicPr>
+                    <pic:cNvPr id="0" name="11_leverage_ratios.png"/>
+                    <pic:cNvPicPr/>
+                  </pic:nvPicPr>
+                  <pic:blipFill>
+                    <a:blip r:embed="rId19"/>
+                    <a:stretch>
+                      <a:fillRect/>
+                    </a:stretch>
+                  </pic:blipFill>
+                  <pic:spPr>
+                    <a:xfrm>
+                      <a:off x="0" y="0"/>
+                      <a:ext cx="5486400" cy="2325649"/>
+                    </a:xfrm>
+                    <a:prstGeom prst="rect"/>
+                  </pic:spPr>
+                </pic:pic>
+              </a:graphicData>
+            </a:graphic>
+          </wp:inline>
+        </w:drawing>
+      </w:r>
+    </w:p>
+    <w:p/>
+    <w:p>
+      <w:pPr>
+        <w:jc w:val="center"/>
+      </w:pPr>
+      <w:r>
+        <w:drawing>
+          <wp:inline xmlns:a="http://schemas.openxmlformats.org/drawingml/2006/main" xmlns:pic="http://schemas.openxmlformats.org/drawingml/2006/picture">
+            <wp:extent cx="5486400" cy="3255818"/>
+            <wp:docPr id="12" name="Picture 12"/>
+            <wp:cNvGraphicFramePr>
+              <a:graphicFrameLocks noChangeAspect="1"/>
+            </wp:cNvGraphicFramePr>
+            <a:graphic>
+              <a:graphicData uri="http://schemas.openxmlformats.org/drawingml/2006/picture">
+                <pic:pic>
+                  <pic:nvPicPr>
+                    <pic:cNvPr id="0" name="12_regime_summary.png"/>
+                    <pic:cNvPicPr/>
+                  </pic:nvPicPr>
+                  <pic:blipFill>
+                    <a:blip r:embed="rId20"/>
+                    <a:stretch>
+                      <a:fillRect/>
+                    </a:stretch>
+                  </pic:blipFill>
+                  <pic:spPr>
+                    <a:xfrm>
+                      <a:off x="0" y="0"/>
+                      <a:ext cx="5486400" cy="3255818"/>
+                    </a:xfrm>
+                    <a:prstGeom prst="rect"/>
+                  </pic:spPr>
+                </pic:pic>
+              </a:graphicData>
+            </a:graphic>
+          </wp:inline>
+        </w:drawing>
+      </w:r>
+    </w:p>
+    <w:p/>
+    <w:p>
+      <w:pPr>
+        <w:pStyle w:val="Heading2"/>
+      </w:pPr>
+      <w:r>
+        <w:t>What the Data Reveals</w:t>
+      </w:r>
+    </w:p>
+    <w:p>
+      <w:r>
+        <w:t>The stratification data exposes several non-obvious dynamics:</w:t>
+      </w:r>
+    </w:p>
+    <w:p>
+      <w:r>
+        <w:rPr>
+          <w:b/>
+        </w:rPr>
+        <w:t>UPRO delivers ~3x but with asymmetry.</w:t>
+      </w:r>
+      <w:r>
+        <w:t xml:space="preserve"> The average monthly leverage ratio is 3.14x across all buckets, confirming UPRO tracks its daily 3x mandate faithfully at the monthly level. But the ratio isn't constant. In small-loss months (SPY -1% to 0%), the effective leverage spikes to 4.6x because volatility drag amplifies small losses — daily 3x compounding systematically overshoots 3x of the monthly return when daily moves are choppy. In mild up-months (+0% to +1%), the ratio drops to 1.3x for the opposite reason.</w:t>
+      </w:r>
+    </w:p>
+    <w:p>
+      <w:r>
+        <w:rPr>
+          <w:b/>
+        </w:rPr>
+        <w:t>DD25 compresses the tails, but with a mid-month exit trap.</w:t>
+      </w:r>
+      <w:r>
+        <w:t xml:space="preserve"> In the worst months (SPY &lt; -8%), DD25 loses only -13.0% vs UPRO B&amp;H's -31.3% — the exit fired early and moved to cash before the worst of the drawdown. But in moderate-decline months (SPY -5% to -4%), DD25 actually performs </w:t>
+      </w:r>
+      <w:r>
+        <w:rPr>
+          <w:i/>
+        </w:rPr>
+        <w:t>worse</w:t>
+      </w:r>
+      <w:r>
+        <w:t xml:space="preserve"> than UPRO B&amp;H (-16.5% vs -14.1%). This is the mid-month exit trap: the drawdown threshold triggers partway through the month, locking in the loss and moving to cash, then missing the partial recovery that brings SPY's monthly return back to only -5%. The monthly return captures "sold the dip + missed the bounce" in a single number. This doesn't hurt the long-term strategy — it's a one-month accounting artifact — but it explains why DD25's bear-month performance isn't monotonically better as losses deepen.</w:t>
+      </w:r>
+    </w:p>
+    <w:p>
+      <w:r>
+        <w:rPr>
+          <w:b/>
+        </w:rPr>
+        <w:t>DD25 in severe crashes: early exit is the edge.</w:t>
+      </w:r>
+      <w:r>
+        <w:t xml:space="preserve"> In the &lt; -8% SPY bucket, DD25's leverage ratio is only 1.25x vs UPRO's 3.01x. Those months include events like March 2020 where the exit likely fired before the worst of the decline. In the -8% to -7% bucket, DD25's ratio jumps to 1.89x because those moderately bad months may not have pushed UPRO past the -25% threshold, so DD25 was fully exposed.</w:t>
+      </w:r>
+    </w:p>
+    <w:p>
+      <w:r>
+        <w:rPr>
+          <w:b/>
+        </w:rPr>
+        <w:t>80-delta options have a natural floor from the SMA filter but cap gains via exits.</w:t>
+      </w:r>
+      <w:r>
+        <w:t xml:space="preserve"> In the worst months, the options strategy loses only -2.5% (0.24x leverage ratio) because the SMA200 filter has already moved to cash during bear markets. In normal bull months (+2% to +5%), it delivers a consistent 1.5-1.7x leverage. But in extreme up-months (SPY &gt; +7%), returns compress to less than 1x. The profit target (+50%) and max-hold (60-day) exits close positions before the full monthly move plays out, and sharp V-bottom recoveries often start below the SMA, meaning the portfolio wasn't fully deployed at the start of the rally.</w:t>
+      </w:r>
+    </w:p>
+    <w:p>
+      <w:pPr>
+        <w:pStyle w:val="Heading2"/>
+      </w:pPr>
+      <w:r>
+        <w:t>The Simplicity Trade-Off</w:t>
+      </w:r>
+    </w:p>
+    <w:p>
+      <w:r>
+        <w:t>UPRO DD25/Cool40 requires checking one number (the drawdown percentage) once a day. The 80-delta options strategy requires monitoring positions, rolling expirations, managing entries and exits across dozens of concurrent positions, and dealing with the occasional illiquid option chain.</w:t>
       </w:r>
     </w:p>
     <w:p>

</xml_diff>

<commit_message>
Add pure SMA filter backtest + article text edits
New backtest: run_sma_filter() tests SMA crossover as primary UPRO
timing signal (SMA200, SMA100, SMA50, SMA200/2%buf). None beat
DD25/Cool40. New chart 13_sma_filter.png and article section added.

Text edits: We→I throughout, specific drawdown dates/prices,
fix "barely keeping pace" language, revise TLT/TMF paragraph,
add T-bill column to cooling period table, fix tax claim (exits
are mostly gains not losses), add SPY Sharpe to summary, add
SA disclosure, expand 1973-74 margin call explanation.

Co-Authored-By: Claude Opus 4.6 <noreply@anthropic.com>
</commit_message>
<xml_diff>
--- a/UPRO_Timing_Strategies_Article.docx
+++ b/UPRO_Timing_Strategies_Article.docx
@@ -8,7 +8,7 @@
         <w:jc w:val="center"/>
       </w:pPr>
       <w:r>
-        <w:t>UPRO Without the Wipeout: 5 Timing Strategies That Cut Drawdowns by 40%</w:t>
+        <w:t>Long-term Profits by Leveraging the S&amp;P 500</w:t>
       </w:r>
     </w:p>
     <w:p>
@@ -24,15 +24,7 @@
         <w:pStyle w:val="ListBullet"/>
       </w:pPr>
       <w:r>
-        <w:t>UPRO has turned $100K into $10.2M since 2009 -- roughly 100x. But its -77% maximum drawdown means a $1M portfolio drops to $230K, and most investors bail out long before the recovery.</w:t>
-      </w:r>
-    </w:p>
-    <w:p>
-      <w:pPr>
-        <w:pStyle w:val="ListBullet"/>
-      </w:pPr>
-      <w:r>
-        <w:t>A leverage comparison reveals UPRO's hidden costs: a frictionless 3x position would have returned $22.6M, while 3x via margin yields only $3.1M. A static margin account avoids the -77% drawdown but would be margin-called in any period that doesn't start at a market bottom.</w:t>
+        <w:t>The S&amp;P 500 has compounded at roughly 10% per year (with dividends) since 1950, turning $10,000 into over $4 million. Leveraged ETFs like SSO (2x) and UPRO (3x) amplify those returns -- UPRO has turned $100K into ~$9.6M since 2009 -- but with devastating drawdowns that most investors cannot survive.</w:t>
       </w:r>
     </w:p>
     <w:p>
@@ -48,7 +40,7 @@
         <w:pStyle w:val="ListBullet"/>
       </w:pPr>
       <w:r>
-        <w:t>The best risk-adjusted strategy -- a simple drawdown exit with a cooling period -- delivered a 0.90 Sharpe ratio and cut the maximum drawdown from -77% to -42%, at the cost of about 12% less terminal wealth. Robustness testing (walk-forward validation, parameter heatmaps, and a synthetic pre-2009 stress test) confirms the result is not a fragile optimum.</w:t>
+        <w:t>The best risk-adjusted strategy -- a simple drawdown exit with a cooling period -- delivered a 0.90 Sharpe ratio (vs 0.80 for UPRO buy-and-hold and 0.89 for plain SPY) and cut the maximum drawdown from -77% to -42%, at the cost of about 12% less terminal wealth. Robustness testing (walk-forward validation, parameter heatmaps, and a synthetic pre-2009 stress test) confirms the result is not a fragile optimum.</w:t>
       </w:r>
     </w:p>
     <w:p>
@@ -56,7 +48,7 @@
         <w:pStyle w:val="ListBullet"/>
       </w:pPr>
       <w:r>
-        <w:t>An enhancement: parking idle cash in TLT (long-term Treasuries) instead of T-bills during cooling periods pushes the Sharpe to 0.92 and terminal wealth to $11.1M -- actually beating UPRO buy-and-hold -- by harvesting flight-to-quality rallies when stocks crash. The 3x bond alternative (TMF) boosts returns further but gives back all the drawdown protection.</w:t>
+        <w:t>An enhancement: parking idle cash in TLT (long-term Treasuries) instead of T-bills during cooling periods pushes the Sharpe to 0.92 and terminal wealth to $11.1M -- actually beating UPRO buy-and-hold -- by harvesting flight-to-quality rallies when stocks crash.</w:t>
       </w:r>
     </w:p>
     <w:p>
@@ -64,17 +56,68 @@
         <w:pStyle w:val="Heading1"/>
       </w:pPr>
       <w:r>
-        <w:t>The Problem With UPRO</w:t>
+        <w:t>The Case for Leveraged Index Investing</w:t>
       </w:r>
     </w:p>
     <w:p>
       <w:r>
-        <w:t>UPRO is one of the most striking backtests in retail investing. Since its inception on June 23, 2009, a $100,000 investment has grown to approximately $10.2 million. That's a 32.0% compound annual growth rate over 16+ years. No mainstream ETF comes close.</w:t>
+        <w:t>Many conservative long-term investors allocate heavily to S&amp;P 500 index funds -- and history vindicates them. Since January 1950, the S&amp;P 500 has delivered approximately 8.2% annually in price appreciation alone. Including reinvested dividends, the total return rises to roughly 10-11% per year. A $10,000 investment at the start of 1950 would have grown to over $4 million in price terms -- and substantially more with dividends reinvested. Few investment strategies can match this combination of simplicity, diversification, and compounding power over multiple decades.</w:t>
       </w:r>
     </w:p>
     <w:p>
       <w:r>
-        <w:t xml:space="preserve">You already know the catch. UPRO provides 3x daily leveraged exposure to the S&amp;P 500, and that leverage cuts both ways. During the COVID crash in March 2020, UPRO lost roughly two-thirds of its value in weeks. During the 2022 rate-hiking cycle, it drew down brutally. Over the full test period, UPRO's maximum drawdown was </w:t>
+        <w:t>With such a strong track record, a natural question arises: what would happen if the investment were leveraged?</w:t>
+      </w:r>
+    </w:p>
+    <w:p>
+      <w:r>
+        <w:t xml:space="preserve">Two exchange-traded funds make this straightforward for retail investors. </w:t>
+      </w:r>
+      <w:r>
+        <w:rPr>
+          <w:b/>
+        </w:rPr>
+        <w:t>SSO</w:t>
+      </w:r>
+      <w:r>
+        <w:t xml:space="preserve"> (ProShares Ultra S&amp;P 500) provides 2x daily leveraged exposure to the S&amp;P 500 and has been available since June 2006. </w:t>
+      </w:r>
+      <w:r>
+        <w:rPr>
+          <w:b/>
+        </w:rPr>
+        <w:t>UPRO</w:t>
+      </w:r>
+      <w:r>
+        <w:t xml:space="preserve"> (ProShares UltraPro S&amp;P 500) provides 3x daily leverage and launched in June 2009. Both reset their leverage ratio daily -- a critical mechanical detail I'll return to shortly.</w:t>
+      </w:r>
+    </w:p>
+    <w:p>
+      <w:r>
+        <w:t>The raw numbers are compelling. Since inception, a $100,000 investment in SSO would have grown to approximately $1.5 million (a 14.9% compound annual growth rate). UPRO has been even more dramatic: $100,000 invested at inception has grown to roughly $9.6 million, a 31.5% CAGR over 16+ years. No mainstream ETF comes close to these figures.</w:t>
+      </w:r>
+    </w:p>
+    <w:p>
+      <w:r>
+        <w:t>But these headline returns mask serious risks that most investors underestimate.</w:t>
+      </w:r>
+    </w:p>
+    <w:p>
+      <w:pPr>
+        <w:pStyle w:val="Heading1"/>
+      </w:pPr>
+      <w:r>
+        <w:t>The Problem With Leveraged ETFs</w:t>
+      </w:r>
+    </w:p>
+    <w:p>
+      <w:r>
+        <w:t>UPRO's track record is one of the most striking backtests in retail investing. A 31.5% CAGR turns $100K into nearly 100x over 16 years. The temptation to simply buy and hold is powerful.</w:t>
+      </w:r>
+    </w:p>
+    <w:p>
+      <w:r>
+        <w:t xml:space="preserve">You already know the catch. That leverage cuts both ways. During the COVID crash, UPRO fell from $38.73 on February 19, 2020 to $8.98 on March 23 -- a </w:t>
       </w:r>
       <w:r>
         <w:rPr>
@@ -83,7 +126,7 @@
         <w:t>-76.8%</w:t>
       </w:r>
       <w:r>
-        <w:t>. That's not a typo.</w:t>
+        <w:t xml:space="preserve"> drawdown in just 23 trading days. That remains its worst decline ever. The 2022 rate-hiking bear market inflicted a -63.9% drawdown (from $75.08 to $27.07 over nine months). These are not outliers. They are the recurring cost of 3x leverage.</w:t>
       </w:r>
     </w:p>
     <w:p>
@@ -98,12 +141,12 @@
     </w:p>
     <w:p>
       <w:r>
-        <w:t>This article asks a simple question: can we systematically reduce UPRO's drawdowns while keeping most of the upside? Not a magic system -- a risk management framework. I tested five approaches, each using a different market signal, across 16+ years of actual UPRO price data. The results are instructive.</w:t>
+        <w:t>There's also a structural issue. UPRO resets its 3x leverage daily, which means it's subject to volatility decay -- sometimes called the "constant leverage trap." In a choppy, sideways market, UPRO can lose money even if the S&amp;P 500 ends up flat. As ProShares themselves warn: "Due to the compounding of daily returns, ProShares' returns over periods other than one day will likely differ in amount and possibly direction from the target return for the same period." This is not a set-and-forget instrument, regardless of what the long-term backtest suggests.</w:t>
       </w:r>
     </w:p>
     <w:p>
       <w:r>
-        <w:t>A quick note on mechanics: UPRO resets its 3x leverage daily, which means it's subject to volatility decay. In a choppy, sideways market, UPRO can lose money even if the S&amp;P 500 ends up flat. This is not a set-and-forget instrument, regardless of what the long-term backtest suggests.</w:t>
+        <w:t>This article asks a simple question: can you systematically reduce UPRO's drawdowns while keeping most of the upside? Not a magic system -- a risk management framework. I tested five approaches, each using a different market signal, across 16+ years of actual UPRO price data. The results are instructive.</w:t>
       </w:r>
     </w:p>
     <w:p>
@@ -116,7 +159,7 @@
     </w:p>
     <w:p>
       <w:r>
-        <w:t>I used actual UPRO daily prices from inception (June 23, 2009) through March 2026 -- over 16 years. Starting capital was $100,000. When a strategy signals "out," the portfolio moves to cash earning the prevailing 13-week T-bill rate (a realistic assumption reflecting money market fund yields).</w:t>
+        <w:t>I used actual UPRO daily prices from inception (June 25, 2009) through March 2026 -- over 16 years. Starting capital was $100,000. When a strategy signals "out," the portfolio moves to cash earning the prevailing 13-week T-bill rate (a realistic assumption reflecting money market fund yields).</w:t>
       </w:r>
     </w:p>
     <w:p>
@@ -687,7 +730,7 @@
     </w:p>
     <w:p>
       <w:r>
-        <w:t>First, let's be clear about what we're trying to beat -- and what we're not.</w:t>
+        <w:t>First, let's be clear about what I'm trying to beat -- and what I'm not.</w:t>
       </w:r>
     </w:p>
     <w:tbl>
@@ -984,12 +1027,12 @@
     </w:p>
     <w:p>
       <w:r>
-        <w:t>But an important caveat: this test period is overwhelmingly bullish. UPRO's inception happened to coincide with the beginning of the longest bull market in American history. Every timing strategy that says "hold UPRO most of the time" will look great in a period that is almost entirely up. We don't have actual UPRO data for 2000-2009, which would have been devastating. (We address this with a synthetic backtest in the robustness section below.)</w:t>
+        <w:t>But an important caveat: this test period is overwhelmingly bullish. UPRO's inception happened to coincide with the beginning of the longest bull market in American history. Every timing strategy that says "hold UPRO most of the time" will look great in a period that is almost entirely up. There is no actual UPRO data for 2000-2009, which would have been devastating. (I address this with a synthetic backtest in the robustness section below.)</w:t>
       </w:r>
     </w:p>
     <w:p>
       <w:r>
-        <w:t>The major drawdown events visible in the data -- the 2011 debt ceiling crisis, the late-2018 Fed tightening scare, the 2020 COVID crash, and the 2022 rate-hiking bear market -- each inflicted serious damage on UPRO holders. The question is whether we can navigate those periods more gracefully.</w:t>
+        <w:t>The major drawdown events visible in the data -- the 2011 debt ceiling crisis, the late-2018 Fed tightening scare, the 2020 COVID crash, and the 2022 rate-hiking bear market -- each inflicted serious damage on UPRO holders. The question is whether a systematic approach can navigate those periods more gracefully.</w:t>
       </w:r>
     </w:p>
     <w:p>
@@ -1002,7 +1045,7 @@
     </w:p>
     <w:p>
       <w:r>
-        <w:t>Before we get to timing strategies, it's worth understanding what UPRO actually costs you relative to other ways of getting 3x exposure to the S&amp;P 500.</w:t>
+        <w:t>Before getting to timing strategies, it's worth understanding what UPRO actually costs you relative to other ways of getting 3x exposure to the S&amp;P 500.</w:t>
       </w:r>
     </w:p>
     <w:p>
@@ -2323,7 +2366,7 @@
     <w:p/>
     <w:p>
       <w:r>
-        <w:t>The pattern is striking. In five out of six test periods, the static margin account was forcibly liquidated. During the dot-com crash, the margin call came just 15 trading days after entry. During the GFC, it took about 3 months. Only the UPRO era -- which uniquely starts at a generational market bottom -- survived. And even over the full 1950-2026 history, despite the S&amp;P 500 compounding at +8.2% annually for 76 years, the static 3x account got margin-called during the 1973-74 bear market and was stuck at $269K for the remaining 52 years while unlevered S&amp;P 500 grew to $41.3 million.</w:t>
+        <w:t>The pattern is striking. In five out of six test periods, the static margin account was forcibly liquidated. During the dot-com crash, the margin call came just 15 trading days after entry. During the GFC, it took about 3 months. Only the UPRO era -- which uniquely starts at a generational market bottom -- survived. And even over the full 1950-2026 history, despite the S&amp;P 500 compounding at +8.2% annually for 76 years, the static 3x account got margin-called during the 1973-74 bear market. The 1950-1974 bull market had grown the account substantially, but the static leverage ratio had also drifted -- accumulated gains reduced the effective leverage well below 3x, yet a severe enough decline still breached the 25% maintenance margin requirement. Once liquidated at $269K, the account sat in cash for the remaining 52 years while unlevered S&amp;P 500 grew to $41.3 million.</w:t>
       </w:r>
     </w:p>
     <w:p>
@@ -2624,7 +2667,7 @@
     <w:p/>
     <w:p>
       <w:r>
-        <w:t>The frictionless 3x is extraordinary over 76 years -- $100K becomes $20.0 billion -- but it's a fantasy: no one can maintain 3x leverage for free. Add realistic 6% borrowing costs and $100K grows to just $2.2M over 76 years, barely keeping pace with the S&amp;P 500's $41.3M at 1x. During the lost decade, daily-rebalanced 3x with costs destroyed 97% of your capital. Volatility decay in a choppy, declining market is a meat grinder for leveraged strategies.</w:t>
+        <w:t>The frictionless 3x is extraordinary over 76 years -- $100K becomes $20.0 billion -- but it's a fantasy: no one can maintain 3x leverage for free. Add realistic 6% borrowing costs and $100K grows to just $2.2M over 76 years -- a fraction of the S&amp;P 500's $41.3M at 1x. Three times the risk, one-twentieth the return. During the lost decade, daily-rebalanced 3x with costs destroyed 97% of your capital. Volatility decay in a choppy, declining market is a meat grinder for leveraged strategies.</w:t>
       </w:r>
     </w:p>
     <w:p>
@@ -4335,7 +4378,7 @@
     <w:p/>
     <w:p>
       <w:r>
-        <w:t>A note on the DD15%/Cool60 anomaly: its $441K end value is dramatically worse than nearby variants ($2.0M for DD15%/Cool40, $1.5M for DD15%/Cool20). The 60-day cooling period forces cash positions through critical recovery windows -- you're sitting out during the fastest part of the bounce. This illustrates that parameter sensitivity is real. The strategy's edge comes from the specific threshold+cooling combination, not from drawdown exits as a general concept. (We address parameter sensitivity directly in the robustness section below.)</w:t>
+        <w:t>A note on the DD15%/Cool60 anomaly: its $441K end value is dramatically worse than nearby variants ($2.0M for DD15%/Cool40, $1.5M for DD15%/Cool20). The 60-day cooling period forces cash positions through critical recovery windows -- you're sitting out during the fastest part of the bounce. This illustrates that parameter sensitivity is real. The strategy's edge comes from the specific threshold+cooling combination, not from drawdown exits as a general concept. (I address parameter sensitivity directly in the robustness section below.)</w:t>
       </w:r>
     </w:p>
     <w:p>
@@ -5345,7 +5388,7 @@
     </w:p>
     <w:p>
       <w:r>
-        <w:t>The DD25%/Cool40 result is impressive, but skepticism is warranted. We selected these parameters because they looked best on 2009-2026 data. Here's how we stress-tested the finding.</w:t>
+        <w:t>The DD25%/Cool40 result is impressive, but skepticism is warranted. I selected these parameters because they looked best on 2009-2026 data. Here's how I stress-tested the finding.</w:t>
       </w:r>
     </w:p>
     <w:p>
@@ -5435,7 +5478,7 @@
     </w:p>
     <w:p>
       <w:r>
-        <w:t>The key insight: the broad DD20-30%/Cool10-40 region produces strong results across both periods. DD25%/Cool40 wasn't the in-sample winner, which paradoxically strengthens our confidence -- we didn't cherry-pick the single best in-sample cell.</w:t>
+        <w:t>The key insight: the broad DD20-30%/Cool10-40 region produces strong results across both periods. DD25%/Cool40 wasn't the in-sample winner, which paradoxically strengthens confidence -- I didn't cherry-pick the single best in-sample cell.</w:t>
       </w:r>
     </w:p>
     <w:tbl>
@@ -6790,11 +6833,6 @@
       </w:r>
     </w:p>
     <w:p>
-      <w:r>
-        <w:t>The original DD25%/Cool40 rule -- re-enter after the cooling period expires or on a new ATH -- already handles bear markets effectively. The cooling period provides the patience; the ATH check provides the optimism. Adding an SMA gate is redundant at best and actively harmful at worst.</w:t>
-      </w:r>
-    </w:p>
-    <w:p>
       <w:pPr>
         <w:jc w:val="center"/>
       </w:pPr>
@@ -6836,6 +6874,813 @@
     <w:p/>
     <w:p>
       <w:pPr>
+        <w:pStyle w:val="Heading2"/>
+      </w:pPr>
+      <w:r>
+        <w:t>What About SMA as the Primary Signal?</w:t>
+      </w:r>
+    </w:p>
+    <w:p>
+      <w:r>
+        <w:t xml:space="preserve">The SMA gate test above uses the moving average only as a re-entry filter on top of the drawdown exit. A fair question is whether a pure SMA crossover -- hold UPRO when SPY is above its moving average, sell when it crosses below -- would work better as the </w:t>
+      </w:r>
+      <w:r>
+        <w:rPr>
+          <w:i/>
+        </w:rPr>
+        <w:t>primary</w:t>
+      </w:r>
+      <w:r>
+        <w:t xml:space="preserve"> timing rule, eliminating the drawdown exit entirely.</w:t>
+      </w:r>
+    </w:p>
+    <w:p>
+      <w:r>
+        <w:t>This is a well-known trend-following approach. SPY's 200-day moving average is one of the most widely tracked technical indicators in finance. I also tested a variant inspired by the 80-delta options strategy: exit when SPY falls 2% below the SMA200 (providing a buffer to reduce whipsaws), and re-enter when it crosses back above.</w:t>
+      </w:r>
+    </w:p>
+    <w:tbl>
+      <w:tblPr>
+        <w:tblStyle w:val="LightGrid-Accent1"/>
+        <w:tblW w:type="auto" w:w="0"/>
+        <w:jc w:val="center"/>
+        <w:tblLook w:firstColumn="1" w:firstRow="1" w:lastColumn="0" w:lastRow="0" w:noHBand="0" w:noVBand="1" w:val="04A0"/>
+      </w:tblPr>
+      <w:tblGrid>
+        <w:gridCol w:w="1255"/>
+        <w:gridCol w:w="1255"/>
+        <w:gridCol w:w="1255"/>
+        <w:gridCol w:w="1255"/>
+        <w:gridCol w:w="1255"/>
+        <w:gridCol w:w="1255"/>
+        <w:gridCol w:w="1255"/>
+      </w:tblGrid>
+      <w:tr>
+        <w:tc>
+          <w:tcPr>
+            <w:tcW w:type="dxa" w:w="1255"/>
+          </w:tcPr>
+          <w:p>
+            <w:pPr>
+              <w:jc w:val="center"/>
+            </w:pPr>
+            <w:r>
+              <w:rPr>
+                <w:b/>
+                <w:sz w:val="18"/>
+              </w:rPr>
+              <w:t>Strategy</w:t>
+            </w:r>
+          </w:p>
+        </w:tc>
+        <w:tc>
+          <w:tcPr>
+            <w:tcW w:type="dxa" w:w="1255"/>
+          </w:tcPr>
+          <w:p>
+            <w:pPr>
+              <w:jc w:val="center"/>
+            </w:pPr>
+            <w:r>
+              <w:rPr>
+                <w:b/>
+                <w:sz w:val="18"/>
+              </w:rPr>
+              <w:t>End Value</w:t>
+            </w:r>
+          </w:p>
+        </w:tc>
+        <w:tc>
+          <w:tcPr>
+            <w:tcW w:type="dxa" w:w="1255"/>
+          </w:tcPr>
+          <w:p>
+            <w:pPr>
+              <w:jc w:val="center"/>
+            </w:pPr>
+            <w:r>
+              <w:rPr>
+                <w:b/>
+                <w:sz w:val="18"/>
+              </w:rPr>
+              <w:t>CAGR</w:t>
+            </w:r>
+          </w:p>
+        </w:tc>
+        <w:tc>
+          <w:tcPr>
+            <w:tcW w:type="dxa" w:w="1255"/>
+          </w:tcPr>
+          <w:p>
+            <w:pPr>
+              <w:jc w:val="center"/>
+            </w:pPr>
+            <w:r>
+              <w:rPr>
+                <w:b/>
+                <w:sz w:val="18"/>
+              </w:rPr>
+              <w:t>Sharpe</w:t>
+            </w:r>
+          </w:p>
+        </w:tc>
+        <w:tc>
+          <w:tcPr>
+            <w:tcW w:type="dxa" w:w="1255"/>
+          </w:tcPr>
+          <w:p>
+            <w:pPr>
+              <w:jc w:val="center"/>
+            </w:pPr>
+            <w:r>
+              <w:rPr>
+                <w:b/>
+                <w:sz w:val="18"/>
+              </w:rPr>
+              <w:t>Max DD</w:t>
+            </w:r>
+          </w:p>
+        </w:tc>
+        <w:tc>
+          <w:tcPr>
+            <w:tcW w:type="dxa" w:w="1255"/>
+          </w:tcPr>
+          <w:p>
+            <w:pPr>
+              <w:jc w:val="center"/>
+            </w:pPr>
+            <w:r>
+              <w:rPr>
+                <w:b/>
+                <w:sz w:val="18"/>
+              </w:rPr>
+              <w:t>Trades</w:t>
+            </w:r>
+          </w:p>
+        </w:tc>
+        <w:tc>
+          <w:tcPr>
+            <w:tcW w:type="dxa" w:w="1255"/>
+          </w:tcPr>
+          <w:p>
+            <w:pPr>
+              <w:jc w:val="center"/>
+            </w:pPr>
+            <w:r>
+              <w:rPr>
+                <w:b/>
+                <w:sz w:val="18"/>
+              </w:rPr>
+              <w:t>% Invested</w:t>
+            </w:r>
+          </w:p>
+        </w:tc>
+      </w:tr>
+      <w:tr>
+        <w:tc>
+          <w:tcPr>
+            <w:tcW w:type="dxa" w:w="1255"/>
+          </w:tcPr>
+          <w:p>
+            <w:pPr>
+              <w:jc w:val="left"/>
+            </w:pPr>
+            <w:r>
+              <w:rPr>
+                <w:b/>
+                <w:sz w:val="18"/>
+              </w:rPr>
+              <w:t>DD25%/Cool40</w:t>
+            </w:r>
+          </w:p>
+        </w:tc>
+        <w:tc>
+          <w:tcPr>
+            <w:tcW w:type="dxa" w:w="1255"/>
+          </w:tcPr>
+          <w:p>
+            <w:pPr>
+              <w:jc w:val="center"/>
+            </w:pPr>
+            <w:r>
+              <w:rPr>
+                <w:b/>
+                <w:sz w:val="18"/>
+              </w:rPr>
+              <w:t>$9.0M</w:t>
+            </w:r>
+          </w:p>
+        </w:tc>
+        <w:tc>
+          <w:tcPr>
+            <w:tcW w:type="dxa" w:w="1255"/>
+          </w:tcPr>
+          <w:p>
+            <w:pPr>
+              <w:jc w:val="center"/>
+            </w:pPr>
+            <w:r>
+              <w:rPr>
+                <w:b/>
+                <w:sz w:val="18"/>
+              </w:rPr>
+              <w:t>+31.0%</w:t>
+            </w:r>
+          </w:p>
+        </w:tc>
+        <w:tc>
+          <w:tcPr>
+            <w:tcW w:type="dxa" w:w="1255"/>
+          </w:tcPr>
+          <w:p>
+            <w:pPr>
+              <w:jc w:val="center"/>
+            </w:pPr>
+            <w:r>
+              <w:rPr>
+                <w:b/>
+                <w:sz w:val="18"/>
+              </w:rPr>
+              <w:t>0.90</w:t>
+            </w:r>
+          </w:p>
+        </w:tc>
+        <w:tc>
+          <w:tcPr>
+            <w:tcW w:type="dxa" w:w="1255"/>
+          </w:tcPr>
+          <w:p>
+            <w:pPr>
+              <w:jc w:val="center"/>
+            </w:pPr>
+            <w:r>
+              <w:rPr>
+                <w:b/>
+                <w:sz w:val="18"/>
+              </w:rPr>
+              <w:t>-41.8%</w:t>
+            </w:r>
+          </w:p>
+        </w:tc>
+        <w:tc>
+          <w:tcPr>
+            <w:tcW w:type="dxa" w:w="1255"/>
+          </w:tcPr>
+          <w:p>
+            <w:pPr>
+              <w:jc w:val="center"/>
+            </w:pPr>
+            <w:r>
+              <w:rPr>
+                <w:b/>
+                <w:sz w:val="18"/>
+              </w:rPr>
+              <w:t>31</w:t>
+            </w:r>
+          </w:p>
+        </w:tc>
+        <w:tc>
+          <w:tcPr>
+            <w:tcW w:type="dxa" w:w="1255"/>
+          </w:tcPr>
+          <w:p>
+            <w:pPr>
+              <w:jc w:val="center"/>
+            </w:pPr>
+            <w:r>
+              <w:rPr>
+                <w:b/>
+                <w:sz w:val="18"/>
+              </w:rPr>
+              <w:t>86%</w:t>
+            </w:r>
+          </w:p>
+        </w:tc>
+      </w:tr>
+      <w:tr>
+        <w:tc>
+          <w:tcPr>
+            <w:tcW w:type="dxa" w:w="1255"/>
+          </w:tcPr>
+          <w:p>
+            <w:pPr>
+              <w:jc w:val="left"/>
+            </w:pPr>
+            <w:r>
+              <w:rPr>
+                <w:sz w:val="18"/>
+              </w:rPr>
+              <w:t>SMA200</w:t>
+            </w:r>
+          </w:p>
+        </w:tc>
+        <w:tc>
+          <w:tcPr>
+            <w:tcW w:type="dxa" w:w="1255"/>
+          </w:tcPr>
+          <w:p>
+            <w:pPr>
+              <w:jc w:val="center"/>
+            </w:pPr>
+            <w:r>
+              <w:rPr>
+                <w:sz w:val="18"/>
+              </w:rPr>
+              <w:t>$1.2M</w:t>
+            </w:r>
+          </w:p>
+        </w:tc>
+        <w:tc>
+          <w:tcPr>
+            <w:tcW w:type="dxa" w:w="1255"/>
+          </w:tcPr>
+          <w:p>
+            <w:pPr>
+              <w:jc w:val="center"/>
+            </w:pPr>
+            <w:r>
+              <w:rPr>
+                <w:sz w:val="18"/>
+              </w:rPr>
+              <w:t>+16.3%</w:t>
+            </w:r>
+          </w:p>
+        </w:tc>
+        <w:tc>
+          <w:tcPr>
+            <w:tcW w:type="dxa" w:w="1255"/>
+          </w:tcPr>
+          <w:p>
+            <w:pPr>
+              <w:jc w:val="center"/>
+            </w:pPr>
+            <w:r>
+              <w:rPr>
+                <w:sz w:val="18"/>
+              </w:rPr>
+              <w:t>0.61</w:t>
+            </w:r>
+          </w:p>
+        </w:tc>
+        <w:tc>
+          <w:tcPr>
+            <w:tcW w:type="dxa" w:w="1255"/>
+          </w:tcPr>
+          <w:p>
+            <w:pPr>
+              <w:jc w:val="center"/>
+            </w:pPr>
+            <w:r>
+              <w:rPr>
+                <w:sz w:val="18"/>
+              </w:rPr>
+              <w:t>-57.9%</w:t>
+            </w:r>
+          </w:p>
+        </w:tc>
+        <w:tc>
+          <w:tcPr>
+            <w:tcW w:type="dxa" w:w="1255"/>
+          </w:tcPr>
+          <w:p>
+            <w:pPr>
+              <w:jc w:val="center"/>
+            </w:pPr>
+            <w:r>
+              <w:rPr>
+                <w:sz w:val="18"/>
+              </w:rPr>
+              <w:t>89</w:t>
+            </w:r>
+          </w:p>
+        </w:tc>
+        <w:tc>
+          <w:tcPr>
+            <w:tcW w:type="dxa" w:w="1255"/>
+          </w:tcPr>
+          <w:p>
+            <w:pPr>
+              <w:jc w:val="center"/>
+            </w:pPr>
+            <w:r>
+              <w:rPr>
+                <w:sz w:val="18"/>
+              </w:rPr>
+              <w:t>80%</w:t>
+            </w:r>
+          </w:p>
+        </w:tc>
+      </w:tr>
+      <w:tr>
+        <w:tc>
+          <w:tcPr>
+            <w:tcW w:type="dxa" w:w="1255"/>
+          </w:tcPr>
+          <w:p>
+            <w:pPr>
+              <w:jc w:val="left"/>
+            </w:pPr>
+            <w:r>
+              <w:rPr>
+                <w:sz w:val="18"/>
+              </w:rPr>
+              <w:t>SMA100</w:t>
+            </w:r>
+          </w:p>
+        </w:tc>
+        <w:tc>
+          <w:tcPr>
+            <w:tcW w:type="dxa" w:w="1255"/>
+          </w:tcPr>
+          <w:p>
+            <w:pPr>
+              <w:jc w:val="center"/>
+            </w:pPr>
+            <w:r>
+              <w:rPr>
+                <w:sz w:val="18"/>
+              </w:rPr>
+              <w:t>$2.7M</w:t>
+            </w:r>
+          </w:p>
+        </w:tc>
+        <w:tc>
+          <w:tcPr>
+            <w:tcW w:type="dxa" w:w="1255"/>
+          </w:tcPr>
+          <w:p>
+            <w:pPr>
+              <w:jc w:val="center"/>
+            </w:pPr>
+            <w:r>
+              <w:rPr>
+                <w:sz w:val="18"/>
+              </w:rPr>
+              <w:t>+22.0%</w:t>
+            </w:r>
+          </w:p>
+        </w:tc>
+        <w:tc>
+          <w:tcPr>
+            <w:tcW w:type="dxa" w:w="1255"/>
+          </w:tcPr>
+          <w:p>
+            <w:pPr>
+              <w:jc w:val="center"/>
+            </w:pPr>
+            <w:r>
+              <w:rPr>
+                <w:sz w:val="18"/>
+              </w:rPr>
+              <w:t>0.77</w:t>
+            </w:r>
+          </w:p>
+        </w:tc>
+        <w:tc>
+          <w:tcPr>
+            <w:tcW w:type="dxa" w:w="1255"/>
+          </w:tcPr>
+          <w:p>
+            <w:pPr>
+              <w:jc w:val="center"/>
+            </w:pPr>
+            <w:r>
+              <w:rPr>
+                <w:sz w:val="18"/>
+              </w:rPr>
+              <w:t>-46.0%</w:t>
+            </w:r>
+          </w:p>
+        </w:tc>
+        <w:tc>
+          <w:tcPr>
+            <w:tcW w:type="dxa" w:w="1255"/>
+          </w:tcPr>
+          <w:p>
+            <w:pPr>
+              <w:jc w:val="center"/>
+            </w:pPr>
+            <w:r>
+              <w:rPr>
+                <w:sz w:val="18"/>
+              </w:rPr>
+              <w:t>167</w:t>
+            </w:r>
+          </w:p>
+        </w:tc>
+        <w:tc>
+          <w:tcPr>
+            <w:tcW w:type="dxa" w:w="1255"/>
+          </w:tcPr>
+          <w:p>
+            <w:pPr>
+              <w:jc w:val="center"/>
+            </w:pPr>
+            <w:r>
+              <w:rPr>
+                <w:sz w:val="18"/>
+              </w:rPr>
+              <w:t>78%</w:t>
+            </w:r>
+          </w:p>
+        </w:tc>
+      </w:tr>
+      <w:tr>
+        <w:tc>
+          <w:tcPr>
+            <w:tcW w:type="dxa" w:w="1255"/>
+          </w:tcPr>
+          <w:p>
+            <w:pPr>
+              <w:jc w:val="left"/>
+            </w:pPr>
+            <w:r>
+              <w:rPr>
+                <w:sz w:val="18"/>
+              </w:rPr>
+              <w:t>SMA50</w:t>
+            </w:r>
+          </w:p>
+        </w:tc>
+        <w:tc>
+          <w:tcPr>
+            <w:tcW w:type="dxa" w:w="1255"/>
+          </w:tcPr>
+          <w:p>
+            <w:pPr>
+              <w:jc w:val="center"/>
+            </w:pPr>
+            <w:r>
+              <w:rPr>
+                <w:sz w:val="18"/>
+              </w:rPr>
+              <w:t>$737K</w:t>
+            </w:r>
+          </w:p>
+        </w:tc>
+        <w:tc>
+          <w:tcPr>
+            <w:tcW w:type="dxa" w:w="1255"/>
+          </w:tcPr>
+          <w:p>
+            <w:pPr>
+              <w:jc w:val="center"/>
+            </w:pPr>
+            <w:r>
+              <w:rPr>
+                <w:sz w:val="18"/>
+              </w:rPr>
+              <w:t>+12.7%</w:t>
+            </w:r>
+          </w:p>
+        </w:tc>
+        <w:tc>
+          <w:tcPr>
+            <w:tcW w:type="dxa" w:w="1255"/>
+          </w:tcPr>
+          <w:p>
+            <w:pPr>
+              <w:jc w:val="center"/>
+            </w:pPr>
+            <w:r>
+              <w:rPr>
+                <w:sz w:val="18"/>
+              </w:rPr>
+              <w:t>0.54</w:t>
+            </w:r>
+          </w:p>
+        </w:tc>
+        <w:tc>
+          <w:tcPr>
+            <w:tcW w:type="dxa" w:w="1255"/>
+          </w:tcPr>
+          <w:p>
+            <w:pPr>
+              <w:jc w:val="center"/>
+            </w:pPr>
+            <w:r>
+              <w:rPr>
+                <w:sz w:val="18"/>
+              </w:rPr>
+              <w:t>-52.3%</w:t>
+            </w:r>
+          </w:p>
+        </w:tc>
+        <w:tc>
+          <w:tcPr>
+            <w:tcW w:type="dxa" w:w="1255"/>
+          </w:tcPr>
+          <w:p>
+            <w:pPr>
+              <w:jc w:val="center"/>
+            </w:pPr>
+            <w:r>
+              <w:rPr>
+                <w:sz w:val="18"/>
+              </w:rPr>
+              <w:t>282</w:t>
+            </w:r>
+          </w:p>
+        </w:tc>
+        <w:tc>
+          <w:tcPr>
+            <w:tcW w:type="dxa" w:w="1255"/>
+          </w:tcPr>
+          <w:p>
+            <w:pPr>
+              <w:jc w:val="center"/>
+            </w:pPr>
+            <w:r>
+              <w:rPr>
+                <w:sz w:val="18"/>
+              </w:rPr>
+              <w:t>72%</w:t>
+            </w:r>
+          </w:p>
+        </w:tc>
+      </w:tr>
+      <w:tr>
+        <w:tc>
+          <w:tcPr>
+            <w:tcW w:type="dxa" w:w="1255"/>
+          </w:tcPr>
+          <w:p>
+            <w:pPr>
+              <w:jc w:val="left"/>
+            </w:pPr>
+            <w:r>
+              <w:rPr>
+                <w:sz w:val="18"/>
+              </w:rPr>
+              <w:t>SMA200/2%buf</w:t>
+            </w:r>
+          </w:p>
+        </w:tc>
+        <w:tc>
+          <w:tcPr>
+            <w:tcW w:type="dxa" w:w="1255"/>
+          </w:tcPr>
+          <w:p>
+            <w:pPr>
+              <w:jc w:val="center"/>
+            </w:pPr>
+            <w:r>
+              <w:rPr>
+                <w:sz w:val="18"/>
+              </w:rPr>
+              <w:t>$836K</w:t>
+            </w:r>
+          </w:p>
+        </w:tc>
+        <w:tc>
+          <w:tcPr>
+            <w:tcW w:type="dxa" w:w="1255"/>
+          </w:tcPr>
+          <w:p>
+            <w:pPr>
+              <w:jc w:val="center"/>
+            </w:pPr>
+            <w:r>
+              <w:rPr>
+                <w:sz w:val="18"/>
+              </w:rPr>
+              <w:t>+13.6%</w:t>
+            </w:r>
+          </w:p>
+        </w:tc>
+        <w:tc>
+          <w:tcPr>
+            <w:tcW w:type="dxa" w:w="1255"/>
+          </w:tcPr>
+          <w:p>
+            <w:pPr>
+              <w:jc w:val="center"/>
+            </w:pPr>
+            <w:r>
+              <w:rPr>
+                <w:sz w:val="18"/>
+              </w:rPr>
+              <w:t>0.53</w:t>
+            </w:r>
+          </w:p>
+        </w:tc>
+        <w:tc>
+          <w:tcPr>
+            <w:tcW w:type="dxa" w:w="1255"/>
+          </w:tcPr>
+          <w:p>
+            <w:pPr>
+              <w:jc w:val="center"/>
+            </w:pPr>
+            <w:r>
+              <w:rPr>
+                <w:sz w:val="18"/>
+              </w:rPr>
+              <w:t>-59.6%</w:t>
+            </w:r>
+          </w:p>
+        </w:tc>
+        <w:tc>
+          <w:tcPr>
+            <w:tcW w:type="dxa" w:w="1255"/>
+          </w:tcPr>
+          <w:p>
+            <w:pPr>
+              <w:jc w:val="center"/>
+            </w:pPr>
+            <w:r>
+              <w:rPr>
+                <w:sz w:val="18"/>
+              </w:rPr>
+              <w:t>49</w:t>
+            </w:r>
+          </w:p>
+        </w:tc>
+        <w:tc>
+          <w:tcPr>
+            <w:tcW w:type="dxa" w:w="1255"/>
+          </w:tcPr>
+          <w:p>
+            <w:pPr>
+              <w:jc w:val="center"/>
+            </w:pPr>
+            <w:r>
+              <w:rPr>
+                <w:sz w:val="18"/>
+              </w:rPr>
+              <w:t>82%</w:t>
+            </w:r>
+          </w:p>
+        </w:tc>
+      </w:tr>
+    </w:tbl>
+    <w:p/>
+    <w:p>
+      <w:r>
+        <w:t xml:space="preserve">None of the pure SMA filters come close to DD25%/Cool40 on any metric. SMA100 is the best of the group -- a 22.0% CAGR with a 0.77 Sharpe and -46.0% max drawdown -- but it still trails the drawdown exit by 9 percentage points of CAGR with a worse Sharpe and worse max drawdown. SMA50 whipsaws excessively (282 trades over 16 years) and bleeds returns through false signals. The 2% buffer variant, which mimics the 80-delta strategy's SMA exit rule, actually makes things </w:t>
+      </w:r>
+      <w:r>
+        <w:rPr>
+          <w:i/>
+        </w:rPr>
+        <w:t>worse</w:t>
+      </w:r>
+      <w:r>
+        <w:t xml:space="preserve"> than the plain SMA200 -- the buffer delays exits during genuine breakdowns, increasing drawdowns without meaningfully reducing whipsaws.</w:t>
+      </w:r>
+    </w:p>
+    <w:p>
+      <w:r>
+        <w:t>The fundamental problem is that SMA crossovers are trend-following signals, and UPRO's 3x leverage makes trend-following expensive. Every false signal costs you the spread between where you sold and where you rebuy -- and at 3x leverage, those round-trip costs compound quickly. The drawdown exit avoids this problem because it only fires during genuinely large declines (25%+ from peak), resulting in far fewer trades and far less time out of the market.</w:t>
+      </w:r>
+    </w:p>
+    <w:p>
+      <w:pPr>
+        <w:jc w:val="center"/>
+      </w:pPr>
+      <w:r>
+        <w:drawing>
+          <wp:inline xmlns:a="http://schemas.openxmlformats.org/drawingml/2006/main" xmlns:pic="http://schemas.openxmlformats.org/drawingml/2006/picture">
+            <wp:extent cx="5486400" cy="3267431"/>
+            <wp:docPr id="9" name="Picture 9"/>
+            <wp:cNvGraphicFramePr>
+              <a:graphicFrameLocks noChangeAspect="1"/>
+            </wp:cNvGraphicFramePr>
+            <a:graphic>
+              <a:graphicData uri="http://schemas.openxmlformats.org/drawingml/2006/picture">
+                <pic:pic>
+                  <pic:nvPicPr>
+                    <pic:cNvPr id="0" name="13_sma_filter.png"/>
+                    <pic:cNvPicPr/>
+                  </pic:nvPicPr>
+                  <pic:blipFill>
+                    <a:blip r:embed="rId17"/>
+                    <a:stretch>
+                      <a:fillRect/>
+                    </a:stretch>
+                  </pic:blipFill>
+                  <pic:spPr>
+                    <a:xfrm>
+                      <a:off x="0" y="0"/>
+                      <a:ext cx="5486400" cy="3267431"/>
+                    </a:xfrm>
+                    <a:prstGeom prst="rect"/>
+                  </pic:spPr>
+                </pic:pic>
+              </a:graphicData>
+            </a:graphic>
+          </wp:inline>
+        </w:drawing>
+      </w:r>
+    </w:p>
+    <w:p/>
+    <w:p>
+      <w:r>
+        <w:t>The bottom line: whether used as a re-entry gate or as the primary signal, moving average crossovers underperform the simple drawdown exit for UPRO timing. The drawdown exit's advantage is that it responds to UPRO's actual price behavior rather than trying to infer trend direction from SPY.</w:t>
+      </w:r>
+    </w:p>
+    <w:p>
+      <w:pPr>
         <w:pStyle w:val="Heading1"/>
       </w:pPr>
       <w:r>
@@ -6844,7 +7689,7 @@
     </w:p>
     <w:p>
       <w:r>
-        <w:t>So far, the DD25%/Cool40 strategy parks cash in T-bills during cooling periods -- safe, boring, and earning whatever the prevailing short-term rate is. But cooling periods tend to coincide with stock market stress, which is exactly when long-term Treasuries rally (flight to quality). Can we exploit that?</w:t>
+        <w:t>So far, the DD25%/Cool40 strategy parks cash in T-bills during cooling periods -- safe, boring, and earning whatever the prevailing short-term rate is. But cooling periods tend to coincide with stock market stress, which is exactly when long-term Treasuries rally (flight to quality). Can you exploit that?</w:t>
       </w:r>
     </w:p>
     <w:p>
@@ -7498,16 +8343,7 @@
     <w:p/>
     <w:p>
       <w:r>
-        <w:t xml:space="preserve">The TLT variant is the standout. It achieves the highest Sharpe ratio in the entire analysis (0.92) and is the </w:t>
-      </w:r>
-      <w:r>
-        <w:rPr>
-          <w:i/>
-        </w:rPr>
-        <w:t>only</w:t>
-      </w:r>
-      <w:r>
-        <w:t xml:space="preserve"> timing variant that beats UPRO buy-and-hold on terminal wealth ($11.1M vs $10.2M). The Sortino ratio (1.17) is also the best, reflecting particularly good downside risk management.</w:t>
+        <w:t>Both bond variants beat UPRO buy-and-hold on terminal wealth: TLT ($11.1M) and TMF ($12.1M) versus B&amp;H's $10.2M. But TLT is the standout on risk-adjusted metrics. It achieves the highest Sharpe ratio in the entire analysis (0.92) with a manageable -55.3% max drawdown. The Sortino ratio (1.17) is also the best, reflecting particularly good downside risk management. TMF generates even more terminal wealth ($12.1M) but at -76.7% max drawdown -- essentially giving back the entire drawdown advantage that makes the timing strategy worthwhile.</w:t>
       </w:r>
     </w:p>
     <w:p>
@@ -7531,15 +8367,16 @@
         <w:tblLook w:firstColumn="1" w:firstRow="1" w:lastColumn="0" w:lastRow="0" w:noHBand="0" w:noVBand="1" w:val="04A0"/>
       </w:tblPr>
       <w:tblGrid>
-        <w:gridCol w:w="2196"/>
-        <w:gridCol w:w="2196"/>
-        <w:gridCol w:w="2196"/>
-        <w:gridCol w:w="2196"/>
+        <w:gridCol w:w="1757"/>
+        <w:gridCol w:w="1757"/>
+        <w:gridCol w:w="1757"/>
+        <w:gridCol w:w="1757"/>
+        <w:gridCol w:w="1757"/>
       </w:tblGrid>
       <w:tr>
         <w:tc>
           <w:tcPr>
-            <w:tcW w:type="dxa" w:w="2196"/>
+            <w:tcW w:type="dxa" w:w="1757"/>
           </w:tcPr>
           <w:p>
             <w:pPr>
@@ -7556,7 +8393,7 @@
         </w:tc>
         <w:tc>
           <w:tcPr>
-            <w:tcW w:type="dxa" w:w="2196"/>
+            <w:tcW w:type="dxa" w:w="1757"/>
           </w:tcPr>
           <w:p>
             <w:pPr>
@@ -7573,7 +8410,7 @@
         </w:tc>
         <w:tc>
           <w:tcPr>
-            <w:tcW w:type="dxa" w:w="2196"/>
+            <w:tcW w:type="dxa" w:w="1757"/>
           </w:tcPr>
           <w:p>
             <w:pPr>
@@ -7584,13 +8421,30 @@
                 <w:b/>
                 <w:sz w:val="18"/>
               </w:rPr>
+              <w:t>T-bill</w:t>
+            </w:r>
+          </w:p>
+        </w:tc>
+        <w:tc>
+          <w:tcPr>
+            <w:tcW w:type="dxa" w:w="1757"/>
+          </w:tcPr>
+          <w:p>
+            <w:pPr>
+              <w:jc w:val="center"/>
+            </w:pPr>
+            <w:r>
+              <w:rPr>
+                <w:b/>
+                <w:sz w:val="18"/>
+              </w:rPr>
               <w:t>TLT Return</w:t>
             </w:r>
           </w:p>
         </w:tc>
         <w:tc>
           <w:tcPr>
-            <w:tcW w:type="dxa" w:w="2196"/>
+            <w:tcW w:type="dxa" w:w="1757"/>
           </w:tcPr>
           <w:p>
             <w:pPr>
@@ -7609,7 +8463,7 @@
       <w:tr>
         <w:tc>
           <w:tcPr>
-            <w:tcW w:type="dxa" w:w="2196"/>
+            <w:tcW w:type="dxa" w:w="1757"/>
           </w:tcPr>
           <w:p>
             <w:pPr>
@@ -7625,7 +8479,7 @@
         </w:tc>
         <w:tc>
           <w:tcPr>
-            <w:tcW w:type="dxa" w:w="2196"/>
+            <w:tcW w:type="dxa" w:w="1757"/>
           </w:tcPr>
           <w:p>
             <w:pPr>
@@ -7641,7 +8495,23 @@
         </w:tc>
         <w:tc>
           <w:tcPr>
-            <w:tcW w:type="dxa" w:w="2196"/>
+            <w:tcW w:type="dxa" w:w="1757"/>
+          </w:tcPr>
+          <w:p>
+            <w:pPr>
+              <w:jc w:val="center"/>
+            </w:pPr>
+            <w:r>
+              <w:rPr>
+                <w:sz w:val="18"/>
+              </w:rPr>
+              <w:t>+0.0%</w:t>
+            </w:r>
+          </w:p>
+        </w:tc>
+        <w:tc>
+          <w:tcPr>
+            <w:tcW w:type="dxa" w:w="1757"/>
           </w:tcPr>
           <w:p>
             <w:pPr>
@@ -7657,7 +8527,7 @@
         </w:tc>
         <w:tc>
           <w:tcPr>
-            <w:tcW w:type="dxa" w:w="2196"/>
+            <w:tcW w:type="dxa" w:w="1757"/>
           </w:tcPr>
           <w:p>
             <w:pPr>
@@ -7675,7 +8545,7 @@
       <w:tr>
         <w:tc>
           <w:tcPr>
-            <w:tcW w:type="dxa" w:w="2196"/>
+            <w:tcW w:type="dxa" w:w="1757"/>
           </w:tcPr>
           <w:p>
             <w:pPr>
@@ -7691,7 +8561,7 @@
         </w:tc>
         <w:tc>
           <w:tcPr>
-            <w:tcW w:type="dxa" w:w="2196"/>
+            <w:tcW w:type="dxa" w:w="1757"/>
           </w:tcPr>
           <w:p>
             <w:pPr>
@@ -7707,7 +8577,23 @@
         </w:tc>
         <w:tc>
           <w:tcPr>
-            <w:tcW w:type="dxa" w:w="2196"/>
+            <w:tcW w:type="dxa" w:w="1757"/>
+          </w:tcPr>
+          <w:p>
+            <w:pPr>
+              <w:jc w:val="center"/>
+            </w:pPr>
+            <w:r>
+              <w:rPr>
+                <w:sz w:val="18"/>
+              </w:rPr>
+              <w:t>+0.0%</w:t>
+            </w:r>
+          </w:p>
+        </w:tc>
+        <w:tc>
+          <w:tcPr>
+            <w:tcW w:type="dxa" w:w="1757"/>
           </w:tcPr>
           <w:p>
             <w:pPr>
@@ -7723,7 +8609,7 @@
         </w:tc>
         <w:tc>
           <w:tcPr>
-            <w:tcW w:type="dxa" w:w="2196"/>
+            <w:tcW w:type="dxa" w:w="1757"/>
           </w:tcPr>
           <w:p>
             <w:pPr>
@@ -7741,7 +8627,7 @@
       <w:tr>
         <w:tc>
           <w:tcPr>
-            <w:tcW w:type="dxa" w:w="2196"/>
+            <w:tcW w:type="dxa" w:w="1757"/>
           </w:tcPr>
           <w:p>
             <w:pPr>
@@ -7757,7 +8643,7 @@
         </w:tc>
         <w:tc>
           <w:tcPr>
-            <w:tcW w:type="dxa" w:w="2196"/>
+            <w:tcW w:type="dxa" w:w="1757"/>
           </w:tcPr>
           <w:p>
             <w:pPr>
@@ -7773,7 +8659,23 @@
         </w:tc>
         <w:tc>
           <w:tcPr>
-            <w:tcW w:type="dxa" w:w="2196"/>
+            <w:tcW w:type="dxa" w:w="1757"/>
+          </w:tcPr>
+          <w:p>
+            <w:pPr>
+              <w:jc w:val="center"/>
+            </w:pPr>
+            <w:r>
+              <w:rPr>
+                <w:sz w:val="18"/>
+              </w:rPr>
+              <w:t>+0.0%</w:t>
+            </w:r>
+          </w:p>
+        </w:tc>
+        <w:tc>
+          <w:tcPr>
+            <w:tcW w:type="dxa" w:w="1757"/>
           </w:tcPr>
           <w:p>
             <w:pPr>
@@ -7789,7 +8691,7 @@
         </w:tc>
         <w:tc>
           <w:tcPr>
-            <w:tcW w:type="dxa" w:w="2196"/>
+            <w:tcW w:type="dxa" w:w="1757"/>
           </w:tcPr>
           <w:p>
             <w:pPr>
@@ -7807,7 +8709,7 @@
       <w:tr>
         <w:tc>
           <w:tcPr>
-            <w:tcW w:type="dxa" w:w="2196"/>
+            <w:tcW w:type="dxa" w:w="1757"/>
           </w:tcPr>
           <w:p>
             <w:pPr>
@@ -7823,7 +8725,7 @@
         </w:tc>
         <w:tc>
           <w:tcPr>
-            <w:tcW w:type="dxa" w:w="2196"/>
+            <w:tcW w:type="dxa" w:w="1757"/>
           </w:tcPr>
           <w:p>
             <w:pPr>
@@ -7839,7 +8741,23 @@
         </w:tc>
         <w:tc>
           <w:tcPr>
-            <w:tcW w:type="dxa" w:w="2196"/>
+            <w:tcW w:type="dxa" w:w="1757"/>
+          </w:tcPr>
+          <w:p>
+            <w:pPr>
+              <w:jc w:val="center"/>
+            </w:pPr>
+            <w:r>
+              <w:rPr>
+                <w:sz w:val="18"/>
+              </w:rPr>
+              <w:t>+0.0%</w:t>
+            </w:r>
+          </w:p>
+        </w:tc>
+        <w:tc>
+          <w:tcPr>
+            <w:tcW w:type="dxa" w:w="1757"/>
           </w:tcPr>
           <w:p>
             <w:pPr>
@@ -7855,7 +8773,7 @@
         </w:tc>
         <w:tc>
           <w:tcPr>
-            <w:tcW w:type="dxa" w:w="2196"/>
+            <w:tcW w:type="dxa" w:w="1757"/>
           </w:tcPr>
           <w:p>
             <w:pPr>
@@ -7873,7 +8791,7 @@
       <w:tr>
         <w:tc>
           <w:tcPr>
-            <w:tcW w:type="dxa" w:w="2196"/>
+            <w:tcW w:type="dxa" w:w="1757"/>
           </w:tcPr>
           <w:p>
             <w:pPr>
@@ -7889,7 +8807,7 @@
         </w:tc>
         <w:tc>
           <w:tcPr>
-            <w:tcW w:type="dxa" w:w="2196"/>
+            <w:tcW w:type="dxa" w:w="1757"/>
           </w:tcPr>
           <w:p>
             <w:pPr>
@@ -7905,7 +8823,23 @@
         </w:tc>
         <w:tc>
           <w:tcPr>
-            <w:tcW w:type="dxa" w:w="2196"/>
+            <w:tcW w:type="dxa" w:w="1757"/>
+          </w:tcPr>
+          <w:p>
+            <w:pPr>
+              <w:jc w:val="center"/>
+            </w:pPr>
+            <w:r>
+              <w:rPr>
+                <w:sz w:val="18"/>
+              </w:rPr>
+              <w:t>+0.0%</w:t>
+            </w:r>
+          </w:p>
+        </w:tc>
+        <w:tc>
+          <w:tcPr>
+            <w:tcW w:type="dxa" w:w="1757"/>
           </w:tcPr>
           <w:p>
             <w:pPr>
@@ -7921,7 +8855,7 @@
         </w:tc>
         <w:tc>
           <w:tcPr>
-            <w:tcW w:type="dxa" w:w="2196"/>
+            <w:tcW w:type="dxa" w:w="1757"/>
           </w:tcPr>
           <w:p>
             <w:pPr>
@@ -7939,7 +8873,7 @@
       <w:tr>
         <w:tc>
           <w:tcPr>
-            <w:tcW w:type="dxa" w:w="2196"/>
+            <w:tcW w:type="dxa" w:w="1757"/>
           </w:tcPr>
           <w:p>
             <w:pPr>
@@ -7955,7 +8889,7 @@
         </w:tc>
         <w:tc>
           <w:tcPr>
-            <w:tcW w:type="dxa" w:w="2196"/>
+            <w:tcW w:type="dxa" w:w="1757"/>
           </w:tcPr>
           <w:p>
             <w:pPr>
@@ -7971,7 +8905,23 @@
         </w:tc>
         <w:tc>
           <w:tcPr>
-            <w:tcW w:type="dxa" w:w="2196"/>
+            <w:tcW w:type="dxa" w:w="1757"/>
+          </w:tcPr>
+          <w:p>
+            <w:pPr>
+              <w:jc w:val="center"/>
+            </w:pPr>
+            <w:r>
+              <w:rPr>
+                <w:sz w:val="18"/>
+              </w:rPr>
+              <w:t>+0.1%</w:t>
+            </w:r>
+          </w:p>
+        </w:tc>
+        <w:tc>
+          <w:tcPr>
+            <w:tcW w:type="dxa" w:w="1757"/>
           </w:tcPr>
           <w:p>
             <w:pPr>
@@ -7987,7 +8937,7 @@
         </w:tc>
         <w:tc>
           <w:tcPr>
-            <w:tcW w:type="dxa" w:w="2196"/>
+            <w:tcW w:type="dxa" w:w="1757"/>
           </w:tcPr>
           <w:p>
             <w:pPr>
@@ -8005,7 +8955,7 @@
       <w:tr>
         <w:tc>
           <w:tcPr>
-            <w:tcW w:type="dxa" w:w="2196"/>
+            <w:tcW w:type="dxa" w:w="1757"/>
           </w:tcPr>
           <w:p>
             <w:pPr>
@@ -8021,7 +8971,7 @@
         </w:tc>
         <w:tc>
           <w:tcPr>
-            <w:tcW w:type="dxa" w:w="2196"/>
+            <w:tcW w:type="dxa" w:w="1757"/>
           </w:tcPr>
           <w:p>
             <w:pPr>
@@ -8037,7 +8987,23 @@
         </w:tc>
         <w:tc>
           <w:tcPr>
-            <w:tcW w:type="dxa" w:w="2196"/>
+            <w:tcW w:type="dxa" w:w="1757"/>
+          </w:tcPr>
+          <w:p>
+            <w:pPr>
+              <w:jc w:val="center"/>
+            </w:pPr>
+            <w:r>
+              <w:rPr>
+                <w:sz w:val="18"/>
+              </w:rPr>
+              <w:t>+0.4%</w:t>
+            </w:r>
+          </w:p>
+        </w:tc>
+        <w:tc>
+          <w:tcPr>
+            <w:tcW w:type="dxa" w:w="1757"/>
           </w:tcPr>
           <w:p>
             <w:pPr>
@@ -8053,7 +9019,7 @@
         </w:tc>
         <w:tc>
           <w:tcPr>
-            <w:tcW w:type="dxa" w:w="2196"/>
+            <w:tcW w:type="dxa" w:w="1757"/>
           </w:tcPr>
           <w:p>
             <w:pPr>
@@ -8071,7 +9037,7 @@
       <w:tr>
         <w:tc>
           <w:tcPr>
-            <w:tcW w:type="dxa" w:w="2196"/>
+            <w:tcW w:type="dxa" w:w="1757"/>
           </w:tcPr>
           <w:p>
             <w:pPr>
@@ -8087,7 +9053,7 @@
         </w:tc>
         <w:tc>
           <w:tcPr>
-            <w:tcW w:type="dxa" w:w="2196"/>
+            <w:tcW w:type="dxa" w:w="1757"/>
           </w:tcPr>
           <w:p>
             <w:pPr>
@@ -8103,7 +9069,23 @@
         </w:tc>
         <w:tc>
           <w:tcPr>
-            <w:tcW w:type="dxa" w:w="2196"/>
+            <w:tcW w:type="dxa" w:w="1757"/>
+          </w:tcPr>
+          <w:p>
+            <w:pPr>
+              <w:jc w:val="center"/>
+            </w:pPr>
+            <w:r>
+              <w:rPr>
+                <w:sz w:val="18"/>
+              </w:rPr>
+              <w:t>+0.5%</w:t>
+            </w:r>
+          </w:p>
+        </w:tc>
+        <w:tc>
+          <w:tcPr>
+            <w:tcW w:type="dxa" w:w="1757"/>
           </w:tcPr>
           <w:p>
             <w:pPr>
@@ -8119,7 +9101,7 @@
         </w:tc>
         <w:tc>
           <w:tcPr>
-            <w:tcW w:type="dxa" w:w="2196"/>
+            <w:tcW w:type="dxa" w:w="1757"/>
           </w:tcPr>
           <w:p>
             <w:pPr>
@@ -8137,7 +9119,7 @@
       <w:tr>
         <w:tc>
           <w:tcPr>
-            <w:tcW w:type="dxa" w:w="2196"/>
+            <w:tcW w:type="dxa" w:w="1757"/>
           </w:tcPr>
           <w:p>
             <w:pPr>
@@ -8153,7 +9135,7 @@
         </w:tc>
         <w:tc>
           <w:tcPr>
-            <w:tcW w:type="dxa" w:w="2196"/>
+            <w:tcW w:type="dxa" w:w="1757"/>
           </w:tcPr>
           <w:p>
             <w:pPr>
@@ -8169,7 +9151,23 @@
         </w:tc>
         <w:tc>
           <w:tcPr>
-            <w:tcW w:type="dxa" w:w="2196"/>
+            <w:tcW w:type="dxa" w:w="1757"/>
+          </w:tcPr>
+          <w:p>
+            <w:pPr>
+              <w:jc w:val="center"/>
+            </w:pPr>
+            <w:r>
+              <w:rPr>
+                <w:sz w:val="18"/>
+              </w:rPr>
+              <w:t>+0.1%</w:t>
+            </w:r>
+          </w:p>
+        </w:tc>
+        <w:tc>
+          <w:tcPr>
+            <w:tcW w:type="dxa" w:w="1757"/>
           </w:tcPr>
           <w:p>
             <w:pPr>
@@ -8185,7 +9183,7 @@
         </w:tc>
         <w:tc>
           <w:tcPr>
-            <w:tcW w:type="dxa" w:w="2196"/>
+            <w:tcW w:type="dxa" w:w="1757"/>
           </w:tcPr>
           <w:p>
             <w:pPr>
@@ -8203,7 +9201,7 @@
       <w:tr>
         <w:tc>
           <w:tcPr>
-            <w:tcW w:type="dxa" w:w="2196"/>
+            <w:tcW w:type="dxa" w:w="1757"/>
           </w:tcPr>
           <w:p>
             <w:pPr>
@@ -8219,7 +9217,7 @@
         </w:tc>
         <w:tc>
           <w:tcPr>
-            <w:tcW w:type="dxa" w:w="2196"/>
+            <w:tcW w:type="dxa" w:w="1757"/>
           </w:tcPr>
           <w:p>
             <w:pPr>
@@ -8235,7 +9233,23 @@
         </w:tc>
         <w:tc>
           <w:tcPr>
-            <w:tcW w:type="dxa" w:w="2196"/>
+            <w:tcW w:type="dxa" w:w="1757"/>
+          </w:tcPr>
+          <w:p>
+            <w:pPr>
+              <w:jc w:val="center"/>
+            </w:pPr>
+            <w:r>
+              <w:rPr>
+                <w:sz w:val="18"/>
+              </w:rPr>
+              <w:t>+0.0%</w:t>
+            </w:r>
+          </w:p>
+        </w:tc>
+        <w:tc>
+          <w:tcPr>
+            <w:tcW w:type="dxa" w:w="1757"/>
           </w:tcPr>
           <w:p>
             <w:pPr>
@@ -8251,7 +9265,7 @@
         </w:tc>
         <w:tc>
           <w:tcPr>
-            <w:tcW w:type="dxa" w:w="2196"/>
+            <w:tcW w:type="dxa" w:w="1757"/>
           </w:tcPr>
           <w:p>
             <w:pPr>
@@ -8269,7 +9283,7 @@
       <w:tr>
         <w:tc>
           <w:tcPr>
-            <w:tcW w:type="dxa" w:w="2196"/>
+            <w:tcW w:type="dxa" w:w="1757"/>
           </w:tcPr>
           <w:p>
             <w:pPr>
@@ -8285,7 +9299,7 @@
         </w:tc>
         <w:tc>
           <w:tcPr>
-            <w:tcW w:type="dxa" w:w="2196"/>
+            <w:tcW w:type="dxa" w:w="1757"/>
           </w:tcPr>
           <w:p>
             <w:pPr>
@@ -8301,7 +9315,23 @@
         </w:tc>
         <w:tc>
           <w:tcPr>
-            <w:tcW w:type="dxa" w:w="2196"/>
+            <w:tcW w:type="dxa" w:w="1757"/>
+          </w:tcPr>
+          <w:p>
+            <w:pPr>
+              <w:jc w:val="center"/>
+            </w:pPr>
+            <w:r>
+              <w:rPr>
+                <w:sz w:val="18"/>
+              </w:rPr>
+              <w:t>+0.1%</w:t>
+            </w:r>
+          </w:p>
+        </w:tc>
+        <w:tc>
+          <w:tcPr>
+            <w:tcW w:type="dxa" w:w="1757"/>
           </w:tcPr>
           <w:p>
             <w:pPr>
@@ -8317,7 +9347,7 @@
         </w:tc>
         <w:tc>
           <w:tcPr>
-            <w:tcW w:type="dxa" w:w="2196"/>
+            <w:tcW w:type="dxa" w:w="1757"/>
           </w:tcPr>
           <w:p>
             <w:pPr>
@@ -8335,7 +9365,7 @@
       <w:tr>
         <w:tc>
           <w:tcPr>
-            <w:tcW w:type="dxa" w:w="2196"/>
+            <w:tcW w:type="dxa" w:w="1757"/>
           </w:tcPr>
           <w:p>
             <w:pPr>
@@ -8351,7 +9381,7 @@
         </w:tc>
         <w:tc>
           <w:tcPr>
-            <w:tcW w:type="dxa" w:w="2196"/>
+            <w:tcW w:type="dxa" w:w="1757"/>
           </w:tcPr>
           <w:p>
             <w:pPr>
@@ -8367,7 +9397,23 @@
         </w:tc>
         <w:tc>
           <w:tcPr>
-            <w:tcW w:type="dxa" w:w="2196"/>
+            <w:tcW w:type="dxa" w:w="1757"/>
+          </w:tcPr>
+          <w:p>
+            <w:pPr>
+              <w:jc w:val="center"/>
+            </w:pPr>
+            <w:r>
+              <w:rPr>
+                <w:sz w:val="18"/>
+              </w:rPr>
+              <w:t>+0.2%</w:t>
+            </w:r>
+          </w:p>
+        </w:tc>
+        <w:tc>
+          <w:tcPr>
+            <w:tcW w:type="dxa" w:w="1757"/>
           </w:tcPr>
           <w:p>
             <w:pPr>
@@ -8383,7 +9429,7 @@
         </w:tc>
         <w:tc>
           <w:tcPr>
-            <w:tcW w:type="dxa" w:w="2196"/>
+            <w:tcW w:type="dxa" w:w="1757"/>
           </w:tcPr>
           <w:p>
             <w:pPr>
@@ -8401,7 +9447,7 @@
       <w:tr>
         <w:tc>
           <w:tcPr>
-            <w:tcW w:type="dxa" w:w="2196"/>
+            <w:tcW w:type="dxa" w:w="1757"/>
           </w:tcPr>
           <w:p>
             <w:pPr>
@@ -8417,7 +9463,7 @@
         </w:tc>
         <w:tc>
           <w:tcPr>
-            <w:tcW w:type="dxa" w:w="2196"/>
+            <w:tcW w:type="dxa" w:w="1757"/>
           </w:tcPr>
           <w:p>
             <w:pPr>
@@ -8433,7 +9479,23 @@
         </w:tc>
         <w:tc>
           <w:tcPr>
-            <w:tcW w:type="dxa" w:w="2196"/>
+            <w:tcW w:type="dxa" w:w="1757"/>
+          </w:tcPr>
+          <w:p>
+            <w:pPr>
+              <w:jc w:val="center"/>
+            </w:pPr>
+            <w:r>
+              <w:rPr>
+                <w:sz w:val="18"/>
+              </w:rPr>
+              <w:t>+0.8%</w:t>
+            </w:r>
+          </w:p>
+        </w:tc>
+        <w:tc>
+          <w:tcPr>
+            <w:tcW w:type="dxa" w:w="1757"/>
           </w:tcPr>
           <w:p>
             <w:pPr>
@@ -8449,7 +9511,7 @@
         </w:tc>
         <w:tc>
           <w:tcPr>
-            <w:tcW w:type="dxa" w:w="2196"/>
+            <w:tcW w:type="dxa" w:w="1757"/>
           </w:tcPr>
           <w:p>
             <w:pPr>
@@ -8467,7 +9529,7 @@
       <w:tr>
         <w:tc>
           <w:tcPr>
-            <w:tcW w:type="dxa" w:w="2196"/>
+            <w:tcW w:type="dxa" w:w="1757"/>
           </w:tcPr>
           <w:p>
             <w:pPr>
@@ -8483,7 +9545,7 @@
         </w:tc>
         <w:tc>
           <w:tcPr>
-            <w:tcW w:type="dxa" w:w="2196"/>
+            <w:tcW w:type="dxa" w:w="1757"/>
           </w:tcPr>
           <w:p>
             <w:pPr>
@@ -8499,7 +9561,23 @@
         </w:tc>
         <w:tc>
           <w:tcPr>
-            <w:tcW w:type="dxa" w:w="2196"/>
+            <w:tcW w:type="dxa" w:w="1757"/>
+          </w:tcPr>
+          <w:p>
+            <w:pPr>
+              <w:jc w:val="center"/>
+            </w:pPr>
+            <w:r>
+              <w:rPr>
+                <w:sz w:val="18"/>
+              </w:rPr>
+              <w:t>+1.0%</w:t>
+            </w:r>
+          </w:p>
+        </w:tc>
+        <w:tc>
+          <w:tcPr>
+            <w:tcW w:type="dxa" w:w="1757"/>
           </w:tcPr>
           <w:p>
             <w:pPr>
@@ -8515,7 +9593,7 @@
         </w:tc>
         <w:tc>
           <w:tcPr>
-            <w:tcW w:type="dxa" w:w="2196"/>
+            <w:tcW w:type="dxa" w:w="1757"/>
           </w:tcPr>
           <w:p>
             <w:pPr>
@@ -8533,7 +9611,7 @@
       <w:tr>
         <w:tc>
           <w:tcPr>
-            <w:tcW w:type="dxa" w:w="2196"/>
+            <w:tcW w:type="dxa" w:w="1757"/>
           </w:tcPr>
           <w:p>
             <w:pPr>
@@ -8549,7 +9627,7 @@
         </w:tc>
         <w:tc>
           <w:tcPr>
-            <w:tcW w:type="dxa" w:w="2196"/>
+            <w:tcW w:type="dxa" w:w="1757"/>
           </w:tcPr>
           <w:p>
             <w:pPr>
@@ -8565,7 +9643,23 @@
         </w:tc>
         <w:tc>
           <w:tcPr>
-            <w:tcW w:type="dxa" w:w="2196"/>
+            <w:tcW w:type="dxa" w:w="1757"/>
+          </w:tcPr>
+          <w:p>
+            <w:pPr>
+              <w:jc w:val="center"/>
+            </w:pPr>
+            <w:r>
+              <w:rPr>
+                <w:sz w:val="18"/>
+              </w:rPr>
+              <w:t>+0.9%</w:t>
+            </w:r>
+          </w:p>
+        </w:tc>
+        <w:tc>
+          <w:tcPr>
+            <w:tcW w:type="dxa" w:w="1757"/>
           </w:tcPr>
           <w:p>
             <w:pPr>
@@ -8581,7 +9675,7 @@
         </w:tc>
         <w:tc>
           <w:tcPr>
-            <w:tcW w:type="dxa" w:w="2196"/>
+            <w:tcW w:type="dxa" w:w="1757"/>
           </w:tcPr>
           <w:p>
             <w:pPr>
@@ -8600,7 +9694,7 @@
     <w:p/>
     <w:p>
       <w:r>
-        <w:t>The pattern is clear. During genuine flight-to-quality events (2011 debt ceiling, 2018 tightening scare, COVID, late 2023), TLT delivers strong positive returns while you're out of UPRO. During rate-hiking periods (2022), TLT loses money -- but the losses are manageable (-7% to -10%), not catastrophic.</w:t>
+        <w:t>The pattern is clear. During genuine flight-to-quality events (2011 debt ceiling, 2018 tightening scare, COVID, late 2023), TLT delivers strong positive returns while you're out of UPRO. During rate-hiking periods (2022), TLT loses money -- but the losses are manageable (-7% to -10%), not catastrophic. T-bills, by contrast, earned essentially nothing during the ZIRP years (2010-2016, 2020) and only meaningful returns once the Fed started hiking in 2022 -- precisely the periods where TLT was losing money.</w:t>
       </w:r>
     </w:p>
     <w:p>
@@ -8645,7 +9739,7 @@
         <w:drawing>
           <wp:inline xmlns:a="http://schemas.openxmlformats.org/drawingml/2006/main" xmlns:pic="http://schemas.openxmlformats.org/drawingml/2006/picture">
             <wp:extent cx="5486400" cy="3267431"/>
-            <wp:docPr id="9" name="Picture 9"/>
+            <wp:docPr id="10" name="Picture 10"/>
             <wp:cNvGraphicFramePr>
               <a:graphicFrameLocks noChangeAspect="1"/>
             </wp:cNvGraphicFramePr>
@@ -8657,7 +9751,7 @@
                     <pic:cNvPicPr/>
                   </pic:nvPicPr>
                   <pic:blipFill>
-                    <a:blip r:embed="rId17"/>
+                    <a:blip r:embed="rId18"/>
                     <a:stretch>
                       <a:fillRect/>
                     </a:stretch>
@@ -8787,7 +9881,7 @@
         <w:t>Tax considerations.</w:t>
       </w:r>
       <w:r>
-        <w:t xml:space="preserve"> Each exit is a taxable event. At roughly 15 round-trip trades over 16+ years (~1 per year), this is manageable but real. In an IRA or 401(k), it's a non-issue. In a taxable account, most exits during drawdowns will be at a loss, making them tax-loss harvesting opportunities.</w:t>
+        <w:t xml:space="preserve"> Each exit is a taxable event. At roughly 15 round-trip trades over 16+ years (~1 per year), this is manageable but real. In an IRA or 401(k), it's a non-issue. In a taxable account, most exits are actually gains (12 of 15 historically) because the 25% drawdown trigger fires from the all-time high, not from the entry price -- so exits typically occur well above where you bought in. The three loss exits (early 2012, early 2016, spring 2022) came from quick whipsaws where re-entry was followed by another drawdown, and those do provide tax-loss harvesting opportunities.</w:t>
       </w:r>
     </w:p>
     <w:p>
@@ -8828,7 +9922,7 @@
         <w:pStyle w:val="Heading1"/>
       </w:pPr>
       <w:r>
-        <w:t>Where Are We Now?</w:t>
+        <w:t>Where Is the Strategy Now?</w:t>
       </w:r>
     </w:p>
     <w:p>
@@ -8975,7 +10069,7 @@
         <w:t>Volatility decay is real.</w:t>
       </w:r>
       <w:r>
-        <w:t xml:space="preserve"> We used actual UPRO prices, so the decay from daily rebalancing is embedded in the data. But over longer periods, 3x daily leverage systematically underperforms 3x the index return. This is a feature of the product, not a modeling error.</w:t>
+        <w:t xml:space="preserve"> I used actual UPRO prices, so the decay from daily rebalancing is embedded in the data. But over longer periods, 3x daily leverage systematically underperforms 3x the index return. This is a feature of the product, not a modeling error.</w:t>
       </w:r>
     </w:p>
     <w:p>
@@ -9477,7 +10571,7 @@
         <w:drawing>
           <wp:inline xmlns:a="http://schemas.openxmlformats.org/drawingml/2006/main" xmlns:pic="http://schemas.openxmlformats.org/drawingml/2006/picture">
             <wp:extent cx="5486400" cy="2324813"/>
-            <wp:docPr id="10" name="Picture 10"/>
+            <wp:docPr id="11" name="Picture 11"/>
             <wp:cNvGraphicFramePr>
               <a:graphicFrameLocks noChangeAspect="1"/>
             </wp:cNvGraphicFramePr>
@@ -9489,7 +10583,7 @@
                     <pic:cNvPicPr/>
                   </pic:nvPicPr>
                   <pic:blipFill>
-                    <a:blip r:embed="rId18"/>
+                    <a:blip r:embed="rId19"/>
                     <a:stretch>
                       <a:fillRect/>
                     </a:stretch>
@@ -9517,7 +10611,7 @@
         <w:drawing>
           <wp:inline xmlns:a="http://schemas.openxmlformats.org/drawingml/2006/main" xmlns:pic="http://schemas.openxmlformats.org/drawingml/2006/picture">
             <wp:extent cx="5486400" cy="2325649"/>
-            <wp:docPr id="11" name="Picture 11"/>
+            <wp:docPr id="12" name="Picture 12"/>
             <wp:cNvGraphicFramePr>
               <a:graphicFrameLocks noChangeAspect="1"/>
             </wp:cNvGraphicFramePr>
@@ -9529,7 +10623,7 @@
                     <pic:cNvPicPr/>
                   </pic:nvPicPr>
                   <pic:blipFill>
-                    <a:blip r:embed="rId19"/>
+                    <a:blip r:embed="rId20"/>
                     <a:stretch>
                       <a:fillRect/>
                     </a:stretch>
@@ -9557,7 +10651,7 @@
         <w:drawing>
           <wp:inline xmlns:a="http://schemas.openxmlformats.org/drawingml/2006/main" xmlns:pic="http://schemas.openxmlformats.org/drawingml/2006/picture">
             <wp:extent cx="5486400" cy="3255818"/>
-            <wp:docPr id="12" name="Picture 12"/>
+            <wp:docPr id="13" name="Picture 13"/>
             <wp:cNvGraphicFramePr>
               <a:graphicFrameLocks noChangeAspect="1"/>
             </wp:cNvGraphicFramePr>
@@ -9569,7 +10663,7 @@
                     <pic:cNvPicPr/>
                   </pic:nvPicPr>
                   <pic:blipFill>
-                    <a:blip r:embed="rId20"/>
+                    <a:blip r:embed="rId21"/>
                     <a:stretch>
                       <a:fillRect/>
                     </a:stretch>
@@ -9727,7 +10821,17 @@
           <w:color w:val="666666"/>
           <w:sz w:val="20"/>
         </w:rPr>
-        <w:t>Disclosure: I am long SPY (5,000+ shares across multiple accounts) and hold deep in-the-money SPY and QQQ LEAPS calls. I do not hold UPRO.</w:t>
+        <w:t>Disclosure: I/we are long SPY (5,000+ shares across multiple accounts) and hold deep in-the-money SPY and QQQ LEAPS calls. I do not hold UPRO, SSO, TMF, or any other leveraged ETF.</w:t>
+      </w:r>
+    </w:p>
+    <w:p>
+      <w:r>
+        <w:rPr>
+          <w:i/>
+          <w:color w:val="666666"/>
+          <w:sz w:val="20"/>
+        </w:rPr>
+        <w:t>I wrote this article myself, and it expresses my own opinions. I am not receiving compensation for it (other than from Seeking Alpha). I have no business relationship with any company whose stock is mentioned in this article.</w:t>
       </w:r>
     </w:p>
     <w:p>

</xml_diff>

<commit_message>
Add Sharpe ratio methodology footnote
Note that Sharpe ratios use zero risk-free rate; subtracting T-bill
rates would reduce all by ~0.05 but preserve relative ordering.

Co-Authored-By: Claude Opus 4.6 <noreply@anthropic.com>
</commit_message>
<xml_diff>
--- a/UPRO_Timing_Strategies_Article.docx
+++ b/UPRO_Timing_Strategies_Article.docx
@@ -238,6 +238,20 @@
       </w:r>
       <w:r>
         <w:t xml:space="preserve"> All signals are end-of-day close-based. No intraday monitoring is required.</w:t>
+      </w:r>
+    </w:p>
+    <w:p>
+      <w:pPr>
+        <w:pStyle w:val="ListBullet"/>
+      </w:pPr>
+      <w:r>
+        <w:rPr>
+          <w:b/>
+        </w:rPr>
+        <w:t>Sharpe ratios:</w:t>
+      </w:r>
+      <w:r>
+        <w:t xml:space="preserve"> Computed with a zero risk-free rate (mean daily return / standard deviation, annualized). Subtracting T-bill rates would reduce all ratios by approximately 0.05 but preserve the relative ordering between strategies.</w:t>
       </w:r>
     </w:p>
     <w:p>

</xml_diff>

<commit_message>
Use T-bill excess returns for Sharpe, Sortino, and Calmar ratios
compute_metrics() now accepts rf_annual parameter. All strategy
runners pass the average T-bill rate over their date range.
Article text updated with new ratio values throughout (e.g.
DD25/Cool40 Sharpe 0.90→0.86, UPRO B&H 0.80→0.78, TLT variant
0.92→0.89). Rankings and conclusions unchanged.

Co-Authored-By: Claude Opus 4.6 <noreply@anthropic.com>
</commit_message>
<xml_diff>
--- a/UPRO_Timing_Strategies_Article.docx
+++ b/UPRO_Timing_Strategies_Article.docx
@@ -40,7 +40,7 @@
         <w:pStyle w:val="ListBullet"/>
       </w:pPr>
       <w:r>
-        <w:t>The best risk-adjusted strategy -- a simple drawdown exit with a cooling period -- delivered a 0.90 Sharpe ratio (vs 0.80 for UPRO buy-and-hold and 0.89 for plain SPY) and cut the maximum drawdown from -77% to -42%, at the cost of about 12% less terminal wealth. Robustness testing (walk-forward validation, parameter heatmaps, and a synthetic pre-2009 stress test) confirms the result is not a fragile optimum.</w:t>
+        <w:t>The best risk-adjusted strategy -- a simple drawdown exit with a cooling period -- delivered a 0.86 Sharpe ratio (vs 0.78 for UPRO buy-and-hold and 0.85 for plain SPY) and cut the maximum drawdown from -77% to -42%, at the cost of about 12% less terminal wealth. Robustness testing (walk-forward validation, parameter heatmaps, and a synthetic pre-2009 stress test) confirms the result is not a fragile optimum.</w:t>
       </w:r>
     </w:p>
     <w:p>
@@ -48,7 +48,7 @@
         <w:pStyle w:val="ListBullet"/>
       </w:pPr>
       <w:r>
-        <w:t>An enhancement: parking idle cash in TLT (long-term Treasuries) instead of T-bills during cooling periods pushes the Sharpe to 0.92 and terminal wealth to $11.1M -- actually beating UPRO buy-and-hold -- by harvesting flight-to-quality rallies when stocks crash.</w:t>
+        <w:t>An enhancement: parking idle cash in TLT (long-term Treasuries) instead of T-bills during cooling periods pushes the Sharpe to 0.89 and terminal wealth to $11.1M -- actually beating UPRO buy-and-hold -- by harvesting flight-to-quality rallies when stocks crash.</w:t>
       </w:r>
     </w:p>
     <w:p>
@@ -248,10 +248,10 @@
         <w:rPr>
           <w:b/>
         </w:rPr>
-        <w:t>Sharpe ratios:</w:t>
+        <w:t>Sharpe and Sortino ratios:</w:t>
       </w:r>
       <w:r>
-        <w:t xml:space="preserve"> Computed with a zero risk-free rate (mean daily return / standard deviation, annualized). Subtracting T-bill rates would reduce all ratios by approximately 0.05 but preserve the relative ordering between strategies.</w:t>
+        <w:t xml:space="preserve"> Computed using excess returns over the prevailing 13-week T-bill rate, annualized.</w:t>
       </w:r>
     </w:p>
     <w:p>
@@ -891,7 +891,7 @@
               <w:rPr>
                 <w:sz w:val="18"/>
               </w:rPr>
-              <w:t>0.80</w:t>
+              <w:t>0.78</w:t>
             </w:r>
           </w:p>
         </w:tc>
@@ -925,7 +925,7 @@
               <w:rPr>
                 <w:sz w:val="18"/>
               </w:rPr>
-              <w:t>0.99</w:t>
+              <w:t>0.96</w:t>
             </w:r>
           </w:p>
         </w:tc>
@@ -959,7 +959,7 @@
               <w:rPr>
                 <w:sz w:val="18"/>
               </w:rPr>
-              <w:t>0.42</w:t>
+              <w:t>0.40</w:t>
             </w:r>
           </w:p>
         </w:tc>
@@ -1036,7 +1036,16 @@
     <w:p/>
     <w:p>
       <w:r>
-        <w:t>These are extraordinary numbers. No timing strategy in this analysis beats buy-and-hold on total return. If you have the iron stomach to hold through a -77% drawdown -- and I mean genuinely hold, not just say you would in a hypothetical -- then buy-and-hold is the mathematically optimal choice.</w:t>
+        <w:t xml:space="preserve">These are extraordinary numbers. No timing strategy in this analysis beats buy-and-hold on total return. If you have the iron stomach to hold through a -77% drawdown -- and I mean genuinely hold, not just say you would in a hypothetical -- then buy-and-hold is the mathematically optimal choice. (For comparison, plain SPY buy-and-hold over the same period has a 0.82 Sharpe -- UPRO's 3x leverage actually </w:t>
+      </w:r>
+      <w:r>
+        <w:rPr>
+          <w:i/>
+        </w:rPr>
+        <w:t>reduces</w:t>
+      </w:r>
+      <w:r>
+        <w:t xml:space="preserve"> risk-adjusted returns while tripling the volatility.)</w:t>
       </w:r>
     </w:p>
     <w:p>
@@ -1278,7 +1287,7 @@
               <w:rPr>
                 <w:sz w:val="18"/>
               </w:rPr>
-              <w:t>0.89</w:t>
+              <w:t>0.82</w:t>
             </w:r>
           </w:p>
         </w:tc>
@@ -1376,7 +1385,7 @@
               <w:rPr>
                 <w:sz w:val="18"/>
               </w:rPr>
-              <w:t>0.89</w:t>
+              <w:t>0.87</w:t>
             </w:r>
           </w:p>
         </w:tc>
@@ -1474,7 +1483,7 @@
               <w:rPr>
                 <w:sz w:val="18"/>
               </w:rPr>
-              <w:t>0.66</w:t>
+              <w:t>0.64</w:t>
             </w:r>
           </w:p>
         </w:tc>
@@ -1572,7 +1581,7 @@
               <w:rPr>
                 <w:sz w:val="18"/>
               </w:rPr>
-              <w:t>0.81</w:t>
+              <w:t>0.76</w:t>
             </w:r>
           </w:p>
         </w:tc>
@@ -1670,7 +1679,7 @@
               <w:rPr>
                 <w:sz w:val="18"/>
               </w:rPr>
-              <w:t>0.80</w:t>
+              <w:t>0.78</w:t>
             </w:r>
           </w:p>
         </w:tc>
@@ -2741,7 +2750,7 @@
     </w:p>
     <w:p>
       <w:r>
-        <w:t>The best VIX variant (VIX &lt; 30) produced a $4.3M end value with a 0.75 Sharpe and -68.9% max drawdown. You sacrifice more than half the terminal wealth for a max drawdown that's only 8 percentage points better. The threshold barely filters anything -- VIX is below 30 about 94% of the time -- so you get almost all of the downside with less upside.</w:t>
+        <w:t>The best VIX variant (VIX &lt; 30) produced a $4.3M end value with a 0.72 Sharpe and -68.9% max drawdown. You sacrifice more than half the terminal wealth for a max drawdown that's only 8 percentage points better. The threshold barely filters anything -- VIX is below 30 about 94% of the time -- so you get almost all of the downside with less upside.</w:t>
       </w:r>
     </w:p>
     <w:p>
@@ -2770,7 +2779,7 @@
     </w:p>
     <w:p>
       <w:r>
-        <w:t>End value: $607K. CAGR: +11.4%. Sharpe: 0.50. Max drawdown: -56.6%. Only invested 63% of the time, with 76 trade signals.</w:t>
+        <w:t>End value: $607K. CAGR: +11.4%. Sharpe: 0.46. Max drawdown: -56.6%. Only invested 63% of the time, with 76 trade signals.</w:t>
       </w:r>
     </w:p>
     <w:p>
@@ -2799,7 +2808,7 @@
     </w:p>
     <w:p>
       <w:r>
-        <w:t>End value: $3.3M. CAGR: +23.5%. Sharpe: 0.88. Sortino: 1.14. Max drawdown: -70.5%. The 67 "trades" are quarterly rebalancing events (adjusting the 55/45 allocation every ~63 trading days), not 67 round-trip trades.</w:t>
+        <w:t>End value: $3.3M. CAGR: +23.5%. Sharpe: 0.83. Sortino: 1.08. Max drawdown: -70.5%. The 67 "trades" are quarterly rebalancing events (adjusting the 55/45 allocation every ~63 trading days), not 67 round-trip trades.</w:t>
       </w:r>
     </w:p>
     <w:p>
@@ -3034,7 +3043,7 @@
               <w:rPr>
                 <w:sz w:val="18"/>
               </w:rPr>
-              <w:t>0.52</w:t>
+              <w:t>0.48</w:t>
             </w:r>
           </w:p>
         </w:tc>
@@ -3148,7 +3157,7 @@
               <w:rPr>
                 <w:sz w:val="18"/>
               </w:rPr>
-              <w:t>0.76</w:t>
+              <w:t>0.71</w:t>
             </w:r>
           </w:p>
         </w:tc>
@@ -3262,7 +3271,7 @@
               <w:rPr>
                 <w:sz w:val="18"/>
               </w:rPr>
-              <w:t>0.75</w:t>
+              <w:t>0.70</w:t>
             </w:r>
           </w:p>
         </w:tc>
@@ -3376,7 +3385,7 @@
               <w:rPr>
                 <w:sz w:val="18"/>
               </w:rPr>
-              <w:t>0.62</w:t>
+              <w:t>0.58</w:t>
             </w:r>
           </w:p>
         </w:tc>
@@ -3490,7 +3499,7 @@
               <w:rPr>
                 <w:sz w:val="18"/>
               </w:rPr>
-              <w:t>0.70</w:t>
+              <w:t>0.66</w:t>
             </w:r>
           </w:p>
         </w:tc>
@@ -3604,7 +3613,7 @@
               <w:rPr>
                 <w:sz w:val="18"/>
               </w:rPr>
-              <w:t>0.45</w:t>
+              <w:t>0.40</w:t>
             </w:r>
           </w:p>
         </w:tc>
@@ -3718,7 +3727,7 @@
               <w:rPr>
                 <w:sz w:val="18"/>
               </w:rPr>
-              <w:t>0.88</w:t>
+              <w:t>0.85</w:t>
             </w:r>
           </w:p>
         </w:tc>
@@ -3832,7 +3841,7 @@
               <w:rPr>
                 <w:sz w:val="18"/>
               </w:rPr>
-              <w:t>0.79</w:t>
+              <w:t>0.76</w:t>
             </w:r>
           </w:p>
         </w:tc>
@@ -3946,7 +3955,7 @@
               <w:rPr>
                 <w:sz w:val="18"/>
               </w:rPr>
-              <w:t>0.57</w:t>
+              <w:t>0.53</w:t>
             </w:r>
           </w:p>
         </w:tc>
@@ -4060,7 +4069,7 @@
               <w:rPr>
                 <w:sz w:val="18"/>
               </w:rPr>
-              <w:t>0.87</w:t>
+              <w:t>0.83</w:t>
             </w:r>
           </w:p>
         </w:tc>
@@ -4178,7 +4187,7 @@
                 <w:b/>
                 <w:sz w:val="18"/>
               </w:rPr>
-              <w:t>0.90</w:t>
+              <w:t>0.86</w:t>
             </w:r>
           </w:p>
         </w:tc>
@@ -4295,7 +4304,7 @@
               <w:rPr>
                 <w:sz w:val="18"/>
               </w:rPr>
-              <w:t>0.69</w:t>
+              <w:t>0.65</w:t>
             </w:r>
           </w:p>
         </w:tc>
@@ -4425,7 +4434,7 @@
         <w:t>35 percentage points better</w:t>
       </w:r>
       <w:r>
-        <w:t xml:space="preserve"> (-41.8% vs -76.8%). The Sharpe ratio improves from 0.80 to 0.90. 31 trade signals over 16+ years -- roughly one exit/re-entry cycle per year. You're invested 86% of the time.</w:t>
+        <w:t xml:space="preserve"> (-41.8% vs -76.8%). The Sharpe ratio improves from 0.78 to 0.86. 31 trade signals over 16+ years -- roughly one exit/re-entry cycle per year. You're invested 86% of the time.</w:t>
       </w:r>
     </w:p>
     <w:p>
@@ -4443,7 +4452,7 @@
     </w:p>
     <w:p>
       <w:r>
-        <w:t>Composite 2-of-3: $1.2M end value, +15.9% CAGR, 0.60 Sharpe, -61.1% max DD. Composite 3-of-3: $893K, +14.1% CAGR, 0.61 Sharpe, -50.1% max DD.</w:t>
+        <w:t>Composite 2-of-3: $1.2M end value, +15.9% CAGR, 0.56 Sharpe, -61.1% max DD. Composite 3-of-3: $893K, +14.1% CAGR, 0.56 Sharpe, -50.1% max DD.</w:t>
       </w:r>
     </w:p>
     <w:p>
@@ -4667,7 +4676,7 @@
                 <w:b/>
                 <w:sz w:val="18"/>
               </w:rPr>
-              <w:t>0.80</w:t>
+              <w:t>0.78</w:t>
             </w:r>
           </w:p>
         </w:tc>
@@ -4784,7 +4793,7 @@
               <w:rPr>
                 <w:sz w:val="18"/>
               </w:rPr>
-              <w:t>0.75</w:t>
+              <w:t>0.72</w:t>
             </w:r>
           </w:p>
         </w:tc>
@@ -4898,7 +4907,7 @@
               <w:rPr>
                 <w:sz w:val="18"/>
               </w:rPr>
-              <w:t>0.50</w:t>
+              <w:t>0.46</w:t>
             </w:r>
           </w:p>
         </w:tc>
@@ -5012,7 +5021,7 @@
               <w:rPr>
                 <w:sz w:val="18"/>
               </w:rPr>
-              <w:t>0.88</w:t>
+              <w:t>0.83</w:t>
             </w:r>
           </w:p>
         </w:tc>
@@ -5130,7 +5139,7 @@
                 <w:b/>
                 <w:sz w:val="18"/>
               </w:rPr>
-              <w:t>0.90</w:t>
+              <w:t>0.86</w:t>
             </w:r>
           </w:p>
         </w:tc>
@@ -5247,7 +5256,7 @@
               <w:rPr>
                 <w:sz w:val="18"/>
               </w:rPr>
-              <w:t>0.60</w:t>
+              <w:t>0.56</w:t>
             </w:r>
           </w:p>
         </w:tc>
@@ -5389,7 +5398,7 @@
     <w:p/>
     <w:p>
       <w:r>
-        <w:t>HFEA is a respectable second on Sharpe (0.88) thanks to its strong Sortino ratio, but its -70.5% max drawdown means it didn't solve the core problem. Dual Momentum and Composite sacrifice too much return for the risk reduction they provide. The VIX filter either destroys returns (tight thresholds) or barely reduces risk (VIX &lt; 30).</w:t>
+        <w:t>HFEA is a respectable second on Sharpe (0.83) thanks to its strong Sortino ratio, but its -70.5% max drawdown means it didn't solve the core problem. Dual Momentum and Composite sacrifice too much return for the risk reduction they provide. The VIX filter either destroys returns (tight thresholds) or barely reduces risk (VIX &lt; 30).</w:t>
       </w:r>
     </w:p>
     <w:p>
@@ -5420,7 +5429,7 @@
     </w:p>
     <w:p>
       <w:r>
-        <w:t>The result: DD25%/Cool40's 0.90 Sharpe sits at the peak of a broad green plateau. Adjacent cells DD20-25%/Cool30-40 all produce Sharpe ratios above 0.79. You can shift the threshold by 5 percentage points or the cooling period by 10 days in either direction and still get strong risk-adjusted performance. This is not a fragile optimum -- it's a robust region.</w:t>
+        <w:t>The result: DD25%/Cool40's 0.86 Sharpe sits at the peak of a broad green plateau. Adjacent cells DD20-25%/Cool30-40 all produce Sharpe ratios above 0.75. You can shift the threshold by 5 percentage points or the cooling period by 10 days in either direction and still get strong risk-adjusted performance. This is not a fragile optimum -- it's a robust region.</w:t>
       </w:r>
     </w:p>
     <w:p>
@@ -5487,7 +5496,7 @@
         <w:t>not</w:t>
       </w:r>
       <w:r>
-        <w:t xml:space="preserve"> DD25%/Cool40. But when applied to the 2017-2026 out-of-sample period, DD30%/Cool10 delivered a 30.4% CAGR, 0.81 Sharpe, and -64.7% max drawdown. The strategy still works out-of-sample, even though the exact best parameters shifted.</w:t>
+        <w:t xml:space="preserve"> DD25%/Cool40. But when applied to the 2017-2026 out-of-sample period, DD30%/Cool10 delivered a 30.4% CAGR, 0.76 Sharpe, and -64.7% max drawdown. The strategy still works out-of-sample, even though the exact best parameters shifted.</w:t>
       </w:r>
     </w:p>
     <w:p>
@@ -5705,7 +5714,7 @@
               <w:rPr>
                 <w:sz w:val="18"/>
               </w:rPr>
-              <w:t>0.81</w:t>
+              <w:t>0.76</w:t>
             </w:r>
           </w:p>
         </w:tc>
@@ -5827,7 +5836,7 @@
     </w:p>
     <w:p>
       <w:r>
-        <w:t>Over the full 1993-2026 period, DD25%/Cool40 slightly outperformed B&amp;H: 21.2% CAGR vs 20.9% CAGR, with a 0.68 Sharpe vs 0.62. The drawdown exit earns its keep mostly by surviving the catastrophic periods, then riding the recovery.</w:t>
+        <w:t>Over the full 1993-2026 period, DD25%/Cool40 slightly outperformed B&amp;H: 21.2% CAGR vs 20.9% CAGR, with a 0.62 Sharpe vs 0.58. The drawdown exit earns its keep mostly by surviving the catastrophic periods, then riding the recovery.</w:t>
       </w:r>
     </w:p>
     <w:tbl>
@@ -6572,7 +6581,7 @@
               <w:rPr>
                 <w:sz w:val="18"/>
               </w:rPr>
-              <w:t>0.90</w:t>
+              <w:t>0.86</w:t>
             </w:r>
           </w:p>
         </w:tc>
@@ -6654,7 +6663,7 @@
               <w:rPr>
                 <w:sz w:val="18"/>
               </w:rPr>
-              <w:t>0.80</w:t>
+              <w:t>0.77</w:t>
             </w:r>
           </w:p>
         </w:tc>
@@ -6736,7 +6745,7 @@
               <w:rPr>
                 <w:sz w:val="18"/>
               </w:rPr>
-              <w:t>0.70</w:t>
+              <w:t>0.67</w:t>
             </w:r>
           </w:p>
         </w:tc>
@@ -6818,7 +6827,7 @@
               <w:rPr>
                 <w:sz w:val="18"/>
               </w:rPr>
-              <w:t>0.64</w:t>
+              <w:t>0.61</w:t>
             </w:r>
           </w:p>
         </w:tc>
@@ -7115,7 +7124,7 @@
                 <w:b/>
                 <w:sz w:val="18"/>
               </w:rPr>
-              <w:t>0.90</w:t>
+              <w:t>0.86</w:t>
             </w:r>
           </w:p>
         </w:tc>
@@ -7232,7 +7241,7 @@
               <w:rPr>
                 <w:sz w:val="18"/>
               </w:rPr>
-              <w:t>0.61</w:t>
+              <w:t>0.57</w:t>
             </w:r>
           </w:p>
         </w:tc>
@@ -7346,7 +7355,7 @@
               <w:rPr>
                 <w:sz w:val="18"/>
               </w:rPr>
-              <w:t>0.77</w:t>
+              <w:t>0.73</w:t>
             </w:r>
           </w:p>
         </w:tc>
@@ -7460,7 +7469,7 @@
               <w:rPr>
                 <w:sz w:val="18"/>
               </w:rPr>
-              <w:t>0.54</w:t>
+              <w:t>0.50</w:t>
             </w:r>
           </w:p>
         </w:tc>
@@ -7574,7 +7583,7 @@
               <w:rPr>
                 <w:sz w:val="18"/>
               </w:rPr>
-              <w:t>0.53</w:t>
+              <w:t>0.50</w:t>
             </w:r>
           </w:p>
         </w:tc>
@@ -7631,7 +7640,7 @@
     <w:p/>
     <w:p>
       <w:r>
-        <w:t xml:space="preserve">None of the pure SMA filters come close to DD25%/Cool40 on any metric. SMA100 is the best of the group -- a 22.0% CAGR with a 0.77 Sharpe and -46.0% max drawdown -- but it still trails the drawdown exit by 9 percentage points of CAGR with a worse Sharpe and worse max drawdown. SMA50 whipsaws excessively (282 trades over 16 years) and bleeds returns through false signals. The 2% buffer variant, which mimics the 80-delta strategy's SMA exit rule, actually makes things </w:t>
+        <w:t xml:space="preserve">None of the pure SMA filters come close to DD25%/Cool40 on any metric. SMA100 is the best of the group -- a 22.0% CAGR with a 0.73 Sharpe and -46.0% max drawdown -- but it still trails the drawdown exit by 9 percentage points of CAGR with a worse Sharpe and worse max drawdown. SMA50 whipsaws excessively (282 trades over 16 years) and bleeds returns through false signals. The 2% buffer variant, which mimics the 80-delta strategy's SMA exit rule, actually makes things </w:t>
       </w:r>
       <w:r>
         <w:rPr>
@@ -7951,7 +7960,7 @@
               <w:rPr>
                 <w:sz w:val="18"/>
               </w:rPr>
-              <w:t>0.90</w:t>
+              <w:t>0.86</w:t>
             </w:r>
           </w:p>
         </w:tc>
@@ -7967,7 +7976,7 @@
               <w:rPr>
                 <w:sz w:val="18"/>
               </w:rPr>
-              <w:t>1.07</w:t>
+              <w:t>1.06</w:t>
             </w:r>
           </w:p>
         </w:tc>
@@ -7999,7 +8008,7 @@
               <w:rPr>
                 <w:sz w:val="18"/>
               </w:rPr>
-              <w:t>0.74</w:t>
+              <w:t>0.71</w:t>
             </w:r>
           </w:p>
         </w:tc>
@@ -8069,7 +8078,7 @@
                 <w:b/>
                 <w:sz w:val="18"/>
               </w:rPr>
-              <w:t>0.92</w:t>
+              <w:t>0.89</w:t>
             </w:r>
           </w:p>
         </w:tc>
@@ -8086,7 +8095,7 @@
                 <w:b/>
                 <w:sz w:val="18"/>
               </w:rPr>
-              <w:t>1.17</w:t>
+              <w:t>1.13</w:t>
             </w:r>
           </w:p>
         </w:tc>
@@ -8120,7 +8129,7 @@
                 <w:b/>
                 <w:sz w:val="18"/>
               </w:rPr>
-              <w:t>0.59</w:t>
+              <w:t>0.57</w:t>
             </w:r>
           </w:p>
         </w:tc>
@@ -8186,7 +8195,7 @@
               <w:rPr>
                 <w:sz w:val="18"/>
               </w:rPr>
-              <w:t>0.87</w:t>
+              <w:t>0.84</w:t>
             </w:r>
           </w:p>
         </w:tc>
@@ -8202,7 +8211,7 @@
               <w:rPr>
                 <w:sz w:val="18"/>
               </w:rPr>
-              <w:t>1.13</w:t>
+              <w:t>1.09</w:t>
             </w:r>
           </w:p>
         </w:tc>
@@ -8234,7 +8243,7 @@
               <w:rPr>
                 <w:sz w:val="18"/>
               </w:rPr>
-              <w:t>0.43</w:t>
+              <w:t>0.42</w:t>
             </w:r>
           </w:p>
         </w:tc>
@@ -8300,7 +8309,7 @@
               <w:rPr>
                 <w:sz w:val="18"/>
               </w:rPr>
-              <w:t>*0.80*</w:t>
+              <w:t>*0.78*</w:t>
             </w:r>
           </w:p>
         </w:tc>
@@ -8316,7 +8325,7 @@
               <w:rPr>
                 <w:sz w:val="18"/>
               </w:rPr>
-              <w:t>*0.99*</w:t>
+              <w:t>*0.96*</w:t>
             </w:r>
           </w:p>
         </w:tc>
@@ -8348,7 +8357,7 @@
               <w:rPr>
                 <w:sz w:val="18"/>
               </w:rPr>
-              <w:t>*0.42*</w:t>
+              <w:t>*0.40*</w:t>
             </w:r>
           </w:p>
         </w:tc>
@@ -8357,7 +8366,7 @@
     <w:p/>
     <w:p>
       <w:r>
-        <w:t>Both bond variants beat UPRO buy-and-hold on terminal wealth: TLT ($11.1M) and TMF ($12.1M) versus B&amp;H's $10.2M. But TLT is the standout on risk-adjusted metrics. It achieves the highest Sharpe ratio in the entire analysis (0.92) with a manageable -55.3% max drawdown. The Sortino ratio (1.17) is also the best, reflecting particularly good downside risk management. TMF generates even more terminal wealth ($12.1M) but at -76.7% max drawdown -- essentially giving back the entire drawdown advantage that makes the timing strategy worthwhile.</w:t>
+        <w:t>Both bond variants beat UPRO buy-and-hold on terminal wealth: TLT ($11.1M) and TMF ($12.1M) versus B&amp;H's $10.2M. But TLT is the standout on risk-adjusted metrics. It achieves the highest Sharpe ratio in the entire analysis (0.89) with a manageable -55.3% max drawdown. The Sortino ratio (1.13) is also the best, reflecting particularly good downside risk management. TMF generates even more terminal wealth ($12.1M) but at -76.7% max drawdown -- essentially giving back the entire drawdown advantage that makes the timing strategy worthwhile.</w:t>
       </w:r>
     </w:p>
     <w:p>
@@ -9917,7 +9926,7 @@
         <w:t>Cash vehicle.</w:t>
       </w:r>
       <w:r>
-        <w:t xml:space="preserve"> The baseline backtest uses T-bill rates during cash periods. The TLT variant -- buying long-term Treasuries during cooling periods -- produced the highest Sharpe ratio (0.92) and actually beat buy-and-hold on terminal wealth. See the "What to Do With Idle Cash" section for the full comparison.</w:t>
+        <w:t xml:space="preserve"> The baseline backtest uses T-bill rates during cash periods. The TLT variant -- buying long-term Treasuries during cooling periods -- produced the highest Sharpe ratio (0.89) and actually beat buy-and-hold on terminal wealth. See the "What to Do With Idle Cash" section for the full comparison.</w:t>
       </w:r>
     </w:p>
     <w:p>
@@ -10061,7 +10070,7 @@
         <w:t>In-sample testing, partially mitigated.</w:t>
       </w:r>
       <w:r>
-        <w:t xml:space="preserve"> I selected DD25%/Cool40 as the "winner" because it performed best on the 2009-2026 data. The parameters were not determined independently of the test data. However, the parameter heatmap shows a broad plateau of strong performance across DD20-30%/Cool20-40, and walk-forward validation confirms the strategy works out-of-sample (0.81 Sharpe on 2017-2026 data using parameters chosen from 2009-2016). The edge may shrink but is unlikely to vanish.</w:t>
+        <w:t xml:space="preserve"> I selected DD25%/Cool40 as the "winner" because it performed best on the 2009-2026 data. The parameters were not determined independently of the test data. However, the parameter heatmap shows a broad plateau of strong performance across DD20-30%/Cool20-40, and walk-forward validation confirms the strategy works out-of-sample (0.76 Sharpe on 2017-2026 data using parameters chosen from 2009-2016). The edge may shrink but is unlikely to vanish.</w:t>
       </w:r>
     </w:p>
     <w:p>
@@ -10800,12 +10809,12 @@
     </w:p>
     <w:p>
       <w:r>
-        <w:t>Simple drawdown-triggered exits can meaningfully improve UPRO's risk profile without exotic indicators, frequent trading, or complex portfolio construction. The DD25%/Cool40 rule -- exit at a 25% drawdown, wait 40 trading days before re-entering -- delivered a 0.90 Sharpe ratio while cutting the maximum drawdown from -77% to -42%.</w:t>
+        <w:t>Simple drawdown-triggered exits can meaningfully improve UPRO's risk profile without exotic indicators, frequent trading, or complex portfolio construction. The DD25%/Cool40 rule -- exit at a 25% drawdown, wait 40 trading days before re-entering -- delivered a 0.86 Sharpe ratio while cutting the maximum drawdown from -77% to -42%.</w:t>
       </w:r>
     </w:p>
     <w:p>
       <w:r>
-        <w:t>Parking idle cash in TLT during cooling periods pushes the result further: a 0.92 Sharpe ratio, $11.1M terminal wealth (beating buy-and-hold's $10.2M), and a -55% max drawdown. The TLT variant exploits the flight-to-quality effect -- when stocks crash, long-term Treasuries tend to rally -- turning the cooling period from dead time into a productive hedge.</w:t>
+        <w:t>Parking idle cash in TLT during cooling periods pushes the result further: a 0.89 Sharpe ratio, $11.1M terminal wealth (beating buy-and-hold's $10.2M), and a -55% max drawdown. The TLT variant exploits the flight-to-quality effect -- when stocks crash, long-term Treasuries tend to rally -- turning the cooling period from dead time into a productive hedge.</w:t>
       </w:r>
     </w:p>
     <w:p>

</xml_diff>

<commit_message>
Fix walk-forward state carry-over, remove 80-delta section, editorial improvements
- Walk-forward test now runs best params on full dataset and splits at
  boundary, so position/ATH/cooling state carries over naturally
- Remove cagr_while_invested metric (cagr/pct_invested is not meaningful)
- Make chart_drawdowns title dynamic instead of hard-coded
- Delete 80-delta options comparison section from article (bolted on)
- Soften DD25/Cool40 framing: present as representative of competitive
  parameter family, not uniquely optimal
- Strengthen post-2009 regime caveat throughout
- Tighten forward-looking language (confirms → suggests, etc.)

Co-Authored-By: Claude Opus 4.6 <noreply@anthropic.com>
</commit_message>
<xml_diff>
--- a/UPRO_Timing_Strategies_Article.docx
+++ b/UPRO_Timing_Strategies_Article.docx
@@ -40,7 +40,7 @@
         <w:pStyle w:val="ListBullet"/>
       </w:pPr>
       <w:r>
-        <w:t>The best risk-adjusted strategy -- a simple drawdown exit with a cooling period -- delivered a 0.86 Sharpe ratio (vs 0.78 for UPRO buy-and-hold and 0.85 for plain SPY) and cut the maximum drawdown from -77% to -42%, at the cost of about 12% less terminal wealth. Robustness testing (walk-forward validation, parameter heatmaps, and a synthetic pre-2009 stress test) confirms the result is not a fragile optimum.</w:t>
+        <w:t>The best risk-adjusted strategy -- a simple drawdown exit with a cooling period -- delivered a 0.86 Sharpe ratio (vs 0.78 for UPRO buy-and-hold and 0.85 for plain SPY) and cut the maximum drawdown from -77% to -42%, at the cost of about 12% less terminal wealth. Robustness testing (walk-forward validation, parameter heatmaps, and a synthetic pre-2009 stress test) suggests the result is not a fragile optimum.</w:t>
       </w:r>
     </w:p>
     <w:p>
@@ -1050,7 +1050,25 @@
     </w:p>
     <w:p>
       <w:r>
-        <w:t>But an important caveat: this test period is overwhelmingly bullish. UPRO's inception happened to coincide with the beginning of the longest bull market in American history. Every timing strategy that says "hold UPRO most of the time" will look great in a period that is almost entirely up. There is no actual UPRO data for 2000-2009, which would have been devastating. (I address this with a synthetic backtest in the robustness section below.)</w:t>
+        <w:t xml:space="preserve">But an important caveat that deserves emphasis: this entire test period is overwhelmingly bullish. UPRO's inception happened to coincide with the beginning of the longest bull market in American history. Every timing strategy that says "hold UPRO most of the time" will look great in a period that is almost entirely up. There is no actual UPRO data for 2000-2009, which would have been devastating. The 2009-2026 period includes drawdowns, but they were all followed by sharp recoveries -- a pattern that may not repeat. Results from this period should be treated as evidence of what </w:t>
+      </w:r>
+      <w:r>
+        <w:rPr>
+          <w:i/>
+        </w:rPr>
+        <w:t>has</w:t>
+      </w:r>
+      <w:r>
+        <w:t xml:space="preserve"> worked, not a guarantee of what </w:t>
+      </w:r>
+      <w:r>
+        <w:rPr>
+          <w:i/>
+        </w:rPr>
+        <w:t>will</w:t>
+      </w:r>
+      <w:r>
+        <w:t xml:space="preserve"> work. (I address the pre-2009 gap with a synthetic backtest in the robustness section below.)</w:t>
       </w:r>
     </w:p>
     <w:p>
@@ -2832,12 +2850,12 @@
         <w:pStyle w:val="Heading2"/>
       </w:pPr>
       <w:r>
-        <w:t>Drawdown-Triggered Exit -- The Winner</w:t>
+        <w:t>Drawdown-Triggered Exit -- The Best Risk-Adjusted Performer</w:t>
       </w:r>
     </w:p>
     <w:p>
       <w:r>
-        <w:t>This is the simplest concept and it produced the best risk-adjusted results. The rule: when UPRO falls X% from its all-time high, sell everything and move to cash (earning T-bill rates). Wait at least Y trading days (the "cooling period") before re-entering. Re-enter when UPRO makes a new all-time high or the cooling period expires.</w:t>
+        <w:t>This is the simplest concept and it produced the strongest risk-adjusted results in this backtest. The rule: when UPRO falls X% from its all-time high, sell everything and move to cash (earning T-bill rates). Wait at least Y trading days (the "cooling period") before re-entering. Re-enter when UPRO makes a new all-time high or the cooling period expires.</w:t>
       </w:r>
     </w:p>
     <w:p>
@@ -4415,7 +4433,7 @@
         <w:t>DD25%/Cool40</w:t>
       </w:r>
       <w:r>
-        <w:t>: exit when UPRO drops 25% from its peak, wait at least 40 trading days (~2 months) before re-entering.</w:t>
+        <w:t>: exit when UPRO drops 25% from its peak, wait at least 40 trading days (~2 months) before re-entering. But it's worth noting that DD25%/Cool40 is representative of a family of competitive parameters -- the heatmap below shows that DD20-25%/Cool20-40 all produce Sharpe ratios above 0.75. The specific "best" parameters would shift with a different test period. I use DD25%/Cool40 throughout as a concrete example, not as a claim that these exact numbers are uniquely optimal.</w:t>
       </w:r>
     </w:p>
     <w:p>
@@ -4434,7 +4452,7 @@
         <w:t>35 percentage points better</w:t>
       </w:r>
       <w:r>
-        <w:t xml:space="preserve"> (-41.8% vs -76.8%). The Sharpe ratio improves from 0.78 to 0.86. 31 trade signals over 16+ years -- roughly one exit/re-entry cycle per year. You're invested 86% of the time.</w:t>
+        <w:t xml:space="preserve"> (-41.8% vs -76.8%). The Sharpe ratio improved from 0.78 to 0.86 over this test period. 31 trade signals over 16+ years -- roughly one exit/re-entry cycle per year. You're invested 86% of the time.</w:t>
       </w:r>
     </w:p>
     <w:p>
@@ -5353,7 +5371,7 @@
     <w:p/>
     <w:p>
       <w:r>
-        <w:t>The risk/return scatter tells the story. DD25%/Cool40 sits in the sweet spot: it preserves 88% of buy-and-hold's terminal value while cutting the maximum drawdown nearly in half. It's the best risk-adjusted performer in the analysis.</w:t>
+        <w:t>The risk/return scatter tells the story. DD25%/Cool40 sits in the sweet spot: it preserved 88% of buy-and-hold's terminal value while cutting the maximum drawdown nearly in half over this test period. It was the best risk-adjusted performer in the analysis -- though, as noted above, nearby parameter combinations produced similar results.</w:t>
       </w:r>
     </w:p>
     <w:p>
@@ -5411,7 +5429,7 @@
     </w:p>
     <w:p>
       <w:r>
-        <w:t>The DD25%/Cool40 result is impressive, but skepticism is warranted. I selected these parameters because they looked best on 2009-2026 data. Here's how I stress-tested the finding.</w:t>
+        <w:t>The DD25%/Cool40 result is impressive, but skepticism is warranted. These parameters were selected because they produced the best risk-adjusted results on 2009-2026 data -- a period dominated by a secular bull market with sharp but temporary drawdowns. The strategy's historical outperformance is real, but whether it will persist in future regimes (prolonged stagflation, a multi-year bear market, or a fundamentally different rate environment) is unknowable. Here's how I stress-tested the finding.</w:t>
       </w:r>
     </w:p>
     <w:p>
@@ -6919,7 +6937,7 @@
     </w:p>
     <w:p>
       <w:r>
-        <w:t>This is a well-known trend-following approach. SPY's 200-day moving average is one of the most widely tracked technical indicators in finance. I also tested a variant inspired by the 80-delta options strategy: exit when SPY falls 2% below the SMA200 (providing a buffer to reduce whipsaws), and re-enter when it crosses back above.</w:t>
+        <w:t>This is a well-known trend-following approach. SPY's 200-day moving average is one of the most widely tracked technical indicators in finance. I also tested a buffered variant: exit when SPY falls 2% below the SMA200 (providing a buffer to reduce whipsaws), and re-enter when it crosses back above.</w:t>
       </w:r>
     </w:p>
     <w:tbl>
@@ -7640,7 +7658,7 @@
     <w:p/>
     <w:p>
       <w:r>
-        <w:t xml:space="preserve">None of the pure SMA filters come close to DD25%/Cool40 on any metric. SMA100 is the best of the group -- a 22.0% CAGR with a 0.73 Sharpe and -46.0% max drawdown -- but it still trails the drawdown exit by 9 percentage points of CAGR with a worse Sharpe and worse max drawdown. SMA50 whipsaws excessively (282 trades over 16 years) and bleeds returns through false signals. The 2% buffer variant, which mimics the 80-delta strategy's SMA exit rule, actually makes things </w:t>
+        <w:t xml:space="preserve">None of the pure SMA filters come close to DD25%/Cool40 on any metric. SMA100 is the best of the group -- a 22.0% CAGR with a 0.73 Sharpe and -46.0% max drawdown -- but it still trails the drawdown exit by 9 percentage points of CAGR with a worse Sharpe and worse max drawdown. SMA50 whipsaws excessively (282 trades over 16 years) and bleeds returns through false signals. The 2% buffer variant actually makes things </w:t>
       </w:r>
       <w:r>
         <w:rPr>
@@ -10131,685 +10149,12 @@
         <w:pStyle w:val="Heading1"/>
       </w:pPr>
       <w:r>
-        <w:t>How Does This Compare to Options-Based Leverage?</w:t>
-      </w:r>
-    </w:p>
-    <w:p>
-      <w:r>
-        <w:t>Not every investor can or wants to hold leveraged ETFs. Some IRA custodians restrict them, and many investors are uncomfortable with a product that resets leverage daily and is subject to volatility decay. An alternative approach to leveraged equity exposure is buying deep in-the-money (80-delta) SPY call options, which provide roughly 1.5-2x leverage through embedded leverage in the option premium. When combined with an SMA200 trend filter — buy only when SPY is above its 200-day moving average — the options approach avoids bear market exposure entirely by sitting in cash below the moving average.</w:t>
-      </w:r>
-    </w:p>
-    <w:p>
-      <w:r>
-        <w:t>Over the same 2015-2026 period with actual market data, the 80-delta options-only strategy produced a +24.7% CAGR (0.85 Sharpe, -39.1% max drawdown) compared to UPRO DD25/Cool40's +25.2% CAGR (0.79 Sharpe, -41.8% max drawdown). The returns are nearly identical, and the options approach actually edges ahead on risk-adjusted metrics. But the operational difference is enormous: 1,233 option trades over 11 years versus ~15 round-trips for the drawdown exit.</w:t>
-      </w:r>
-    </w:p>
-    <w:p>
-      <w:pPr>
-        <w:pStyle w:val="Heading2"/>
-      </w:pPr>
-      <w:r>
-        <w:t>Stratifying Returns by Market Regime</w:t>
-      </w:r>
-    </w:p>
-    <w:p>
-      <w:r>
-        <w:t xml:space="preserve">To understand </w:t>
-      </w:r>
-      <w:r>
-        <w:rPr>
-          <w:i/>
-        </w:rPr>
-        <w:t>how</w:t>
-      </w:r>
-      <w:r>
-        <w:t xml:space="preserve"> these strategies differ — not just in aggregate, but across different market environments — I bucketed all 201 months from 2009-2026 by SPY's monthly return and computed average returns for each strategy within each bucket. The regime-level summary:</w:t>
-      </w:r>
-    </w:p>
-    <w:tbl>
-      <w:tblPr>
-        <w:tblStyle w:val="LightGrid-Accent1"/>
-        <w:tblW w:type="auto" w:w="0"/>
-        <w:jc w:val="center"/>
-        <w:tblLook w:firstColumn="1" w:firstRow="1" w:lastColumn="0" w:lastRow="0" w:noHBand="0" w:noVBand="1" w:val="04A0"/>
-      </w:tblPr>
-      <w:tblGrid>
-        <w:gridCol w:w="1464"/>
-        <w:gridCol w:w="1464"/>
-        <w:gridCol w:w="1464"/>
-        <w:gridCol w:w="1464"/>
-        <w:gridCol w:w="1464"/>
-        <w:gridCol w:w="1464"/>
-      </w:tblGrid>
-      <w:tr>
-        <w:tc>
-          <w:tcPr>
-            <w:tcW w:type="dxa" w:w="1464"/>
-          </w:tcPr>
-          <w:p>
-            <w:pPr>
-              <w:jc w:val="center"/>
-            </w:pPr>
-            <w:r>
-              <w:rPr>
-                <w:b/>
-                <w:sz w:val="18"/>
-              </w:rPr>
-              <w:t>Regime</w:t>
-            </w:r>
-          </w:p>
-        </w:tc>
-        <w:tc>
-          <w:tcPr>
-            <w:tcW w:type="dxa" w:w="1464"/>
-          </w:tcPr>
-          <w:p>
-            <w:pPr>
-              <w:jc w:val="center"/>
-            </w:pPr>
-            <w:r>
-              <w:rPr>
-                <w:b/>
-                <w:sz w:val="18"/>
-              </w:rPr>
-              <w:t>Count</w:t>
-            </w:r>
-          </w:p>
-        </w:tc>
-        <w:tc>
-          <w:tcPr>
-            <w:tcW w:type="dxa" w:w="1464"/>
-          </w:tcPr>
-          <w:p>
-            <w:pPr>
-              <w:jc w:val="center"/>
-            </w:pPr>
-            <w:r>
-              <w:rPr>
-                <w:b/>
-                <w:sz w:val="18"/>
-              </w:rPr>
-              <w:t>SPY Avg</w:t>
-            </w:r>
-          </w:p>
-        </w:tc>
-        <w:tc>
-          <w:tcPr>
-            <w:tcW w:type="dxa" w:w="1464"/>
-          </w:tcPr>
-          <w:p>
-            <w:pPr>
-              <w:jc w:val="center"/>
-            </w:pPr>
-            <w:r>
-              <w:rPr>
-                <w:b/>
-                <w:sz w:val="18"/>
-              </w:rPr>
-              <w:t>UPRO B&amp;H</w:t>
-            </w:r>
-          </w:p>
-        </w:tc>
-        <w:tc>
-          <w:tcPr>
-            <w:tcW w:type="dxa" w:w="1464"/>
-          </w:tcPr>
-          <w:p>
-            <w:pPr>
-              <w:jc w:val="center"/>
-            </w:pPr>
-            <w:r>
-              <w:rPr>
-                <w:b/>
-                <w:sz w:val="18"/>
-              </w:rPr>
-              <w:t>UPRO DD25</w:t>
-            </w:r>
-          </w:p>
-        </w:tc>
-        <w:tc>
-          <w:tcPr>
-            <w:tcW w:type="dxa" w:w="1464"/>
-          </w:tcPr>
-          <w:p>
-            <w:pPr>
-              <w:jc w:val="center"/>
-            </w:pPr>
-            <w:r>
-              <w:rPr>
-                <w:b/>
-                <w:sz w:val="18"/>
-              </w:rPr>
-              <w:t>80D Opts</w:t>
-            </w:r>
-          </w:p>
-        </w:tc>
-      </w:tr>
-      <w:tr>
-        <w:tc>
-          <w:tcPr>
-            <w:tcW w:type="dxa" w:w="1464"/>
-          </w:tcPr>
-          <w:p>
-            <w:pPr>
-              <w:jc w:val="left"/>
-            </w:pPr>
-            <w:r>
-              <w:rPr>
-                <w:sz w:val="18"/>
-              </w:rPr>
-              <w:t>Bear (SPY &lt; -2%)</w:t>
-            </w:r>
-          </w:p>
-        </w:tc>
-        <w:tc>
-          <w:tcPr>
-            <w:tcW w:type="dxa" w:w="1464"/>
-          </w:tcPr>
-          <w:p>
-            <w:pPr>
-              <w:jc w:val="center"/>
-            </w:pPr>
-            <w:r>
-              <w:rPr>
-                <w:sz w:val="18"/>
-              </w:rPr>
-              <w:t>39</w:t>
-            </w:r>
-          </w:p>
-        </w:tc>
-        <w:tc>
-          <w:tcPr>
-            <w:tcW w:type="dxa" w:w="1464"/>
-          </w:tcPr>
-          <w:p>
-            <w:pPr>
-              <w:jc w:val="center"/>
-            </w:pPr>
-            <w:r>
-              <w:rPr>
-                <w:sz w:val="18"/>
-              </w:rPr>
-              <w:t>-5.2%</w:t>
-            </w:r>
-          </w:p>
-        </w:tc>
-        <w:tc>
-          <w:tcPr>
-            <w:tcW w:type="dxa" w:w="1464"/>
-          </w:tcPr>
-          <w:p>
-            <w:pPr>
-              <w:jc w:val="center"/>
-            </w:pPr>
-            <w:r>
-              <w:rPr>
-                <w:sz w:val="18"/>
-              </w:rPr>
-              <w:t>-16.2%</w:t>
-            </w:r>
-          </w:p>
-        </w:tc>
-        <w:tc>
-          <w:tcPr>
-            <w:tcW w:type="dxa" w:w="1464"/>
-          </w:tcPr>
-          <w:p>
-            <w:pPr>
-              <w:jc w:val="center"/>
-            </w:pPr>
-            <w:r>
-              <w:rPr>
-                <w:sz w:val="18"/>
-              </w:rPr>
-              <w:t>-12.3%</w:t>
-            </w:r>
-          </w:p>
-        </w:tc>
-        <w:tc>
-          <w:tcPr>
-            <w:tcW w:type="dxa" w:w="1464"/>
-          </w:tcPr>
-          <w:p>
-            <w:pPr>
-              <w:jc w:val="center"/>
-            </w:pPr>
-            <w:r>
-              <w:rPr>
-                <w:sz w:val="18"/>
-              </w:rPr>
-              <w:t>-5.6%</w:t>
-            </w:r>
-          </w:p>
-        </w:tc>
-      </w:tr>
-      <w:tr>
-        <w:tc>
-          <w:tcPr>
-            <w:tcW w:type="dxa" w:w="1464"/>
-          </w:tcPr>
-          <w:p>
-            <w:pPr>
-              <w:jc w:val="left"/>
-            </w:pPr>
-            <w:r>
-              <w:rPr>
-                <w:sz w:val="18"/>
-              </w:rPr>
-              <w:t>Flat (-2% to +2%)</w:t>
-            </w:r>
-          </w:p>
-        </w:tc>
-        <w:tc>
-          <w:tcPr>
-            <w:tcW w:type="dxa" w:w="1464"/>
-          </w:tcPr>
-          <w:p>
-            <w:pPr>
-              <w:jc w:val="center"/>
-            </w:pPr>
-            <w:r>
-              <w:rPr>
-                <w:sz w:val="18"/>
-              </w:rPr>
-              <w:t>71</w:t>
-            </w:r>
-          </w:p>
-        </w:tc>
-        <w:tc>
-          <w:tcPr>
-            <w:tcW w:type="dxa" w:w="1464"/>
-          </w:tcPr>
-          <w:p>
-            <w:pPr>
-              <w:jc w:val="center"/>
-            </w:pPr>
-            <w:r>
-              <w:rPr>
-                <w:sz w:val="18"/>
-              </w:rPr>
-              <w:t>+0.3%</w:t>
-            </w:r>
-          </w:p>
-        </w:tc>
-        <w:tc>
-          <w:tcPr>
-            <w:tcW w:type="dxa" w:w="1464"/>
-          </w:tcPr>
-          <w:p>
-            <w:pPr>
-              <w:jc w:val="center"/>
-            </w:pPr>
-            <w:r>
-              <w:rPr>
-                <w:sz w:val="18"/>
-              </w:rPr>
-              <w:t>+0.2%</w:t>
-            </w:r>
-          </w:p>
-        </w:tc>
-        <w:tc>
-          <w:tcPr>
-            <w:tcW w:type="dxa" w:w="1464"/>
-          </w:tcPr>
-          <w:p>
-            <w:pPr>
-              <w:jc w:val="center"/>
-            </w:pPr>
-            <w:r>
-              <w:rPr>
-                <w:sz w:val="18"/>
-              </w:rPr>
-              <w:t>+0.4%</w:t>
-            </w:r>
-          </w:p>
-        </w:tc>
-        <w:tc>
-          <w:tcPr>
-            <w:tcW w:type="dxa" w:w="1464"/>
-          </w:tcPr>
-          <w:p>
-            <w:pPr>
-              <w:jc w:val="center"/>
-            </w:pPr>
-            <w:r>
-              <w:rPr>
-                <w:sz w:val="18"/>
-              </w:rPr>
-              <w:t>+0.1%</w:t>
-            </w:r>
-          </w:p>
-        </w:tc>
-      </w:tr>
-      <w:tr>
-        <w:tc>
-          <w:tcPr>
-            <w:tcW w:type="dxa" w:w="1464"/>
-          </w:tcPr>
-          <w:p>
-            <w:pPr>
-              <w:jc w:val="left"/>
-            </w:pPr>
-            <w:r>
-              <w:rPr>
-                <w:sz w:val="18"/>
-              </w:rPr>
-              <w:t>Bull (SPY &gt;= +2%)</w:t>
-            </w:r>
-          </w:p>
-        </w:tc>
-        <w:tc>
-          <w:tcPr>
-            <w:tcW w:type="dxa" w:w="1464"/>
-          </w:tcPr>
-          <w:p>
-            <w:pPr>
-              <w:jc w:val="center"/>
-            </w:pPr>
-            <w:r>
-              <w:rPr>
-                <w:sz w:val="18"/>
-              </w:rPr>
-              <w:t>91</w:t>
-            </w:r>
-          </w:p>
-        </w:tc>
-        <w:tc>
-          <w:tcPr>
-            <w:tcW w:type="dxa" w:w="1464"/>
-          </w:tcPr>
-          <w:p>
-            <w:pPr>
-              <w:jc w:val="center"/>
-            </w:pPr>
-            <w:r>
-              <w:rPr>
-                <w:sz w:val="18"/>
-              </w:rPr>
-              <w:t>+4.5%</w:t>
-            </w:r>
-          </w:p>
-        </w:tc>
-        <w:tc>
-          <w:tcPr>
-            <w:tcW w:type="dxa" w:w="1464"/>
-          </w:tcPr>
-          <w:p>
-            <w:pPr>
-              <w:jc w:val="center"/>
-            </w:pPr>
-            <w:r>
-              <w:rPr>
-                <w:sz w:val="18"/>
-              </w:rPr>
-              <w:t>+13.1%</w:t>
-            </w:r>
-          </w:p>
-        </w:tc>
-        <w:tc>
-          <w:tcPr>
-            <w:tcW w:type="dxa" w:w="1464"/>
-          </w:tcPr>
-          <w:p>
-            <w:pPr>
-              <w:jc w:val="center"/>
-            </w:pPr>
-            <w:r>
-              <w:rPr>
-                <w:sz w:val="18"/>
-              </w:rPr>
-              <w:t>+10.5%</w:t>
-            </w:r>
-          </w:p>
-        </w:tc>
-        <w:tc>
-          <w:tcPr>
-            <w:tcW w:type="dxa" w:w="1464"/>
-          </w:tcPr>
-          <w:p>
-            <w:pPr>
-              <w:jc w:val="center"/>
-            </w:pPr>
-            <w:r>
-              <w:rPr>
-                <w:sz w:val="18"/>
-              </w:rPr>
-              <w:t>+5.2%</w:t>
-            </w:r>
-          </w:p>
-        </w:tc>
-      </w:tr>
-    </w:tbl>
-    <w:p/>
-    <w:p>
-      <w:r>
-        <w:t>The full bucket-by-bucket breakdown reveals how each strategy's leverage ratio shifts across the return distribution:</w:t>
-      </w:r>
-    </w:p>
-    <w:p>
-      <w:pPr>
-        <w:jc w:val="center"/>
-      </w:pPr>
-      <w:r>
-        <w:drawing>
-          <wp:inline xmlns:a="http://schemas.openxmlformats.org/drawingml/2006/main" xmlns:pic="http://schemas.openxmlformats.org/drawingml/2006/picture">
-            <wp:extent cx="5486400" cy="2324813"/>
-            <wp:docPr id="11" name="Picture 11"/>
-            <wp:cNvGraphicFramePr>
-              <a:graphicFrameLocks noChangeAspect="1"/>
-            </wp:cNvGraphicFramePr>
-            <a:graphic>
-              <a:graphicData uri="http://schemas.openxmlformats.org/drawingml/2006/picture">
-                <pic:pic>
-                  <pic:nvPicPr>
-                    <pic:cNvPr id="0" name="10_stratification_returns.png"/>
-                    <pic:cNvPicPr/>
-                  </pic:nvPicPr>
-                  <pic:blipFill>
-                    <a:blip r:embed="rId19"/>
-                    <a:stretch>
-                      <a:fillRect/>
-                    </a:stretch>
-                  </pic:blipFill>
-                  <pic:spPr>
-                    <a:xfrm>
-                      <a:off x="0" y="0"/>
-                      <a:ext cx="5486400" cy="2324813"/>
-                    </a:xfrm>
-                    <a:prstGeom prst="rect"/>
-                  </pic:spPr>
-                </pic:pic>
-              </a:graphicData>
-            </a:graphic>
-          </wp:inline>
-        </w:drawing>
-      </w:r>
-    </w:p>
-    <w:p/>
-    <w:p>
-      <w:pPr>
-        <w:jc w:val="center"/>
-      </w:pPr>
-      <w:r>
-        <w:drawing>
-          <wp:inline xmlns:a="http://schemas.openxmlformats.org/drawingml/2006/main" xmlns:pic="http://schemas.openxmlformats.org/drawingml/2006/picture">
-            <wp:extent cx="5486400" cy="2325649"/>
-            <wp:docPr id="12" name="Picture 12"/>
-            <wp:cNvGraphicFramePr>
-              <a:graphicFrameLocks noChangeAspect="1"/>
-            </wp:cNvGraphicFramePr>
-            <a:graphic>
-              <a:graphicData uri="http://schemas.openxmlformats.org/drawingml/2006/picture">
-                <pic:pic>
-                  <pic:nvPicPr>
-                    <pic:cNvPr id="0" name="11_leverage_ratios.png"/>
-                    <pic:cNvPicPr/>
-                  </pic:nvPicPr>
-                  <pic:blipFill>
-                    <a:blip r:embed="rId20"/>
-                    <a:stretch>
-                      <a:fillRect/>
-                    </a:stretch>
-                  </pic:blipFill>
-                  <pic:spPr>
-                    <a:xfrm>
-                      <a:off x="0" y="0"/>
-                      <a:ext cx="5486400" cy="2325649"/>
-                    </a:xfrm>
-                    <a:prstGeom prst="rect"/>
-                  </pic:spPr>
-                </pic:pic>
-              </a:graphicData>
-            </a:graphic>
-          </wp:inline>
-        </w:drawing>
-      </w:r>
-    </w:p>
-    <w:p/>
-    <w:p>
-      <w:pPr>
-        <w:jc w:val="center"/>
-      </w:pPr>
-      <w:r>
-        <w:drawing>
-          <wp:inline xmlns:a="http://schemas.openxmlformats.org/drawingml/2006/main" xmlns:pic="http://schemas.openxmlformats.org/drawingml/2006/picture">
-            <wp:extent cx="5486400" cy="3255818"/>
-            <wp:docPr id="13" name="Picture 13"/>
-            <wp:cNvGraphicFramePr>
-              <a:graphicFrameLocks noChangeAspect="1"/>
-            </wp:cNvGraphicFramePr>
-            <a:graphic>
-              <a:graphicData uri="http://schemas.openxmlformats.org/drawingml/2006/picture">
-                <pic:pic>
-                  <pic:nvPicPr>
-                    <pic:cNvPr id="0" name="12_regime_summary.png"/>
-                    <pic:cNvPicPr/>
-                  </pic:nvPicPr>
-                  <pic:blipFill>
-                    <a:blip r:embed="rId21"/>
-                    <a:stretch>
-                      <a:fillRect/>
-                    </a:stretch>
-                  </pic:blipFill>
-                  <pic:spPr>
-                    <a:xfrm>
-                      <a:off x="0" y="0"/>
-                      <a:ext cx="5486400" cy="3255818"/>
-                    </a:xfrm>
-                    <a:prstGeom prst="rect"/>
-                  </pic:spPr>
-                </pic:pic>
-              </a:graphicData>
-            </a:graphic>
-          </wp:inline>
-        </w:drawing>
-      </w:r>
-    </w:p>
-    <w:p/>
-    <w:p>
-      <w:pPr>
-        <w:pStyle w:val="Heading2"/>
-      </w:pPr>
-      <w:r>
-        <w:t>What the Data Reveals</w:t>
-      </w:r>
-    </w:p>
-    <w:p>
-      <w:r>
-        <w:t>The stratification data exposes several non-obvious dynamics:</w:t>
-      </w:r>
-    </w:p>
-    <w:p>
-      <w:r>
-        <w:rPr>
-          <w:b/>
-        </w:rPr>
-        <w:t>UPRO delivers ~3x but with asymmetry.</w:t>
-      </w:r>
-      <w:r>
-        <w:t xml:space="preserve"> The average monthly leverage ratio is 3.14x across all buckets, confirming UPRO tracks its daily 3x mandate faithfully at the monthly level. But the ratio isn't constant. In small-loss months (SPY -1% to 0%), the effective leverage spikes to 4.6x because volatility drag amplifies small losses — daily 3x compounding systematically overshoots 3x of the monthly return when daily moves are choppy. In mild up-months (+0% to +1%), the ratio drops to 1.3x for the opposite reason.</w:t>
-      </w:r>
-    </w:p>
-    <w:p>
-      <w:r>
-        <w:rPr>
-          <w:b/>
-        </w:rPr>
-        <w:t>DD25 compresses the tails, but with a mid-month exit trap.</w:t>
-      </w:r>
-      <w:r>
-        <w:t xml:space="preserve"> In the worst months (SPY &lt; -8%), DD25 loses only -13.0% vs UPRO B&amp;H's -31.3% — the exit fired early and moved to cash before the worst of the drawdown. But in moderate-decline months (SPY -5% to -4%), DD25 actually performs </w:t>
-      </w:r>
-      <w:r>
-        <w:rPr>
-          <w:i/>
-        </w:rPr>
-        <w:t>worse</w:t>
-      </w:r>
-      <w:r>
-        <w:t xml:space="preserve"> than UPRO B&amp;H (-16.5% vs -14.1%). This is the mid-month exit trap: the drawdown threshold triggers partway through the month, locking in the loss and moving to cash, then missing the partial recovery that brings SPY's monthly return back to only -5%. The monthly return captures "sold the dip + missed the bounce" in a single number. This doesn't hurt the long-term strategy — it's a one-month accounting artifact — but it explains why DD25's bear-month performance isn't monotonically better as losses deepen.</w:t>
-      </w:r>
-    </w:p>
-    <w:p>
-      <w:r>
-        <w:rPr>
-          <w:b/>
-        </w:rPr>
-        <w:t>DD25 in severe crashes: early exit is the edge.</w:t>
-      </w:r>
-      <w:r>
-        <w:t xml:space="preserve"> In the &lt; -8% SPY bucket, DD25's leverage ratio is only 1.25x vs UPRO's 3.01x. Those months include events like March 2020 where the exit likely fired before the worst of the decline. In the -8% to -7% bucket, DD25's ratio jumps to 1.89x because those moderately bad months may not have pushed UPRO past the -25% threshold, so DD25 was fully exposed.</w:t>
-      </w:r>
-    </w:p>
-    <w:p>
-      <w:r>
-        <w:rPr>
-          <w:b/>
-        </w:rPr>
-        <w:t>80-delta options have a natural floor from the SMA filter but cap gains via exits.</w:t>
-      </w:r>
-      <w:r>
-        <w:t xml:space="preserve"> In the worst months, the options strategy loses only -2.5% (0.24x leverage ratio) because the SMA200 filter has already moved to cash during bear markets. In normal bull months (+2% to +5%), it delivers a consistent 1.5-1.7x leverage. But in extreme up-months (SPY &gt; +7%), returns compress to less than 1x. The profit target (+50%) and max-hold (60-day) exits close positions before the full monthly move plays out, and sharp V-bottom recoveries often start below the SMA, meaning the portfolio wasn't fully deployed at the start of the rally.</w:t>
-      </w:r>
-    </w:p>
-    <w:p>
-      <w:pPr>
-        <w:pStyle w:val="Heading2"/>
-      </w:pPr>
-      <w:r>
-        <w:t>The Simplicity Trade-Off</w:t>
-      </w:r>
-    </w:p>
-    <w:p>
-      <w:r>
-        <w:t>UPRO DD25/Cool40 requires checking one number (the drawdown percentage) once a day. The 80-delta options strategy requires monitoring positions, rolling expirations, managing entries and exits across dozens of concurrent positions, and dealing with the occasional illiquid option chain.</w:t>
-      </w:r>
-    </w:p>
-    <w:p>
-      <w:r>
-        <w:t xml:space="preserve">If you </w:t>
-      </w:r>
-      <w:r>
-        <w:rPr>
-          <w:i/>
-        </w:rPr>
-        <w:t>can</w:t>
-      </w:r>
-      <w:r>
-        <w:t xml:space="preserve"> hold UPRO and have the discipline to follow the DD25/Cool40 rule mechanically, it's the simpler, better choice. The options-based approach is worth considering only if leveraged ETFs are unavailable in your account or if you have the infrastructure and temperament for active options management.</w:t>
-      </w:r>
-    </w:p>
-    <w:p>
-      <w:pPr>
-        <w:pStyle w:val="Heading1"/>
-      </w:pPr>
-      <w:r>
         <w:t>Conclusion</w:t>
       </w:r>
     </w:p>
     <w:p>
       <w:r>
-        <w:t>Simple drawdown-triggered exits can meaningfully improve UPRO's risk profile without exotic indicators, frequent trading, or complex portfolio construction. The DD25%/Cool40 rule -- exit at a 25% drawdown, wait 40 trading days before re-entering -- delivered a 0.86 Sharpe ratio while cutting the maximum drawdown from -77% to -42%.</w:t>
+        <w:t>Over the 2009-2026 test period, simple drawdown-triggered exits meaningfully improved UPRO's risk profile without exotic indicators, frequent trading, or complex portfolio construction. The DD25%/Cool40 rule -- exit at a 25% drawdown, wait 40 trading days before re-entering -- delivered a 0.86 Sharpe ratio while cutting the maximum drawdown from -77% to -42%.</w:t>
       </w:r>
     </w:p>
     <w:p>
@@ -10824,7 +10169,7 @@
     </w:p>
     <w:p>
       <w:r>
-        <w:t>Robustness testing supports both variants. A parameter heatmap shows the DD25%/Cool40 parameters sit in a broad region of strong performance, not on a fragile peak. Walk-forward validation (train 2009-2016, test 2017-2026) confirms the approach works out-of-sample. And a synthetic pre-2009 stress test shows the strategy provides modest benefit even through the worst decade in modern market history.</w:t>
+        <w:t>Robustness testing is encouraging for both variants. A parameter heatmap shows the DD25%/Cool40 parameters sit in a broad region of strong performance, not on a fragile peak. Walk-forward validation (train 2009-2016, test 2017-2026) suggests the approach works out-of-sample. And a synthetic pre-2009 stress test shows the strategy provided modest benefit even through the worst decade in modern market history. That said, these tests still draw from a limited set of market regimes -- a prolonged sideways or inflationary bear market would be the real test.</w:t>
       </w:r>
     </w:p>
     <w:p>

</xml_diff>

<commit_message>
Reviewer round 3: soften thesis, rewrite bootstrap/vol-norm sections, remove sys.path
- Block bootstrap conclusion rewritten more bluntly: Sharpe edge is
  regime-conditional (35% win rate), not a universal improvement
- Vol-normalized section presented as a failed generalization test
- Summary and conclusion updated to reflect honest mixed robustness picture
- Removed hard-coded sys.path to local Windows directory from build_docx.py
- Removed unused sys import

Co-Authored-By: Claude Opus 4.6 <noreply@anthropic.com>
</commit_message>
<xml_diff>
--- a/UPRO_Timing_Strategies_Article.docx
+++ b/UPRO_Timing_Strategies_Article.docx
@@ -40,7 +40,7 @@
         <w:pStyle w:val="ListBullet"/>
       </w:pPr>
       <w:r>
-        <w:t>The best risk-adjusted strategy -- a simple drawdown exit with a cooling period -- delivered a 0.86 Sharpe ratio (vs 0.78 for UPRO buy-and-hold and 0.85 for plain SPY) and cut the maximum drawdown from -77% to -42%, at the cost of about 12% less terminal wealth. Robustness testing (walk-forward validation, parameter heatmaps, and a synthetic pre-2009 stress test) suggests the result is not a fragile optimum.</w:t>
+        <w:t>The best risk-adjusted strategy -- a simple drawdown exit with a cooling period -- delivered a 0.86 Sharpe ratio (vs 0.78 for UPRO buy-and-hold and 0.85 for plain SPY) and cut the maximum drawdown from -77% to -42%, at the cost of about 12% less terminal wealth. Walk-forward validation, parameter heatmaps, and a synthetic pre-2009 stress test suggest the parameters are not a fragile optimum, but block-bootstrap analysis shows the Sharpe advantage depends materially on the sequencing of returns -- making this a useful practical overlay for recent-style regimes, not a universal improvement.</w:t>
       </w:r>
     </w:p>
     <w:p>
@@ -5452,7 +5452,7 @@
     </w:p>
     <w:p>
       <w:r>
-        <w:t>The result: DD25%/Cool40's 0.86 Sharpe sits at the peak of a broad green plateau. Adjacent cells DD20-25%/Cool30-40 all produce Sharpe ratios above 0.75. You can shift the threshold by 5 percentage points or the cooling period by 10 days in either direction and still get strong risk-adjusted performance. This is not a fragile optimum -- it's a robust region.</w:t>
+        <w:t>The result: DD25%/Cool40's 0.86 Sharpe sits at the peak of a broad green plateau. Adjacent cells DD20-25%/Cool30-40 all produce Sharpe ratios above 0.75. You can shift the threshold by 5 percentage points or the cooling period by 10 days in either direction and still get strong risk-adjusted performance. This is not a fragile optimum -- it's a broad plateau of strong performance within this test period.</w:t>
       </w:r>
     </w:p>
     <w:p>
@@ -8867,12 +8867,17 @@
     </w:p>
     <w:p>
       <w:r>
-        <w:t>The result: the drawdown exit strategy produced a higher Sharpe ratio than buy-and-hold in 35% of simulated paths, with a median Sharpe improvement of -0.05. This is a genuinely important finding. It means the strategy's Sharpe advantage over buy-and-hold is partly path-dependent -- it benefits from the specific sequencing of bull runs followed by sharp crashes that characterized 2009-2026. In randomly reordered histories, the advantage often disappears.</w:t>
+        <w:t>The result: the drawdown exit strategy produced a higher Sharpe ratio than buy-and-hold in only 35% of simulated paths, with a median Sharpe improvement of -0.05. This is the most important finding in the entire analysis. It means the strategy's Sharpe advantage over buy-and-hold is not a general property of the return distribution -- it is regime-conditional, dependent on the specific sequencing of bull runs followed by sharp crashes that characterized 2009-2026. In randomly reordered histories, the advantage usually disappears.</w:t>
       </w:r>
     </w:p>
     <w:p>
       <w:r>
-        <w:t xml:space="preserve">However, this does not invalidate the strategy. The block bootstrap tests a counterfactual: "what if the same returns occurred in a different order?" But real markets </w:t>
+        <w:t>This is an approximate regime test, not a precise replication of the production backtest -- the bootstrap uses a simplified close-only model and average risk-free carry rather than date-specific rates. But the directional conclusion is clear: the Sharpe edge is materially path-dependent.</w:t>
+      </w:r>
+    </w:p>
+    <w:p>
+      <w:r>
+        <w:t xml:space="preserve">That does not mean the strategy is useless. Real markets </w:t>
       </w:r>
       <w:r>
         <w:rPr>
@@ -8881,12 +8886,7 @@
         <w:t>do</w:t>
       </w:r>
       <w:r>
-        <w:t xml:space="preserve"> exhibit the clustering, momentum, and mean-reversion patterns that the blocks preserve internally. The strategy is designed to exploit those patterns, and the fact that it doesn't outperform in randomly shuffled histories is expected -- it would be surprising if it did.</w:t>
-      </w:r>
-    </w:p>
-    <w:p>
-      <w:r>
-        <w:t>The practical takeaway: the drawdown exit is most useful in regimes that resemble recent history (trending markets with occasional sharp corrections). In a market with fundamentally different dynamics -- extended sideways chop, for example -- the edge may shrink.</w:t>
+        <w:t xml:space="preserve"> exhibit the volatility clustering, momentum, and mean-reversion patterns that the drawdown rule responds to. The exit diagnostic table above confirms that the 25% trigger identifies genuine stress episodes in actual market history. But the honest conclusion is that the strategy is a useful practical overlay for regimes resembling recent history -- trending markets with occasional sharp corrections -- not evidence of a regime-invariant alpha source. In a market with fundamentally different dynamics (extended sideways chop, a multi-year grinding bear), the edge may shrink or disappear entirely.</w:t>
       </w:r>
     </w:p>
     <w:p>
@@ -8939,7 +8939,7 @@
     </w:p>
     <w:p>
       <w:r>
-        <w:t>A related concern: is the 25% threshold simply tuned to UPRO's specific volatility during this period? To test this, I implemented a volatility-normalized version: exit when the drawdown exceeds k times UPRO's 20-day realized volatility.</w:t>
+        <w:t>A natural question: if the 25% threshold works because it detects volatility regimes, shouldn't a volatility-normalized version work even better? To test this, I implemented a generalized version: exit when the drawdown exceeds k times UPRO's 20-day realized volatility.</w:t>
       </w:r>
     </w:p>
     <w:tbl>
@@ -9561,7 +9561,7 @@
     <w:p/>
     <w:p>
       <w:r>
-        <w:t>The volatility-normalized variants all underperform the fixed 25% rule. The best (k=7) achieves a 0.72 Sharpe with far more trades. The fixed threshold's advantage appears to come from its simplicity: a constant 25% threshold produces fewer false signals during calm periods (when rolling volatility is low and the normalized threshold would be too tight) and remains effective during crises (when volatility spikes and the normalized threshold would be too loose). The "right" threshold may not need to adapt to volatility because the 3x leverage already provides a natural volatility scaling.</w:t>
+        <w:t>The volatility-normalized variants all underperform the fixed 25% rule. The best (k=7) achieves a 0.72 Sharpe with far more trades. This is a failed generalization test: the theoretically "smarter" adaptive threshold does not improve on the simple fixed rule over this period. The likely explanation is practical rather than deep -- a constant threshold produces fewer false signals during calm periods (when rolling volatility is low and the normalized threshold would be too tight) and remains effective during crises (when volatility spikes and the normalized threshold would be too loose). The result increases confidence that 25% is a practically useful threshold for UPRO, but it does not demonstrate that the number has any structural optimality beyond being well-matched to UPRO's realized volatility during 2009-2026.</w:t>
       </w:r>
     </w:p>
     <w:p>
@@ -12013,7 +12013,7 @@
     </w:p>
     <w:p>
       <w:r>
-        <w:t>Robustness testing is encouraging for both variants. A parameter heatmap shows the DD25%/Cool40 parameters sit in a broad region of strong performance, not on a fragile peak. Walk-forward validation (train 2009-2016, test 2017-2026) suggests the approach works out-of-sample. And a synthetic pre-2009 stress test shows the strategy provided modest benefit even through the worst decade in modern market history. That said, these tests still draw from a limited set of market regimes -- a prolonged sideways or inflationary bear market would be the real test.</w:t>
+        <w:t>Robustness testing paints a mixed but honest picture. On the encouraging side: the DD25%/Cool40 parameters sit in a broad plateau of strong performance (not a fragile peak), walk-forward validation suggests the approach works out-of-sample, and exit diagnostics confirm the 25% trigger identifies genuine SPY stress episodes. On the cautionary side: block-bootstrap analysis shows the strategy beats buy-and-hold on Sharpe in only 35% of randomly reordered return histories, meaning the Sharpe advantage is regime-conditional -- it depends on the specific pattern of bull runs followed by sharp corrections that characterized 2009-2026. The strategy is a useful practical overlay for regimes resembling recent history, not evidence of a regime-invariant alpha source.</w:t>
       </w:r>
     </w:p>
     <w:p>

</xml_diff>

<commit_message>
Rebuild docx, charts, and CSVs to match article fixes
Regenerated all outputs from build_docx.py so the Word document,
charts, and strategy_results.csv reflect the 3 corrected claims.

Co-Authored-By: Claude Opus 4.6 <noreply@anthropic.com>
</commit_message>
<xml_diff>
--- a/UPRO_Timing_Strategies_Article.docx
+++ b/UPRO_Timing_Strategies_Article.docx
@@ -24,7 +24,7 @@
         <w:pStyle w:val="ListBullet"/>
       </w:pPr>
       <w:r>
-        <w:t>The S&amp;P 500 has compounded at roughly 10% per year (with dividends) since 1950, turning $10,000 into over $4 million. Leveraged ETFs like SSO (2x) and UPRO (3x) amplify those returns -- UPRO has turned $100K into ~$9.6M since 2009 -- but with devastating drawdowns that most investors cannot survive.</w:t>
+        <w:t>The S&amp;P 500 has compounded at roughly 10% per year (with dividends) since 1950, turning $10,000 into over $4 million. Leveraged ETFs like SSO (2x) and UPRO (3x) amplify those returns -- UPRO has turned $100K into ~$10.2M since 2009 -- but with devastating drawdowns that most investors cannot survive.</w:t>
       </w:r>
     </w:p>
     <w:p>
@@ -40,7 +40,7 @@
         <w:pStyle w:val="ListBullet"/>
       </w:pPr>
       <w:r>
-        <w:t>The best risk-adjusted strategy -- a simple drawdown exit with a cooling period -- delivered a 0.86 Sharpe ratio (vs 0.78 for UPRO buy-and-hold and 0.85 for plain SPY) and cut the maximum drawdown from -77% to -42%, at the cost of about 12% less terminal wealth. Walk-forward validation, parameter heatmaps, and a synthetic pre-2009 stress test suggest the parameters are not a fragile optimum, but block-bootstrap analysis shows the Sharpe advantage depends materially on the sequencing of returns -- making this a useful practical overlay for recent-style regimes, not a universal improvement.</w:t>
+        <w:t>The best risk-adjusted strategy -- a simple drawdown exit with a cooling period -- delivered a 0.86 Sharpe ratio (vs 0.78 for UPRO buy-and-hold and 0.82 for plain SPY) and cut the maximum drawdown from -77% to -42%, at the cost of about 12% less terminal wealth. Walk-forward validation, parameter heatmaps, and a synthetic pre-2009 stress test suggest the parameters are not a fragile optimum, but block-bootstrap analysis shows the Sharpe advantage depends materially on the sequencing of returns -- making this a useful practical overlay for recent-style regimes, not a universal improvement.</w:t>
       </w:r>
     </w:p>
     <w:p>
@@ -94,7 +94,7 @@
     </w:p>
     <w:p>
       <w:r>
-        <w:t>The raw numbers are compelling. Since inception, a $100,000 investment in SSO would have grown to approximately $1.5 million (a 14.9% compound annual growth rate). UPRO has been even more dramatic: $100,000 invested at inception has grown to roughly $9.6 million, a 31.5% CAGR over 16+ years. No mainstream ETF comes close to these figures.</w:t>
+        <w:t>The raw numbers are compelling. Since inception, a $100,000 investment in SSO would have grown to approximately $1.5 million (a 14.9% compound annual growth rate). UPRO has been even more dramatic: $100,000 invested at inception has grown to roughly $10.2 million, a 32.0% CAGR over 16+ years. No mainstream ETF comes close to these figures.</w:t>
       </w:r>
     </w:p>
     <w:p>
@@ -112,7 +112,7 @@
     </w:p>
     <w:p>
       <w:r>
-        <w:t>UPRO's track record is one of the most striking backtests in retail investing. A 31.5% CAGR turns $100K into nearly 100x over 16 years. The temptation to simply buy and hold is powerful.</w:t>
+        <w:t>UPRO's track record is one of the most striking backtests in retail investing. A 32% CAGR turns $100K into over 100x in 16 years. The temptation to simply buy and hold is powerful.</w:t>
       </w:r>
     </w:p>
     <w:p>
@@ -2831,7 +2831,7 @@
     </w:p>
     <w:p>
       <w:r>
-        <w:t>HFEA actually has the best Sortino ratio in the entire analysis -- meaning it handles downside volatility particularly well relative to its upside. But the max drawdown is still -70%, which is barely better than pure UPRO.</w:t>
+        <w:t>HFEA has the best Sortino ratio among the five base strategies (1.08) -- meaning it handles downside volatility particularly well relative to its upside. (The DD25%/Cool40+TLT variant introduced later edges it at 1.13.) But the max drawdown is still -70%, which is barely better than pure UPRO.</w:t>
       </w:r>
     </w:p>
     <w:p>

</xml_diff>

<commit_message>
Reconcile article with next-open execution numbers; improve charts
- Update all performance numbers to match build_docx.py (next-open
  execution, excess Sharpe) for consistency with stated methodology
- Fix text: qualify "no strategy beats B&H" since TLT variant now does,
  correct walk-forward Sharpe to 0.74, soften vol-norm trade comparison
- Chart improvements: sort legends by end value (highest first), change
  synthetic 3x margin color to dark goldenrod for contrast, add SPY B&H
  line to pre-2009 synthetic chart
- Rebuild docx, charts, and CSVs

Co-Authored-By: Claude Opus 4.6 <noreply@anthropic.com>
</commit_message>
<xml_diff>
--- a/UPRO_Timing_Strategies_Article.docx
+++ b/UPRO_Timing_Strategies_Article.docx
@@ -24,7 +24,7 @@
         <w:pStyle w:val="ListBullet"/>
       </w:pPr>
       <w:r>
-        <w:t>The S&amp;P 500 has compounded at roughly 10% per year (with dividends) since 1950, turning $10,000 into over $4 million. Leveraged ETFs like SSO (2x) and UPRO (3x) amplify those returns -- UPRO has turned $100K into ~$10.2M since 2009 -- but with devastating drawdowns that most investors cannot survive.</w:t>
+        <w:t>The S&amp;P 500 has compounded at roughly 10% per year (with dividends) since 1950, turning $10,000 into over $4 million. Leveraged ETFs like SSO (2x) and UPRO (3x) amplify those returns -- UPRO has turned $100K into ~$9.5M since 2009 -- but with devastating drawdowns that most investors cannot survive.</w:t>
       </w:r>
     </w:p>
     <w:p>
@@ -40,7 +40,7 @@
         <w:pStyle w:val="ListBullet"/>
       </w:pPr>
       <w:r>
-        <w:t>The best risk-adjusted strategy -- a simple drawdown exit with a cooling period -- delivered a 0.86 Sharpe ratio (vs 0.78 for UPRO buy-and-hold and 0.82 for plain SPY) and cut the maximum drawdown from -77% to -42%, at the cost of about 12% less terminal wealth. Walk-forward validation, parameter heatmaps, and a synthetic pre-2009 stress test suggest the parameters are not a fragile optimum, but block-bootstrap analysis shows the Sharpe advantage depends materially on the sequencing of returns -- making this a useful practical overlay for recent-style regimes, not a universal improvement.</w:t>
+        <w:t>The best risk-adjusted strategy -- a simple drawdown exit with a cooling period -- delivered a 0.85 Sharpe ratio (vs 0.77 for UPRO buy-and-hold and 0.81 for plain SPY) and cut the maximum drawdown from -77% to -42%, at the cost of about 12% less terminal wealth. Walk-forward validation, parameter heatmaps, and a synthetic pre-2009 stress test suggest the parameters are not a fragile optimum, but block-bootstrap analysis shows the Sharpe advantage depends materially on the sequencing of returns -- making this a useful practical overlay for recent-style regimes, not a universal improvement.</w:t>
       </w:r>
     </w:p>
     <w:p>
@@ -48,7 +48,7 @@
         <w:pStyle w:val="ListBullet"/>
       </w:pPr>
       <w:r>
-        <w:t>An enhancement: parking idle cash in TLT (long-term Treasuries) instead of T-bills during cooling periods pushes the Sharpe to 0.89 and terminal wealth to $11.1M -- actually beating UPRO buy-and-hold -- by harvesting flight-to-quality rallies when stocks crash.</w:t>
+        <w:t>An enhancement: parking idle cash in TLT (long-term Treasuries) instead of T-bills during cooling periods pushes the Sharpe to 0.88 and terminal wealth to $10.4M -- actually beating UPRO buy-and-hold -- by harvesting flight-to-quality rallies when stocks crash. Block-bootstrap analysis confirms TLT's Sharpe advantage is robust: median bootstrapped Sharpe of 0.92 vs 0.89 for T-bill cash.</w:t>
       </w:r>
     </w:p>
     <w:p>
@@ -94,7 +94,7 @@
     </w:p>
     <w:p>
       <w:r>
-        <w:t>The raw numbers are compelling. Since inception, a $100,000 investment in SSO would have grown to approximately $1.5 million (a 14.9% compound annual growth rate). UPRO has been even more dramatic: $100,000 invested at inception has grown to roughly $10.2 million, a 32.0% CAGR over 16+ years. No mainstream ETF comes close to these figures.</w:t>
+        <w:t>The raw numbers are compelling. Since inception, a $100,000 investment in SSO would have grown to approximately $1.5 million (a 14.9% compound annual growth rate). UPRO has been even more dramatic: $100,000 invested at inception has grown to roughly $9.5 million, a 31.4% CAGR over 16+ years. No mainstream ETF comes close to these figures.</w:t>
       </w:r>
     </w:p>
     <w:p>
@@ -112,7 +112,7 @@
     </w:p>
     <w:p>
       <w:r>
-        <w:t>UPRO's track record is one of the most striking backtests in retail investing. A 32% CAGR turns $100K into over 100x in 16 years. The temptation to simply buy and hold is powerful.</w:t>
+        <w:t>UPRO's track record is one of the most striking backtests in retail investing. A 31% CAGR turns $100K into nearly 100x in 16 years. The temptation to simply buy and hold is powerful.</w:t>
       </w:r>
     </w:p>
     <w:p>
@@ -823,7 +823,7 @@
               <w:rPr>
                 <w:sz w:val="18"/>
               </w:rPr>
-              <w:t>$10,161,336</w:t>
+              <w:t>$9,530,442</w:t>
             </w:r>
           </w:p>
         </w:tc>
@@ -857,7 +857,7 @@
               <w:rPr>
                 <w:sz w:val="18"/>
               </w:rPr>
-              <w:t>+32.0%</w:t>
+              <w:t>+31.4%</w:t>
             </w:r>
           </w:p>
         </w:tc>
@@ -891,7 +891,7 @@
               <w:rPr>
                 <w:sz w:val="18"/>
               </w:rPr>
-              <w:t>0.78</w:t>
+              <w:t>0.77</w:t>
             </w:r>
           </w:p>
         </w:tc>
@@ -925,7 +925,7 @@
               <w:rPr>
                 <w:sz w:val="18"/>
               </w:rPr>
-              <w:t>0.96</w:t>
+              <w:t>0.95</w:t>
             </w:r>
           </w:p>
         </w:tc>
@@ -959,7 +959,7 @@
               <w:rPr>
                 <w:sz w:val="18"/>
               </w:rPr>
-              <w:t>0.40</w:t>
+              <w:t>0.39</w:t>
             </w:r>
           </w:p>
         </w:tc>
@@ -1036,7 +1036,7 @@
     <w:p/>
     <w:p>
       <w:r>
-        <w:t xml:space="preserve">These are extraordinary numbers. No timing strategy in this analysis beats buy-and-hold on total return. If you have the iron stomach to hold through a -77% drawdown -- and I mean genuinely hold, not just say you would in a hypothetical -- then buy-and-hold is the mathematically optimal choice. (For comparison, plain SPY buy-and-hold over the same period has a 0.82 Sharpe -- UPRO's 3x leverage actually </w:t>
+        <w:t xml:space="preserve">These are extraordinary numbers. With T-bill cash, no timing strategy in this analysis matches buy-and-hold on total return -- though as I show later, parking idle cash in TLT during cooling periods does beat it. If maximizing terminal wealth is your only goal and you have the iron stomach to hold through a -77% drawdown -- and I mean genuinely hold, not just say you would in a hypothetical -- then buy-and-hold is hard to beat. (For comparison, plain SPY buy-and-hold over the same period has a 0.81 Sharpe -- UPRO's 3x leverage actually </w:t>
       </w:r>
       <w:r>
         <w:rPr>
@@ -1050,7 +1050,7 @@
     </w:p>
     <w:p>
       <w:r>
-        <w:t xml:space="preserve">But an important caveat that deserves emphasis: this entire test period is overwhelmingly bullish. UPRO's inception happened to coincide with the beginning of the longest bull market in American history. Every timing strategy that says "hold UPRO most of the time" will look great in a period that is almost entirely up. There is no actual UPRO data for 2000-2009, which would have been devastating. The 2009-2026 period includes drawdowns, but they were all followed by sharp recoveries -- a pattern that may not repeat. Results from this period should be treated as evidence of what </w:t>
+        <w:t xml:space="preserve">But an important caveat that deserves emphasis: this entire test period is overwhelmingly bullish. UPRO's inception happened to coincide with the beginning of the longest bull market in American history -- the run from March 2009 to February 2020, roughly 131 months before it ended with the COVID crash. Every timing strategy that says "hold UPRO most of the time" will look great in a period that is almost entirely up. There is no actual UPRO data for 2000-2009, which would have been devastating. The 2009-2026 period includes drawdowns, but they were all followed by sharp recoveries -- a pattern that may not repeat. Results from this period should be treated as evidence of what </w:t>
       </w:r>
       <w:r>
         <w:rPr>
@@ -1100,7 +1100,7 @@
         <w:t>static 3x leveraged position</w:t>
       </w:r>
       <w:r>
-        <w:t xml:space="preserve"> where you invest $100K of equity, borrow $200K at 6%, buy $300K of SPY, and simply hold. Plain SPY buy-and-hold serves as the 1x baseline.</w:t>
+        <w:t xml:space="preserve"> where you invest $100K of equity, borrow $200K at 6%, buy $300K of SPY, and simply hold. Plain SPY buy-and-hold serves as the 1x baseline. (The 6% margin rate reflects a competitive retail broker rate. Interactive Brokers, the industry's cheapest, currently charges roughly 5-6% all-in depending on account type and balance tier. Most retail brokers charge 8-12%. The all-in rate is the broker's spread over the prevailing benchmark rate, not the spread alone.)</w:t>
       </w:r>
     </w:p>
     <w:p>
@@ -1273,7 +1273,7 @@
               <w:rPr>
                 <w:sz w:val="18"/>
               </w:rPr>
-              <w:t>$1,003,640</w:t>
+              <w:t>$983,169</w:t>
             </w:r>
           </w:p>
         </w:tc>
@@ -1289,7 +1289,7 @@
               <w:rPr>
                 <w:sz w:val="18"/>
               </w:rPr>
-              <w:t>+14.9%</w:t>
+              <w:t>+14.7%</w:t>
             </w:r>
           </w:p>
         </w:tc>
@@ -1305,7 +1305,7 @@
               <w:rPr>
                 <w:sz w:val="18"/>
               </w:rPr>
-              <w:t>0.82</w:t>
+              <w:t>0.81</w:t>
             </w:r>
           </w:p>
         </w:tc>
@@ -1371,7 +1371,7 @@
               <w:rPr>
                 <w:sz w:val="18"/>
               </w:rPr>
-              <w:t>$22,628,688</w:t>
+              <w:t>$21,250,484</w:t>
             </w:r>
           </w:p>
         </w:tc>
@@ -1387,7 +1387,7 @@
               <w:rPr>
                 <w:sz w:val="18"/>
               </w:rPr>
-              <w:t>+38.5%</w:t>
+              <w:t>+37.9%</w:t>
             </w:r>
           </w:p>
         </w:tc>
@@ -1403,7 +1403,7 @@
               <w:rPr>
                 <w:sz w:val="18"/>
               </w:rPr>
-              <w:t>0.87</w:t>
+              <w:t>0.86</w:t>
             </w:r>
           </w:p>
         </w:tc>
@@ -1469,7 +1469,7 @@
               <w:rPr>
                 <w:sz w:val="18"/>
               </w:rPr>
-              <w:t>$3,072,894</w:t>
+              <w:t>$2,880,158</w:t>
             </w:r>
           </w:p>
         </w:tc>
@@ -1485,7 +1485,7 @@
               <w:rPr>
                 <w:sz w:val="18"/>
               </w:rPr>
-              <w:t>+22.8%</w:t>
+              <w:t>+22.3%</w:t>
             </w:r>
           </w:p>
         </w:tc>
@@ -1501,7 +1501,7 @@
               <w:rPr>
                 <w:sz w:val="18"/>
               </w:rPr>
-              <w:t>0.64</w:t>
+              <w:t>0.63</w:t>
             </w:r>
           </w:p>
         </w:tc>
@@ -1567,7 +1567,7 @@
               <w:rPr>
                 <w:sz w:val="18"/>
               </w:rPr>
-              <w:t>$2,467,976</w:t>
+              <w:t>$2,406,044</w:t>
             </w:r>
           </w:p>
         </w:tc>
@@ -1583,7 +1583,7 @@
               <w:rPr>
                 <w:sz w:val="18"/>
               </w:rPr>
-              <w:t>+21.2%</w:t>
+              <w:t>+21.0%</w:t>
             </w:r>
           </w:p>
         </w:tc>
@@ -1599,7 +1599,7 @@
               <w:rPr>
                 <w:sz w:val="18"/>
               </w:rPr>
-              <w:t>0.76</w:t>
+              <w:t>0.75</w:t>
             </w:r>
           </w:p>
         </w:tc>
@@ -1665,7 +1665,7 @@
               <w:rPr>
                 <w:sz w:val="18"/>
               </w:rPr>
-              <w:t>$10,161,336</w:t>
+              <w:t>$9,530,442</w:t>
             </w:r>
           </w:p>
         </w:tc>
@@ -1681,7 +1681,7 @@
               <w:rPr>
                 <w:sz w:val="18"/>
               </w:rPr>
-              <w:t>+32.0%</w:t>
+              <w:t>+31.4%</w:t>
             </w:r>
           </w:p>
         </w:tc>
@@ -1697,7 +1697,7 @@
               <w:rPr>
                 <w:sz w:val="18"/>
               </w:rPr>
-              <w:t>0.78</w:t>
+              <w:t>0.77</w:t>
             </w:r>
           </w:p>
         </w:tc>
@@ -1743,7 +1743,7 @@
     </w:p>
     <w:p>
       <w:r>
-        <w:t>The "leverage tax" on UPRO is visible here: a frictionless 3x position would have returned $22.6M vs UPRO's $10.2M. That $12.4M gap is the cumulative cost of UPRO's 0.89% expense ratio, rebalancing slippage, and tracking error over 16+ years. Yet UPRO still crushes margin-based leverage ($3.1M for daily-rebalanced, $2.5M for static) because its embedded borrowing costs are far lower than 6% margin rates.</w:t>
+        <w:t>The "leverage tax" on UPRO is visible here: a frictionless 3x position would have returned $21.3M vs UPRO's $9.5M. That $11.8M gap is the cumulative cost of UPRO's 0.89% expense ratio, rebalancing slippage, and tracking error over 16+ years. Yet UPRO still crushes margin-based leverage ($2.9M for daily-rebalanced, $2.4M for static) because its embedded borrowing costs are far lower than retail margin rates -- even at the cheapest broker available.</w:t>
       </w:r>
     </w:p>
     <w:p>
@@ -2407,7 +2407,21 @@
     <w:p/>
     <w:p>
       <w:r>
-        <w:t>The pattern is striking. In five out of six test periods, the static margin account was forcibly liquidated. During the dot-com crash, the margin call came just 15 trading days after entry. During the GFC, it took about 3 months. Only the UPRO era -- which uniquely starts at a generational market bottom -- survived. And even over the full 1950-2026 history, despite the S&amp;P 500 compounding at +8.2% annually for 76 years, the static 3x account got margin-called during the 1973-74 bear market. The 1950-1974 bull market had grown the account substantially, but the static leverage ratio had also drifted -- accumulated gains reduced the effective leverage well below 3x, yet a severe enough decline still breached the 25% maintenance margin requirement. Once liquidated at $269K, the account sat in cash for the remaining 52 years while unlevered S&amp;P 500 grew to $41.3 million.</w:t>
+        <w:t>The pattern is striking. In five out of six test periods, the static margin account was forcibly liquidated. During the dot-com crash, the margin call came just 15 trading days after entry. During the GFC, it took about 3 months. Only the UPRO era -- which uniquely starts at a generational market bottom -- survived.</w:t>
+      </w:r>
+    </w:p>
+    <w:p>
+      <w:r>
+        <w:t xml:space="preserve">The full 1950-2026 case is the most instructive. Despite the S&amp;P 500 compounding at +8.2% annually for 76 years, the static 3x account got margin-called during the 1973-74 bear market -- </w:t>
+      </w:r>
+      <w:r>
+        <w:rPr>
+          <w:i/>
+        </w:rPr>
+        <w:t>24 years</w:t>
+      </w:r>
+      <w:r>
+        <w:t xml:space="preserve"> after inception. Here's how: the initial $200K loan compounds at 6% annually, growing to approximately $875K by 1974. Meanwhile, the S&amp;P rose from 17 to a peak of ~120 before crashing to ~64 during the 1973-74 bear market. The account's peak equity reached $1.37M, but by the time the S&amp;P had dropped ~47%, the position value ($1.14M) minus the swollen debt ($875K) left only $269K in equity -- below the 25% maintenance requirement on the position. The margin call fires, the position is liquidated, and the account sits in cash for the remaining 52 years while unlevered S&amp;P 500 grew to $41.3 million. The lesson: even massive accumulated gains cannot overcome the slow poison of compounding interest on a static loan when a severe bear market eventually arrives.</w:t>
       </w:r>
     </w:p>
     <w:p>
@@ -2708,7 +2722,7 @@
     <w:p/>
     <w:p>
       <w:r>
-        <w:t>The frictionless 3x is extraordinary over 76 years -- $100K becomes $20.0 billion -- but it's a fantasy: no one can maintain 3x leverage for free. Add realistic 6% borrowing costs and $100K grows to just $2.2M over 76 years -- a fraction of the S&amp;P 500's $41.3M at 1x. Three times the risk, one-twentieth the return. During the lost decade, daily-rebalanced 3x with costs destroyed 97% of your capital. Volatility decay in a choppy, declining market is a meat grinder for leveraged strategies.</w:t>
+        <w:t>The frictionless 3x is extraordinary over 76 years -- $100K becomes $20.0 billion -- but it's a fantasy: no one can maintain 3x leverage for free. Add realistic 6% borrowing costs and $100K grows to just $2.2M over 76 years -- a fraction of the S&amp;P 500's $41.3M at 1x. Three times the risk, one-twentieth the return. During the lost decade (2000-2009), daily-rebalanced 3x with costs destroyed 97% of your capital. Volatility decay in a choppy, declining market is a meat grinder for leveraged strategies.</w:t>
       </w:r>
     </w:p>
     <w:p>
@@ -2758,17 +2772,17 @@
     </w:p>
     <w:p>
       <w:r>
-        <w:t>The simplest idea: when the market is scared, step aside.</w:t>
+        <w:t>The simplest idea: when the market is scared, step aside. During the test period (June 2009 to March 2026), VIX ranged from 9 to 83, with a median of 17 and a mean of 19. The 25th percentile was 14, the 75th percentile was 22, and VIX spent 86% of trading days below 25.</w:t>
       </w:r>
     </w:p>
     <w:p>
       <w:r>
-        <w:t>The problem is that VIX is reactive, not predictive. By the time VIX spikes above 25, you've already taken the first leg of the drawdown. And VIX often stays elevated during the early stages of recovery, causing you to miss the bounce.</w:t>
+        <w:t>The problem is that VIX is reactive, not predictive. By the time VIX spikes above 25 (which happens only 14% of trading days), you've already taken the first leg of the drawdown. And VIX often stays elevated during the early stages of recovery, causing you to miss the bounce.</w:t>
       </w:r>
     </w:p>
     <w:p>
       <w:r>
-        <w:t>The best VIX variant (VIX &lt; 30) produced a $4.3M end value with a 0.72 Sharpe and -68.9% max drawdown. You sacrifice more than half the terminal wealth for a max drawdown that's only 8 percentage points better. The threshold barely filters anything -- VIX is below 30 about 94% of the time -- so you get almost all of the downside with less upside.</w:t>
+        <w:t>The best VIX variant (VIX &lt; 30) produced a $4.0M end value with a 0.71 Sharpe and -68.9% max drawdown. You sacrifice more than half the terminal wealth for a max drawdown that's only 8 percentage points better. The threshold barely filters anything -- VIX is below 30 about 94% of the time -- so you get almost all of the downside with less upside.</w:t>
       </w:r>
     </w:p>
     <w:p>
@@ -2797,7 +2811,7 @@
     </w:p>
     <w:p>
       <w:r>
-        <w:t>End value: $607K. CAGR: +11.4%. Sharpe: 0.46. Max drawdown: -56.6%. Only invested 63% of the time, with 76 trade signals.</w:t>
+        <w:t>End value: $570K. CAGR: +11.0%. Sharpe: 0.45. Max drawdown: -56.6%. Only invested 63% of the time, with 76 trade signals.</w:t>
       </w:r>
     </w:p>
     <w:p>
@@ -2826,12 +2840,12 @@
     </w:p>
     <w:p>
       <w:r>
-        <w:t>End value: $3.3M. CAGR: +23.5%. Sharpe: 0.83. Sortino: 1.08. Max drawdown: -70.5%. The 67 "trades" are quarterly rebalancing events (adjusting the 55/45 allocation every ~63 trading days), not 67 round-trip trades.</w:t>
+        <w:t>End value: $3.2M. CAGR: +23.1%. Sharpe: 0.82. Sortino: 1.07. Max drawdown: -70.5%. The 67 "trades" are quarterly rebalancing events (adjusting the 55/45 allocation every ~63 trading days), not round-trip trades.</w:t>
       </w:r>
     </w:p>
     <w:p>
       <w:r>
-        <w:t>HFEA has the best Sortino ratio among the five base strategies (1.08) -- meaning it handles downside volatility particularly well relative to its upside. (The DD25%/Cool40+TLT variant introduced later edges it at 1.13.) But the max drawdown is still -70%, which is barely better than pure UPRO.</w:t>
+        <w:t>HFEA has the best Sortino ratio among the five base strategies (1.07) -- meaning it handles downside volatility particularly well relative to its upside. (The DD25%/Cool40+TLT variant introduced later edges it at 1.12.) But the max drawdown is still -70%, which is barely better than pure UPRO.</w:t>
       </w:r>
     </w:p>
     <w:p>
@@ -3029,7 +3043,7 @@
               <w:rPr>
                 <w:sz w:val="18"/>
               </w:rPr>
-              <w:t>$692K</w:t>
+              <w:t>$649K</w:t>
             </w:r>
           </w:p>
         </w:tc>
@@ -3045,7 +3059,7 @@
               <w:rPr>
                 <w:sz w:val="18"/>
               </w:rPr>
-              <w:t>+12.3%</w:t>
+              <w:t>+11.9%</w:t>
             </w:r>
           </w:p>
         </w:tc>
@@ -3061,7 +3075,7 @@
               <w:rPr>
                 <w:sz w:val="18"/>
               </w:rPr>
-              <w:t>0.48</w:t>
+              <w:t>0.46</w:t>
             </w:r>
           </w:p>
         </w:tc>
@@ -3093,7 +3107,7 @@
               <w:rPr>
                 <w:sz w:val="18"/>
               </w:rPr>
-              <w:t>155</w:t>
+              <w:t>156</w:t>
             </w:r>
           </w:p>
         </w:tc>
@@ -3143,7 +3157,7 @@
               <w:rPr>
                 <w:sz w:val="18"/>
               </w:rPr>
-              <w:t>$2.0M</w:t>
+              <w:t>$1.9M</w:t>
             </w:r>
           </w:p>
         </w:tc>
@@ -3159,7 +3173,7 @@
               <w:rPr>
                 <w:sz w:val="18"/>
               </w:rPr>
-              <w:t>+19.8%</w:t>
+              <w:t>+19.3%</w:t>
             </w:r>
           </w:p>
         </w:tc>
@@ -3175,7 +3189,7 @@
               <w:rPr>
                 <w:sz w:val="18"/>
               </w:rPr>
-              <w:t>0.71</w:t>
+              <w:t>0.70</w:t>
             </w:r>
           </w:p>
         </w:tc>
@@ -3207,7 +3221,7 @@
               <w:rPr>
                 <w:sz w:val="18"/>
               </w:rPr>
-              <w:t>119</w:t>
+              <w:t>120</w:t>
             </w:r>
           </w:p>
         </w:tc>
@@ -3257,7 +3271,7 @@
               <w:rPr>
                 <w:sz w:val="18"/>
               </w:rPr>
-              <w:t>$1.6M</w:t>
+              <w:t>$1.5M</w:t>
             </w:r>
           </w:p>
         </w:tc>
@@ -3273,7 +3287,7 @@
               <w:rPr>
                 <w:sz w:val="18"/>
               </w:rPr>
-              <w:t>+17.9%</w:t>
+              <w:t>+17.4%</w:t>
             </w:r>
           </w:p>
         </w:tc>
@@ -3289,7 +3303,7 @@
               <w:rPr>
                 <w:sz w:val="18"/>
               </w:rPr>
-              <w:t>0.70</w:t>
+              <w:t>0.68</w:t>
             </w:r>
           </w:p>
         </w:tc>
@@ -3321,7 +3335,7 @@
               <w:rPr>
                 <w:sz w:val="18"/>
               </w:rPr>
-              <w:t>103</w:t>
+              <w:t>104</w:t>
             </w:r>
           </w:p>
         </w:tc>
@@ -3371,7 +3385,7 @@
               <w:rPr>
                 <w:sz w:val="18"/>
               </w:rPr>
-              <w:t>$1.5M</w:t>
+              <w:t>$1.4M</w:t>
             </w:r>
           </w:p>
         </w:tc>
@@ -3387,7 +3401,7 @@
               <w:rPr>
                 <w:sz w:val="18"/>
               </w:rPr>
-              <w:t>+17.5%</w:t>
+              <w:t>+17.1%</w:t>
             </w:r>
           </w:p>
         </w:tc>
@@ -3403,7 +3417,7 @@
               <w:rPr>
                 <w:sz w:val="18"/>
               </w:rPr>
-              <w:t>0.58</w:t>
+              <w:t>0.57</w:t>
             </w:r>
           </w:p>
         </w:tc>
@@ -3485,7 +3499,7 @@
               <w:rPr>
                 <w:sz w:val="18"/>
               </w:rPr>
-              <w:t>$2.0M</w:t>
+              <w:t>$1.8M</w:t>
             </w:r>
           </w:p>
         </w:tc>
@@ -3501,7 +3515,7 @@
               <w:rPr>
                 <w:sz w:val="18"/>
               </w:rPr>
-              <w:t>+19.6%</w:t>
+              <w:t>+19.1%</w:t>
             </w:r>
           </w:p>
         </w:tc>
@@ -3517,7 +3531,7 @@
               <w:rPr>
                 <w:sz w:val="18"/>
               </w:rPr>
-              <w:t>0.66</w:t>
+              <w:t>0.64</w:t>
             </w:r>
           </w:p>
         </w:tc>
@@ -3599,7 +3613,7 @@
               <w:rPr>
                 <w:sz w:val="18"/>
               </w:rPr>
-              <w:t>$441K</w:t>
+              <w:t>$414K</w:t>
             </w:r>
           </w:p>
         </w:tc>
@@ -3615,7 +3629,7 @@
               <w:rPr>
                 <w:sz w:val="18"/>
               </w:rPr>
-              <w:t>+9.3%</w:t>
+              <w:t>+8.9%</w:t>
             </w:r>
           </w:p>
         </w:tc>
@@ -3631,7 +3645,7 @@
               <w:rPr>
                 <w:sz w:val="18"/>
               </w:rPr>
-              <w:t>0.40</w:t>
+              <w:t>0.39</w:t>
             </w:r>
           </w:p>
         </w:tc>
@@ -3713,7 +3727,7 @@
               <w:rPr>
                 <w:sz w:val="18"/>
               </w:rPr>
-              <w:t>$9.9M</w:t>
+              <w:t>$9.3M</w:t>
             </w:r>
           </w:p>
         </w:tc>
@@ -3729,7 +3743,7 @@
               <w:rPr>
                 <w:sz w:val="18"/>
               </w:rPr>
-              <w:t>+31.8%</w:t>
+              <w:t>+31.2%</w:t>
             </w:r>
           </w:p>
         </w:tc>
@@ -3745,7 +3759,7 @@
               <w:rPr>
                 <w:sz w:val="18"/>
               </w:rPr>
-              <w:t>0.85</w:t>
+              <w:t>0.84</w:t>
             </w:r>
           </w:p>
         </w:tc>
@@ -3827,7 +3841,7 @@
               <w:rPr>
                 <w:sz w:val="18"/>
               </w:rPr>
-              <w:t>$4.0M</w:t>
+              <w:t>$3.8M</w:t>
             </w:r>
           </w:p>
         </w:tc>
@@ -3843,7 +3857,7 @@
               <w:rPr>
                 <w:sz w:val="18"/>
               </w:rPr>
-              <w:t>+24.8%</w:t>
+              <w:t>+24.3%</w:t>
             </w:r>
           </w:p>
         </w:tc>
@@ -3859,7 +3873,7 @@
               <w:rPr>
                 <w:sz w:val="18"/>
               </w:rPr>
-              <w:t>0.76</w:t>
+              <w:t>0.74</w:t>
             </w:r>
           </w:p>
         </w:tc>
@@ -3941,7 +3955,7 @@
               <w:rPr>
                 <w:sz w:val="18"/>
               </w:rPr>
-              <w:t>$920K</w:t>
+              <w:t>$863K</w:t>
             </w:r>
           </w:p>
         </w:tc>
@@ -3957,7 +3971,7 @@
               <w:rPr>
                 <w:sz w:val="18"/>
               </w:rPr>
-              <w:t>+14.3%</w:t>
+              <w:t>+13.8%</w:t>
             </w:r>
           </w:p>
         </w:tc>
@@ -3973,7 +3987,7 @@
               <w:rPr>
                 <w:sz w:val="18"/>
               </w:rPr>
-              <w:t>0.53</w:t>
+              <w:t>0.52</w:t>
             </w:r>
           </w:p>
         </w:tc>
@@ -4055,7 +4069,7 @@
               <w:rPr>
                 <w:sz w:val="18"/>
               </w:rPr>
-              <w:t>$10.0M</w:t>
+              <w:t>$9.4M</w:t>
             </w:r>
           </w:p>
         </w:tc>
@@ -4071,7 +4085,7 @@
               <w:rPr>
                 <w:sz w:val="18"/>
               </w:rPr>
-              <w:t>+31.9%</w:t>
+              <w:t>+31.3%</w:t>
             </w:r>
           </w:p>
         </w:tc>
@@ -4087,7 +4101,7 @@
               <w:rPr>
                 <w:sz w:val="18"/>
               </w:rPr>
-              <w:t>0.83</w:t>
+              <w:t>0.82</w:t>
             </w:r>
           </w:p>
         </w:tc>
@@ -4171,7 +4185,7 @@
                 <w:b/>
                 <w:sz w:val="18"/>
               </w:rPr>
-              <w:t>$9.0M</w:t>
+              <w:t>$8.4M</w:t>
             </w:r>
           </w:p>
         </w:tc>
@@ -4188,7 +4202,7 @@
                 <w:b/>
                 <w:sz w:val="18"/>
               </w:rPr>
-              <w:t>+31.0%</w:t>
+              <w:t>+30.5%</w:t>
             </w:r>
           </w:p>
         </w:tc>
@@ -4205,7 +4219,7 @@
                 <w:b/>
                 <w:sz w:val="18"/>
               </w:rPr>
-              <w:t>0.86</w:t>
+              <w:t>0.85</w:t>
             </w:r>
           </w:p>
         </w:tc>
@@ -4290,7 +4304,7 @@
               <w:rPr>
                 <w:sz w:val="18"/>
               </w:rPr>
-              <w:t>$2.0M</w:t>
+              <w:t>$1.9M</w:t>
             </w:r>
           </w:p>
         </w:tc>
@@ -4306,7 +4320,7 @@
               <w:rPr>
                 <w:sz w:val="18"/>
               </w:rPr>
-              <w:t>+19.8%</w:t>
+              <w:t>+19.4%</w:t>
             </w:r>
           </w:p>
         </w:tc>
@@ -4322,7 +4336,7 @@
               <w:rPr>
                 <w:sz w:val="18"/>
               </w:rPr>
-              <w:t>0.65</w:t>
+              <w:t>0.64</w:t>
             </w:r>
           </w:p>
         </w:tc>
@@ -4419,7 +4433,7 @@
     <w:p/>
     <w:p>
       <w:r>
-        <w:t>A note on the DD15%/Cool60 anomaly: its $441K end value is dramatically worse than nearby variants ($2.0M for DD15%/Cool40, $1.5M for DD15%/Cool20). The 60-day cooling period forces cash positions through critical recovery windows -- you're sitting out during the fastest part of the bounce. This illustrates that parameter sensitivity is real. The strategy's edge comes from the specific threshold+cooling combination, not from drawdown exits as a general concept. (I address parameter sensitivity directly in the robustness section below.)</w:t>
+        <w:t>A note on the DD15%/Cool60 anomaly: its $414K end value is dramatically worse than nearby variants ($1.8M for DD15%/Cool40, $1.4M for DD15%/Cool20). The 60-day cooling period forces cash positions through critical recovery windows -- you're sitting out during the fastest part of the bounce. This illustrates that parameter sensitivity is real. The strategy's edge comes from the specific threshold+cooling combination, not from drawdown exits as a general concept. (I address parameter sensitivity directly in the robustness section below.)</w:t>
       </w:r>
     </w:p>
     <w:p>
@@ -4433,7 +4447,7 @@
         <w:t>DD25%/Cool40</w:t>
       </w:r>
       <w:r>
-        <w:t>: exit when UPRO drops 25% from its peak, wait at least 40 trading days (~2 months) before re-entering. But it's worth noting that DD25%/Cool40 is representative of a family of competitive parameters -- the heatmap below shows that DD20-25%/Cool20-40 all produce Sharpe ratios above 0.75. The specific "best" parameters would shift with a different test period. I use DD25%/Cool40 throughout as a concrete example, not as a claim that these exact numbers are uniquely optimal.</w:t>
+        <w:t>: exit when UPRO drops 25% from its peak, wait at least 40 trading days (~2 months) before re-entering. But it's worth noting that DD25%/Cool40 is representative of a family of competitive parameters -- the heatmap below shows that DD20-25%/Cool20-40 all produce Sharpe ratios above 0.74. The specific "best" parameters would shift with a different test period. I use DD25%/Cool40 throughout as a concrete example, not as a claim that these exact numbers are uniquely optimal.</w:t>
       </w:r>
     </w:p>
     <w:p>
@@ -4448,7 +4462,7 @@
     </w:p>
     <w:p>
       <w:r>
-        <w:t xml:space="preserve">The trade-off is explicit: you give up about $1.2 million in terminal wealth (12% of buy-and-hold's end value) in exchange for a maximum drawdown that's </w:t>
+        <w:t xml:space="preserve">The trade-off is explicit: you give up about $1.1 million in terminal wealth (12% of buy-and-hold's end value) in exchange for a maximum drawdown that's </w:t>
       </w:r>
       <w:r>
         <w:rPr>
@@ -4457,7 +4471,7 @@
         <w:t>35 percentage points better</w:t>
       </w:r>
       <w:r>
-        <w:t xml:space="preserve"> (-41.8% vs -76.8%). The Sharpe ratio improved from 0.78 to 0.86 over this test period. 31 trade signals over 16+ years -- roughly one exit/re-entry cycle per year. You're invested 86% of the time.</w:t>
+        <w:t xml:space="preserve"> (-41.8% vs -76.8%). The Sharpe ratio improved from 0.77 to 0.85 over this test period. 31 trade signals (~15 round trips) over 16+ years. You're invested 86% of the time.</w:t>
       </w:r>
     </w:p>
     <w:p>
@@ -4475,7 +4489,7 @@
     </w:p>
     <w:p>
       <w:r>
-        <w:t>Composite 2-of-3: $1.2M end value, +15.9% CAGR, 0.56 Sharpe, -61.1% max DD. Composite 3-of-3: $893K, +14.1% CAGR, 0.56 Sharpe, -50.1% max DD.</w:t>
+        <w:t>Composite 2-of-3: $1.1M end value, +15.5% CAGR, 0.55 Sharpe, -61.1% max DD. Composite 3-of-3: $836K, +13.6% CAGR, 0.55 Sharpe, -50.1% max DD.</w:t>
       </w:r>
     </w:p>
     <w:p>
@@ -4665,7 +4679,7 @@
                 <w:b/>
                 <w:sz w:val="18"/>
               </w:rPr>
-              <w:t>$10.2M</w:t>
+              <w:t>$9.5M</w:t>
             </w:r>
           </w:p>
         </w:tc>
@@ -4682,7 +4696,7 @@
                 <w:b/>
                 <w:sz w:val="18"/>
               </w:rPr>
-              <w:t>+32.0%</w:t>
+              <w:t>+31.4%</w:t>
             </w:r>
           </w:p>
         </w:tc>
@@ -4699,7 +4713,7 @@
                 <w:b/>
                 <w:sz w:val="18"/>
               </w:rPr>
-              <w:t>0.78</w:t>
+              <w:t>0.77</w:t>
             </w:r>
           </w:p>
         </w:tc>
@@ -4784,7 +4798,7 @@
               <w:rPr>
                 <w:sz w:val="18"/>
               </w:rPr>
-              <w:t>$4.3M</w:t>
+              <w:t>$4.0M</w:t>
             </w:r>
           </w:p>
         </w:tc>
@@ -4800,7 +4814,7 @@
               <w:rPr>
                 <w:sz w:val="18"/>
               </w:rPr>
-              <w:t>+25.3%</w:t>
+              <w:t>+24.8%</w:t>
             </w:r>
           </w:p>
         </w:tc>
@@ -4816,7 +4830,7 @@
               <w:rPr>
                 <w:sz w:val="18"/>
               </w:rPr>
-              <w:t>0.72</w:t>
+              <w:t>0.71</w:t>
             </w:r>
           </w:p>
         </w:tc>
@@ -4898,7 +4912,7 @@
               <w:rPr>
                 <w:sz w:val="18"/>
               </w:rPr>
-              <w:t>$607K</w:t>
+              <w:t>$570K</w:t>
             </w:r>
           </w:p>
         </w:tc>
@@ -4914,7 +4928,7 @@
               <w:rPr>
                 <w:sz w:val="18"/>
               </w:rPr>
-              <w:t>+11.4%</w:t>
+              <w:t>+11.0%</w:t>
             </w:r>
           </w:p>
         </w:tc>
@@ -4930,7 +4944,7 @@
               <w:rPr>
                 <w:sz w:val="18"/>
               </w:rPr>
-              <w:t>0.46</w:t>
+              <w:t>0.45</w:t>
             </w:r>
           </w:p>
         </w:tc>
@@ -5012,7 +5026,7 @@
               <w:rPr>
                 <w:sz w:val="18"/>
               </w:rPr>
-              <w:t>$3.3M</w:t>
+              <w:t>$3.2M</w:t>
             </w:r>
           </w:p>
         </w:tc>
@@ -5028,7 +5042,7 @@
               <w:rPr>
                 <w:sz w:val="18"/>
               </w:rPr>
-              <w:t>+23.5%</w:t>
+              <w:t>+23.1%</w:t>
             </w:r>
           </w:p>
         </w:tc>
@@ -5044,7 +5058,7 @@
               <w:rPr>
                 <w:sz w:val="18"/>
               </w:rPr>
-              <w:t>0.83</w:t>
+              <w:t>0.82</w:t>
             </w:r>
           </w:p>
         </w:tc>
@@ -5128,7 +5142,7 @@
                 <w:b/>
                 <w:sz w:val="18"/>
               </w:rPr>
-              <w:t>$9.0M</w:t>
+              <w:t>$8.4M</w:t>
             </w:r>
           </w:p>
         </w:tc>
@@ -5145,7 +5159,7 @@
                 <w:b/>
                 <w:sz w:val="18"/>
               </w:rPr>
-              <w:t>+31.0%</w:t>
+              <w:t>+30.5%</w:t>
             </w:r>
           </w:p>
         </w:tc>
@@ -5162,7 +5176,7 @@
                 <w:b/>
                 <w:sz w:val="18"/>
               </w:rPr>
-              <w:t>0.86</w:t>
+              <w:t>0.85</w:t>
             </w:r>
           </w:p>
         </w:tc>
@@ -5247,7 +5261,7 @@
               <w:rPr>
                 <w:sz w:val="18"/>
               </w:rPr>
-              <w:t>$1.2M</w:t>
+              <w:t>$1.1M</w:t>
             </w:r>
           </w:p>
         </w:tc>
@@ -5263,7 +5277,7 @@
               <w:rPr>
                 <w:sz w:val="18"/>
               </w:rPr>
-              <w:t>+15.9%</w:t>
+              <w:t>+15.5%</w:t>
             </w:r>
           </w:p>
         </w:tc>
@@ -5279,7 +5293,7 @@
               <w:rPr>
                 <w:sz w:val="18"/>
               </w:rPr>
-              <w:t>0.56</w:t>
+              <w:t>0.55</w:t>
             </w:r>
           </w:p>
         </w:tc>
@@ -5376,7 +5390,7 @@
     <w:p/>
     <w:p>
       <w:r>
-        <w:t>The risk/return scatter tells the story. DD25%/Cool40 sits in the sweet spot: it preserved 88% of buy-and-hold's terminal value while cutting the maximum drawdown nearly in half over this test period. It was the best risk-adjusted performer in the analysis -- though, as noted above, nearby parameter combinations produced similar results.</w:t>
+        <w:t>The risk/return scatter tells the story. DD25%/Cool40 sits in the sweet spot: it preserved 88% of buy-and-hold's terminal value while cutting the maximum drawdown by 35 percentage points over this test period. It was the best risk-adjusted performer in the analysis -- though, as noted above, nearby parameter combinations produced similar results.</w:t>
       </w:r>
     </w:p>
     <w:p>
@@ -5421,7 +5435,7 @@
     <w:p/>
     <w:p>
       <w:r>
-        <w:t>HFEA is a respectable second on Sharpe (0.83) thanks to its strong Sortino ratio, but its -70.5% max drawdown means it didn't solve the core problem. Dual Momentum and Composite sacrifice too much return for the risk reduction they provide. The VIX filter either destroys returns (tight thresholds) or barely reduces risk (VIX &lt; 30).</w:t>
+        <w:t>HFEA is a respectable second on Sharpe (0.82) thanks to its strong Sortino ratio, but its -70.5% max drawdown means it didn't solve the core problem. Dual Momentum and Composite sacrifice too much return for the risk reduction they provide. The VIX filter either destroys returns (tight thresholds) or barely reduces risk (VIX &lt; 30).</w:t>
       </w:r>
     </w:p>
     <w:p>
@@ -5452,7 +5466,7 @@
     </w:p>
     <w:p>
       <w:r>
-        <w:t>The result: DD25%/Cool40's 0.86 Sharpe sits at the peak of a broad green plateau. Adjacent cells DD20-25%/Cool30-40 all produce Sharpe ratios above 0.75. You can shift the threshold by 5 percentage points or the cooling period by 10 days in either direction and still get strong risk-adjusted performance. This is not a fragile optimum -- it's a broad plateau of strong performance within this test period.</w:t>
+        <w:t>The result: DD25%/Cool40's 0.85 Sharpe sits at the peak of a broad green plateau. Adjacent cells DD20-25%/Cool20-40 all produce Sharpe ratios above 0.74. You can shift the threshold by 5 percentage points or the cooling period by 10 days in either direction and still get strong risk-adjusted performance. This is not a fragile optimum -- it's a broad plateau of strong performance within this test period.</w:t>
       </w:r>
     </w:p>
     <w:p>
@@ -5519,7 +5533,7 @@
         <w:t>not</w:t>
       </w:r>
       <w:r>
-        <w:t xml:space="preserve"> DD25%/Cool40. But when applied to the 2017-2026 out-of-sample period, DD30%/Cool10 delivered a 30.4% CAGR, 0.76 Sharpe, and -64.7% max drawdown. The strategy still works out-of-sample, even though the exact best parameters shifted.</w:t>
+        <w:t xml:space="preserve"> DD25%/Cool40. But when applied to the 2017-2026 out-of-sample period, DD30%/Cool10 delivered a 29.5% CAGR, 0.74 Sharpe, and -64.7% max drawdown. The strategy still works out-of-sample, even though the exact best parameters shifted.</w:t>
       </w:r>
     </w:p>
     <w:p>
@@ -5687,7 +5701,7 @@
               <w:rPr>
                 <w:sz w:val="18"/>
               </w:rPr>
-              <w:t>+30.4%</w:t>
+              <w:t>+29.5%</w:t>
             </w:r>
           </w:p>
         </w:tc>
@@ -5737,7 +5751,7 @@
               <w:rPr>
                 <w:sz w:val="18"/>
               </w:rPr>
-              <w:t>0.76</w:t>
+              <w:t>0.74</w:t>
             </w:r>
           </w:p>
         </w:tc>
@@ -5859,7 +5873,7 @@
     </w:p>
     <w:p>
       <w:r>
-        <w:t>Over the full 1993-2026 period, DD25%/Cool40 slightly outperformed B&amp;H: 21.2% CAGR vs 20.9% CAGR, with a 0.62 Sharpe vs 0.58. The drawdown exit earns its keep mostly by surviving the catastrophic periods, then riding the recovery.</w:t>
+        <w:t>Over the full 1993-2026 period, DD25%/Cool40 slightly outperformed B&amp;H: 20.9% CAGR vs 20.6% CAGR, with a 0.61 Sharpe vs 0.57. The drawdown exit earns its keep mostly by surviving the catastrophic periods, then riding the recovery.</w:t>
       </w:r>
     </w:p>
     <w:tbl>
@@ -6058,7 +6072,7 @@
               <w:rPr>
                 <w:sz w:val="18"/>
               </w:rPr>
-              <w:t>-0.04</w:t>
+              <w:t>-0.08</w:t>
             </w:r>
           </w:p>
         </w:tc>
@@ -6156,7 +6170,7 @@
               <w:rPr>
                 <w:sz w:val="18"/>
               </w:rPr>
-              <w:t>-0.21</w:t>
+              <w:t>-0.27</w:t>
             </w:r>
           </w:p>
         </w:tc>
@@ -6222,7 +6236,7 @@
               <w:rPr>
                 <w:sz w:val="18"/>
               </w:rPr>
-              <w:t>$52.3M</w:t>
+              <w:t>$49.1M</w:t>
             </w:r>
           </w:p>
         </w:tc>
@@ -6238,7 +6252,7 @@
               <w:rPr>
                 <w:sz w:val="18"/>
               </w:rPr>
-              <w:t>+20.9%</w:t>
+              <w:t>+20.6%</w:t>
             </w:r>
           </w:p>
         </w:tc>
@@ -6254,7 +6268,7 @@
               <w:rPr>
                 <w:sz w:val="18"/>
               </w:rPr>
-              <w:t>0.62</w:t>
+              <w:t>0.57</w:t>
             </w:r>
           </w:p>
         </w:tc>
@@ -6320,7 +6334,7 @@
               <w:rPr>
                 <w:sz w:val="18"/>
               </w:rPr>
-              <w:t>$56.9M</w:t>
+              <w:t>$53.4M</w:t>
             </w:r>
           </w:p>
         </w:tc>
@@ -6336,7 +6350,7 @@
               <w:rPr>
                 <w:sz w:val="18"/>
               </w:rPr>
-              <w:t>+21.2%</w:t>
+              <w:t>+20.9%</w:t>
             </w:r>
           </w:p>
         </w:tc>
@@ -6352,7 +6366,7 @@
               <w:rPr>
                 <w:sz w:val="18"/>
               </w:rPr>
-              <w:t>0.68</w:t>
+              <w:t>0.61</w:t>
             </w:r>
           </w:p>
         </w:tc>
@@ -6572,7 +6586,7 @@
               <w:rPr>
                 <w:sz w:val="18"/>
               </w:rPr>
-              <w:t>$9.0M</w:t>
+              <w:t>$8.4M</w:t>
             </w:r>
           </w:p>
         </w:tc>
@@ -6588,7 +6602,7 @@
               <w:rPr>
                 <w:sz w:val="18"/>
               </w:rPr>
-              <w:t>+31.0%</w:t>
+              <w:t>+30.5%</w:t>
             </w:r>
           </w:p>
         </w:tc>
@@ -6604,7 +6618,7 @@
               <w:rPr>
                 <w:sz w:val="18"/>
               </w:rPr>
-              <w:t>0.86</w:t>
+              <w:t>0.85</w:t>
             </w:r>
           </w:p>
         </w:tc>
@@ -6654,7 +6668,7 @@
               <w:rPr>
                 <w:sz w:val="18"/>
               </w:rPr>
-              <w:t>$4.6M</w:t>
+              <w:t>$4.3M</w:t>
             </w:r>
           </w:p>
         </w:tc>
@@ -6670,7 +6684,7 @@
               <w:rPr>
                 <w:sz w:val="18"/>
               </w:rPr>
-              <w:t>+25.8%</w:t>
+              <w:t>+25.3%</w:t>
             </w:r>
           </w:p>
         </w:tc>
@@ -6686,7 +6700,7 @@
               <w:rPr>
                 <w:sz w:val="18"/>
               </w:rPr>
-              <w:t>0.77</w:t>
+              <w:t>0.76</w:t>
             </w:r>
           </w:p>
         </w:tc>
@@ -6736,7 +6750,7 @@
               <w:rPr>
                 <w:sz w:val="18"/>
               </w:rPr>
-              <w:t>$2.3M</w:t>
+              <w:t>$2.1M</w:t>
             </w:r>
           </w:p>
         </w:tc>
@@ -6752,7 +6766,7 @@
               <w:rPr>
                 <w:sz w:val="18"/>
               </w:rPr>
-              <w:t>+20.7%</w:t>
+              <w:t>+20.2%</w:t>
             </w:r>
           </w:p>
         </w:tc>
@@ -6768,7 +6782,7 @@
               <w:rPr>
                 <w:sz w:val="18"/>
               </w:rPr>
-              <w:t>0.67</w:t>
+              <w:t>0.65</w:t>
             </w:r>
           </w:p>
         </w:tc>
@@ -6818,7 +6832,7 @@
               <w:rPr>
                 <w:sz w:val="18"/>
               </w:rPr>
-              <w:t>$1.6M</w:t>
+              <w:t>$1.5M</w:t>
             </w:r>
           </w:p>
         </w:tc>
@@ -6834,7 +6848,7 @@
               <w:rPr>
                 <w:sz w:val="18"/>
               </w:rPr>
-              <w:t>+18.2%</w:t>
+              <w:t>+17.7%</w:t>
             </w:r>
           </w:p>
         </w:tc>
@@ -6850,7 +6864,7 @@
               <w:rPr>
                 <w:sz w:val="18"/>
               </w:rPr>
-              <w:t>0.61</w:t>
+              <w:t>0.60</w:t>
             </w:r>
           </w:p>
         </w:tc>
@@ -7113,7 +7127,7 @@
                 <w:b/>
                 <w:sz w:val="18"/>
               </w:rPr>
-              <w:t>$9.0M</w:t>
+              <w:t>$8.4M</w:t>
             </w:r>
           </w:p>
         </w:tc>
@@ -7130,7 +7144,7 @@
                 <w:b/>
                 <w:sz w:val="18"/>
               </w:rPr>
-              <w:t>+31.0%</w:t>
+              <w:t>+30.5%</w:t>
             </w:r>
           </w:p>
         </w:tc>
@@ -7147,7 +7161,7 @@
                 <w:b/>
                 <w:sz w:val="18"/>
               </w:rPr>
-              <w:t>0.86</w:t>
+              <w:t>0.85</w:t>
             </w:r>
           </w:p>
         </w:tc>
@@ -7248,7 +7262,7 @@
               <w:rPr>
                 <w:sz w:val="18"/>
               </w:rPr>
-              <w:t>+16.3%</w:t>
+              <w:t>+15.9%</w:t>
             </w:r>
           </w:p>
         </w:tc>
@@ -7264,7 +7278,7 @@
               <w:rPr>
                 <w:sz w:val="18"/>
               </w:rPr>
-              <w:t>0.57</w:t>
+              <w:t>0.56</w:t>
             </w:r>
           </w:p>
         </w:tc>
@@ -7346,7 +7360,7 @@
               <w:rPr>
                 <w:sz w:val="18"/>
               </w:rPr>
-              <w:t>$2.7M</w:t>
+              <w:t>$2.6M</w:t>
             </w:r>
           </w:p>
         </w:tc>
@@ -7362,7 +7376,7 @@
               <w:rPr>
                 <w:sz w:val="18"/>
               </w:rPr>
-              <w:t>+22.0%</w:t>
+              <w:t>+21.5%</w:t>
             </w:r>
           </w:p>
         </w:tc>
@@ -7378,7 +7392,7 @@
               <w:rPr>
                 <w:sz w:val="18"/>
               </w:rPr>
-              <w:t>0.73</w:t>
+              <w:t>0.72</w:t>
             </w:r>
           </w:p>
         </w:tc>
@@ -7410,7 +7424,7 @@
               <w:rPr>
                 <w:sz w:val="18"/>
               </w:rPr>
-              <w:t>167</w:t>
+              <w:t>170</w:t>
             </w:r>
           </w:p>
         </w:tc>
@@ -7574,7 +7588,7 @@
               <w:rPr>
                 <w:sz w:val="18"/>
               </w:rPr>
-              <w:t>$836K</w:t>
+              <w:t>$784K</w:t>
             </w:r>
           </w:p>
         </w:tc>
@@ -7590,7 +7604,7 @@
               <w:rPr>
                 <w:sz w:val="18"/>
               </w:rPr>
-              <w:t>+13.6%</w:t>
+              <w:t>+13.2%</w:t>
             </w:r>
           </w:p>
         </w:tc>
@@ -7606,7 +7620,7 @@
               <w:rPr>
                 <w:sz w:val="18"/>
               </w:rPr>
-              <w:t>0.50</w:t>
+              <w:t>0.49</w:t>
             </w:r>
           </w:p>
         </w:tc>
@@ -7663,7 +7677,7 @@
     <w:p/>
     <w:p>
       <w:r>
-        <w:t xml:space="preserve">None of the pure SMA filters come close to DD25%/Cool40 on any metric. SMA100 is the best of the group -- a 22.0% CAGR with a 0.73 Sharpe and -46.0% max drawdown -- but it still trails the drawdown exit by 9 percentage points of CAGR with a worse Sharpe and worse max drawdown. SMA50 whipsaws excessively (282 trades over 16 years) and bleeds returns through false signals. The 2% buffer variant actually makes things </w:t>
+        <w:t xml:space="preserve">None of the pure SMA filters come close to DD25%/Cool40 on any metric. SMA100 is the best of the group -- a 21.5% CAGR with a 0.72 Sharpe and -46.0% max drawdown -- but it still trails the drawdown exit by 9 percentage points of CAGR with a worse Sharpe. SMA50 whipsaws excessively (282 trades over 16 years) and bleeds returns through false signals. The 2% buffer variant actually makes things </w:t>
       </w:r>
       <w:r>
         <w:rPr>
@@ -8867,7 +8881,7 @@
     </w:p>
     <w:p>
       <w:r>
-        <w:t>The result: the drawdown exit strategy produced a higher Sharpe ratio than buy-and-hold in only 35% of simulated paths, with a median Sharpe improvement of -0.05. This is the most important finding in the entire analysis. It means the strategy's Sharpe advantage over buy-and-hold is not a general property of the return distribution -- it is regime-conditional, dependent on the specific sequencing of bull runs followed by sharp crashes that characterized 2009-2026. In randomly reordered histories, the advantage usually disappears.</w:t>
+        <w:t>The result: the drawdown exit strategy produced a higher Sharpe ratio than buy-and-hold in only 36% of simulated paths, with a median Sharpe improvement of -0.05. This is the most important finding in the entire analysis. It means the strategy's Sharpe advantage over buy-and-hold is not a general property of the return distribution -- it is regime-conditional, dependent on the specific sequencing of bull runs followed by sharp crashes that characterized 2009-2026. In randomly reordered histories, the advantage usually disappears.</w:t>
       </w:r>
     </w:p>
     <w:p>
@@ -9092,7 +9106,7 @@
                 <w:b/>
                 <w:sz w:val="18"/>
               </w:rPr>
-              <w:t>$9.0M</w:t>
+              <w:t>$8.4M</w:t>
             </w:r>
           </w:p>
         </w:tc>
@@ -9109,7 +9123,7 @@
                 <w:b/>
                 <w:sz w:val="18"/>
               </w:rPr>
-              <w:t>+31.0%</w:t>
+              <w:t>+30.5%</w:t>
             </w:r>
           </w:p>
         </w:tc>
@@ -9126,7 +9140,7 @@
                 <w:b/>
                 <w:sz w:val="18"/>
               </w:rPr>
-              <w:t>0.86</w:t>
+              <w:t>0.85</w:t>
             </w:r>
           </w:p>
         </w:tc>
@@ -9194,7 +9208,7 @@
               <w:rPr>
                 <w:sz w:val="18"/>
               </w:rPr>
-              <w:t>$1.6M</w:t>
+              <w:t>$1.4M</w:t>
             </w:r>
           </w:p>
         </w:tc>
@@ -9210,7 +9224,7 @@
               <w:rPr>
                 <w:sz w:val="18"/>
               </w:rPr>
-              <w:t>+17.4%</w:t>
+              <w:t>+17.0%</w:t>
             </w:r>
           </w:p>
         </w:tc>
@@ -9226,7 +9240,7 @@
               <w:rPr>
                 <w:sz w:val="18"/>
               </w:rPr>
-              <w:t>0.63</w:t>
+              <w:t>0.62</w:t>
             </w:r>
           </w:p>
         </w:tc>
@@ -9258,7 +9272,7 @@
               <w:rPr>
                 <w:sz w:val="18"/>
               </w:rPr>
-              <w:t>129</w:t>
+              <w:t>130</w:t>
             </w:r>
           </w:p>
         </w:tc>
@@ -9292,7 +9306,7 @@
               <w:rPr>
                 <w:sz w:val="18"/>
               </w:rPr>
-              <w:t>$2.3M</w:t>
+              <w:t>$2.0M</w:t>
             </w:r>
           </w:p>
         </w:tc>
@@ -9308,7 +9322,7 @@
               <w:rPr>
                 <w:sz w:val="18"/>
               </w:rPr>
-              <w:t>+20.1%</w:t>
+              <w:t>+19.6%</w:t>
             </w:r>
           </w:p>
         </w:tc>
@@ -9324,7 +9338,7 @@
               <w:rPr>
                 <w:sz w:val="18"/>
               </w:rPr>
-              <w:t>0.68</w:t>
+              <w:t>0.67</w:t>
             </w:r>
           </w:p>
         </w:tc>
@@ -9390,7 +9404,7 @@
               <w:rPr>
                 <w:sz w:val="18"/>
               </w:rPr>
-              <w:t>$1.3M</w:t>
+              <w:t>$1.1M</w:t>
             </w:r>
           </w:p>
         </w:tc>
@@ -9406,7 +9420,7 @@
               <w:rPr>
                 <w:sz w:val="18"/>
               </w:rPr>
-              <w:t>+16.0%</w:t>
+              <w:t>+15.5%</w:t>
             </w:r>
           </w:p>
         </w:tc>
@@ -9422,7 +9436,7 @@
               <w:rPr>
                 <w:sz w:val="18"/>
               </w:rPr>
-              <w:t>0.56</w:t>
+              <w:t>0.55</w:t>
             </w:r>
           </w:p>
         </w:tc>
@@ -9488,7 +9502,7 @@
               <w:rPr>
                 <w:sz w:val="18"/>
               </w:rPr>
-              <w:t>$3.6M</w:t>
+              <w:t>$3.4M</w:t>
             </w:r>
           </w:p>
         </w:tc>
@@ -9504,7 +9518,7 @@
               <w:rPr>
                 <w:sz w:val="18"/>
               </w:rPr>
-              <w:t>+24.4%</w:t>
+              <w:t>+23.9%</w:t>
             </w:r>
           </w:p>
         </w:tc>
@@ -9520,7 +9534,7 @@
               <w:rPr>
                 <w:sz w:val="18"/>
               </w:rPr>
-              <w:t>0.72</w:t>
+              <w:t>0.71</w:t>
             </w:r>
           </w:p>
         </w:tc>
@@ -9561,7 +9575,7 @@
     <w:p/>
     <w:p>
       <w:r>
-        <w:t>The volatility-normalized variants all underperform the fixed 25% rule. The best (k=7) achieves a 0.72 Sharpe with far more trades. This is a failed generalization test: the theoretically "smarter" adaptive threshold does not improve on the simple fixed rule over this period. The likely explanation is practical rather than deep -- a constant threshold produces fewer false signals during calm periods (when rolling volatility is low and the normalized threshold would be too tight) and remains effective during crises (when volatility spikes and the normalized threshold would be too loose). The result increases confidence that 25% is a practically useful threshold for UPRO, but it does not demonstrate that the number has any structural optimality beyond being well-matched to UPRO's realized volatility during 2009-2026.</w:t>
+        <w:t>The volatility-normalized variants all underperform the fixed 25% rule. The best (k=7) achieves a 0.71 Sharpe with more trades (43 vs. 31). This is a failed generalization test: the theoretically "smarter" adaptive threshold does not improve on the simple fixed rule over this period. The likely explanation is practical rather than deep -- a constant threshold produces fewer false signals during calm periods (when rolling volatility is low and the normalized threshold would be too tight) and remains effective during crises (when volatility spikes and the normalized threshold would be too loose). The result increases confidence that 25% is a practically useful threshold for UPRO, but it does not demonstrate that the number has any structural optimality beyond being well-matched to UPRO's realized volatility during 2009-2026.</w:t>
       </w:r>
     </w:p>
     <w:p>
@@ -9790,7 +9804,7 @@
               <w:rPr>
                 <w:sz w:val="18"/>
               </w:rPr>
-              <w:t>$9.0M</w:t>
+              <w:t>$8.4M</w:t>
             </w:r>
           </w:p>
         </w:tc>
@@ -9806,7 +9820,7 @@
               <w:rPr>
                 <w:sz w:val="18"/>
               </w:rPr>
-              <w:t>+31.0%</w:t>
+              <w:t>+30.5%</w:t>
             </w:r>
           </w:p>
         </w:tc>
@@ -9822,7 +9836,7 @@
               <w:rPr>
                 <w:sz w:val="18"/>
               </w:rPr>
-              <w:t>0.86</w:t>
+              <w:t>0.85</w:t>
             </w:r>
           </w:p>
         </w:tc>
@@ -9838,7 +9852,7 @@
               <w:rPr>
                 <w:sz w:val="18"/>
               </w:rPr>
-              <w:t>1.06</w:t>
+              <w:t>1.05</w:t>
             </w:r>
           </w:p>
         </w:tc>
@@ -9870,7 +9884,7 @@
               <w:rPr>
                 <w:sz w:val="18"/>
               </w:rPr>
-              <w:t>0.71</w:t>
+              <w:t>0.70</w:t>
             </w:r>
           </w:p>
         </w:tc>
@@ -9906,7 +9920,7 @@
                 <w:b/>
                 <w:sz w:val="18"/>
               </w:rPr>
-              <w:t>$11.1M</w:t>
+              <w:t>$10.4M</w:t>
             </w:r>
           </w:p>
         </w:tc>
@@ -9923,7 +9937,7 @@
                 <w:b/>
                 <w:sz w:val="18"/>
               </w:rPr>
-              <w:t>+32.7%</w:t>
+              <w:t>+32.1%</w:t>
             </w:r>
           </w:p>
         </w:tc>
@@ -9940,7 +9954,7 @@
                 <w:b/>
                 <w:sz w:val="18"/>
               </w:rPr>
-              <w:t>0.89</w:t>
+              <w:t>0.88</w:t>
             </w:r>
           </w:p>
         </w:tc>
@@ -9957,7 +9971,7 @@
                 <w:b/>
                 <w:sz w:val="18"/>
               </w:rPr>
-              <w:t>1.13</w:t>
+              <w:t>1.12</w:t>
             </w:r>
           </w:p>
         </w:tc>
@@ -9991,7 +10005,7 @@
                 <w:b/>
                 <w:sz w:val="18"/>
               </w:rPr>
-              <w:t>0.57</w:t>
+              <w:t>0.56</w:t>
             </w:r>
           </w:p>
         </w:tc>
@@ -10025,7 +10039,7 @@
               <w:rPr>
                 <w:sz w:val="18"/>
               </w:rPr>
-              <w:t>$12.1M</w:t>
+              <w:t>$11.3M</w:t>
             </w:r>
           </w:p>
         </w:tc>
@@ -10041,7 +10055,7 @@
               <w:rPr>
                 <w:sz w:val="18"/>
               </w:rPr>
-              <w:t>+33.4%</w:t>
+              <w:t>+32.8%</w:t>
             </w:r>
           </w:p>
         </w:tc>
@@ -10057,7 +10071,7 @@
               <w:rPr>
                 <w:sz w:val="18"/>
               </w:rPr>
-              <w:t>0.84</w:t>
+              <w:t>0.83</w:t>
             </w:r>
           </w:p>
         </w:tc>
@@ -10073,7 +10087,7 @@
               <w:rPr>
                 <w:sz w:val="18"/>
               </w:rPr>
-              <w:t>1.09</w:t>
+              <w:t>1.08</w:t>
             </w:r>
           </w:p>
         </w:tc>
@@ -10105,7 +10119,7 @@
               <w:rPr>
                 <w:sz w:val="18"/>
               </w:rPr>
-              <w:t>0.42</w:t>
+              <w:t>0.41</w:t>
             </w:r>
           </w:p>
         </w:tc>
@@ -10139,7 +10153,7 @@
               <w:rPr>
                 <w:sz w:val="18"/>
               </w:rPr>
-              <w:t>*$10.2M*</w:t>
+              <w:t>*$9.5M*</w:t>
             </w:r>
           </w:p>
         </w:tc>
@@ -10155,7 +10169,7 @@
               <w:rPr>
                 <w:sz w:val="18"/>
               </w:rPr>
-              <w:t>*+32.0%*</w:t>
+              <w:t>*+31.4%*</w:t>
             </w:r>
           </w:p>
         </w:tc>
@@ -10171,7 +10185,7 @@
               <w:rPr>
                 <w:sz w:val="18"/>
               </w:rPr>
-              <w:t>*0.78*</w:t>
+              <w:t>*0.77*</w:t>
             </w:r>
           </w:p>
         </w:tc>
@@ -10187,7 +10201,7 @@
               <w:rPr>
                 <w:sz w:val="18"/>
               </w:rPr>
-              <w:t>*0.96*</w:t>
+              <w:t>*0.95*</w:t>
             </w:r>
           </w:p>
         </w:tc>
@@ -10219,7 +10233,7 @@
               <w:rPr>
                 <w:sz w:val="18"/>
               </w:rPr>
-              <w:t>*0.40*</w:t>
+              <w:t>*0.39*</w:t>
             </w:r>
           </w:p>
         </w:tc>
@@ -10228,7 +10242,7 @@
     <w:p/>
     <w:p>
       <w:r>
-        <w:t>Both bond variants beat UPRO buy-and-hold on terminal wealth: TLT ($11.1M) and TMF ($12.1M) versus B&amp;H's $10.2M. But TLT is the standout on risk-adjusted metrics. It achieves the highest Sharpe ratio in the entire analysis (0.89) with a manageable -55.3% max drawdown. The Sortino ratio (1.13) is also the best, reflecting particularly good downside risk management. TMF generates even more terminal wealth ($12.1M) but at -76.7% max drawdown -- essentially giving back the entire drawdown advantage that makes the timing strategy worthwhile.</w:t>
+        <w:t>Both bond variants beat the T-bill baseline on terminal wealth and Sharpe: TLT ($10.4M) and TMF ($11.3M) versus T-bills' $8.4M. TLT is the standout on risk-adjusted metrics. It achieves the highest Sharpe ratio in the entire analysis (0.88) with a manageable -55.3% max drawdown. The Sortino ratio (1.12) is also the best, reflecting particularly good downside risk management. TMF edges TLT on terminal wealth but at -76.7% max drawdown -- essentially giving back the entire drawdown advantage that makes the timing strategy worthwhile.</w:t>
       </w:r>
     </w:p>
     <w:p>
@@ -11579,7 +11593,7 @@
     <w:p/>
     <w:p>
       <w:r>
-        <w:t>The pattern is clear. During genuine flight-to-quality events (2011 debt ceiling, 2018 tightening scare, COVID, late 2023), TLT delivers strong positive returns while you're out of UPRO. During rate-hiking periods (2022), TLT loses money -- but the losses are manageable (-7% to -10%), not catastrophic. T-bills, by contrast, earned essentially nothing during the ZIRP years (2010-2016, 2020) and only meaningful returns once the Fed started hiking in 2022 -- precisely the periods where TLT was losing money.</w:t>
+        <w:t>The pattern is clear. During genuine flight-to-quality events (2011 debt ceiling, 2018 tightening scare, COVID, late 2023), TLT delivers strong positive returns while you're out of UPRO. During rate-hiking periods (2022), TLT loses money -- but the losses are manageable (-7% to -10%), not catastrophic. T-bills, by contrast, earned essentially nothing during the ZIRP (zero interest-rate policy) years (2010-2016, 2020) and only meaningful returns once the Fed started hiking in 2022 -- precisely the periods where TLT was losing money.</w:t>
       </w:r>
     </w:p>
     <w:p>
@@ -11597,7 +11611,7 @@
     </w:p>
     <w:p>
       <w:r>
-        <w:t>TLT cash adds roughly 13 percentage points of max drawdown risk (-55% vs -42%) compared to T-bill cash. That's real. The source is 2022: three consecutive cash periods where TLT lost ground instead of providing shelter. In a T-bill world, those periods earned 0-5%. In a TLT world, they lost 8-10% each.</w:t>
+        <w:t>TLT cash adds roughly 14 percentage points of max drawdown risk (-55% vs -42%) compared to T-bill cash. That's real. The source is 2022: three consecutive cash periods where TLT lost ground instead of providing shelter. In a T-bill world, those periods earned 0-5%. In a TLT world, they lost 8-10% each.</w:t>
       </w:r>
     </w:p>
     <w:p>
@@ -11613,7 +11627,7 @@
         <w:t>Bottom line:</w:t>
       </w:r>
       <w:r>
-        <w:t xml:space="preserve"> TLT cash is the recommended variant for investors willing to accept a -55% max drawdown (vs -42%) in exchange for higher total returns and the best risk-adjusted performance in the analysis. For investors who prioritize minimizing drawdowns above all else, T-bill cash remains the safer choice. TMF is not recommended -- it gives back the entire drawdown advantage that makes the timing strategy worthwhile.</w:t>
+        <w:t xml:space="preserve"> TLT cash is the recommended variant for investors willing to accept a -55% max drawdown (vs -42%) in exchange for higher total returns and the best risk-adjusted performance in the analysis. For investors who prioritize minimizing drawdowns above all else, T-bill cash remains the safer choice. TMF is not recommended -- it gives back the entire drawdown advantage that makes the timing strategy worthwhile, with a -77% max drawdown nearly matching UPRO buy-and-hold.</w:t>
       </w:r>
     </w:p>
     <w:p>
@@ -11766,7 +11780,7 @@
         <w:t>Tax considerations.</w:t>
       </w:r>
       <w:r>
-        <w:t xml:space="preserve"> Each exit is a taxable event. At roughly 15 round-trip trades over 16+ years (~1 per year), this is manageable but real. In an IRA or 401(k), it's a non-issue. In a taxable account, most exits are actually gains (12 of 15 historically) because the 25% drawdown trigger fires from the all-time high, not from the entry price -- so exits typically occur well above where you bought in. The three loss exits (early 2012, early 2016, spring 2022) came from quick whipsaws where re-entry was followed by another drawdown, and those do provide tax-loss harvesting opportunities.</w:t>
+        <w:t xml:space="preserve"> Each exit is a taxable event. At roughly 15 round-trip trades (31 total signals) over 16+ years (~1 per year), this is manageable but real. In an IRA or 401(k), it's a non-issue. In a taxable account, most exits are actually gains (12 of 15 historically) because the 25% drawdown trigger fires from the all-time high, not from the entry price -- so exits typically occur well above where you bought in. The three loss exits (early 2012, early 2016, spring 2022) came from quick whipsaws where re-entry was followed by another drawdown, and those do provide tax-loss harvesting opportunities.</w:t>
       </w:r>
     </w:p>
     <w:p>
@@ -11788,7 +11802,7 @@
         <w:t>Cash vehicle.</w:t>
       </w:r>
       <w:r>
-        <w:t xml:space="preserve"> The baseline backtest uses T-bill rates during cash periods. The TLT variant -- buying long-term Treasuries during cooling periods -- produced the highest Sharpe ratio (0.89) and actually beat buy-and-hold on terminal wealth. See the "What to Do With Idle Cash" section for the full comparison.</w:t>
+        <w:t xml:space="preserve"> The baseline backtest uses T-bill rates during cash periods. The TLT variant -- buying long-term Treasuries during cooling periods -- produced the highest Sharpe ratio (0.88) and actually beat buy-and-hold on terminal wealth. See the "What to Do With Idle Cash" section for the full comparison.</w:t>
       </w:r>
     </w:p>
     <w:p>
@@ -11812,7 +11826,7 @@
     </w:p>
     <w:p>
       <w:r>
-        <w:t>If you had been following the DD25%/Cool40 strategy from UPRO's inception, here's your current position as of March 2, 2026:</w:t>
+        <w:t>If you had been following the DD25%/Cool40 strategy from UPRO's inception, here's your current position as of March 7, 2026:</w:t>
       </w:r>
     </w:p>
     <w:p>
@@ -11823,12 +11837,12 @@
         <w:t>Status: IN (holding UPRO).</w:t>
       </w:r>
       <w:r>
-        <w:t xml:space="preserve"> The strategy re-entered on May 7, 2025 at $69.28, after the 40-day cooling period expired following an exit triggered on March 11, 2025. That exit fired when UPRO fell 26.4% from its then-peak of $98.33. Your position is up +66.4% since re-entry.</w:t>
+        <w:t xml:space="preserve"> The strategy re-entered on May 7, 2025 at $69.28, after the 40-day cooling period expired following an exit triggered on March 11, 2025. That exit fired when UPRO fell 26.4% from its then-peak of $98.33. Your position is up +56.1% since re-entry.</w:t>
       </w:r>
     </w:p>
     <w:p>
       <w:r>
-        <w:t>UPRO's all-time high was $122.23 on January 12, 2026. The current price of $115.32 represents a -5.7% drawdown from that peak -- well within normal volatility and nowhere near the -25% threshold that would trigger an exit.</w:t>
+        <w:t>UPRO's all-time high was $122.23 on January 12, 2026. The current price of $108.16 represents a -11.5% drawdown from that peak -- a noticeable decline but still well below the -25% threshold that would trigger an exit.</w:t>
       </w:r>
     </w:p>
     <w:p>
@@ -11908,7 +11922,7 @@
     </w:p>
     <w:p>
       <w:r>
-        <w:t>The pattern is instructive. The strategy sat out the worst of the 2022 bear market, re-entered in late 2022, caught the 2023-2024 rally, stepped aside during the early-2025 correction, and is now fully invested again. If UPRO drops 25% from its January 2026 high -- roughly below $91.67 -- the exit trigger will fire. Until then, you hold.</w:t>
+        <w:t>The pattern is instructive. The strategy sat out the worst of the 2022 bear market, re-entered in late 2022, caught the 2023-2024 rally, stepped aside during the early-2025 correction, and is now fully invested again. If UPRO drops 25% from its January 2026 high -- roughly below $91.67 -- the exit trigger will fire. At $108.16, the current drawdown is -11.5%, so there's still a substantial buffer before the exit would activate.</w:t>
       </w:r>
     </w:p>
     <w:p>
@@ -11932,7 +11946,7 @@
         <w:t>In-sample testing, partially mitigated.</w:t>
       </w:r>
       <w:r>
-        <w:t xml:space="preserve"> I selected DD25%/Cool40 as the "winner" because it performed best on the 2009-2026 data. The parameters were not determined independently of the test data. However, the parameter heatmap shows a broad plateau of strong performance across DD20-30%/Cool20-40, and walk-forward validation confirms the strategy works out-of-sample (0.76 Sharpe on 2017-2026 data using parameters chosen from 2009-2016). The edge may shrink but is unlikely to vanish.</w:t>
+        <w:t xml:space="preserve"> I selected DD25%/Cool40 as the "winner" because it performed best on the 2009-2026 data. The parameters were not determined independently of the test data. However, the parameter heatmap shows a broad plateau of strong performance across DD20-30%/Cool20-40, and walk-forward validation confirms the strategy works out-of-sample (0.74 Sharpe on 2017-2026 data using parameters chosen from 2009-2016). The edge may shrink but is unlikely to vanish.</w:t>
       </w:r>
     </w:p>
     <w:p>
@@ -11965,7 +11979,16 @@
         <w:t>Price returns vs total returns.</w:t>
       </w:r>
       <w:r>
-        <w:t xml:space="preserve"> This analysis uses price returns only (dividends excluded for SPY and related calculations). This is a conservative assumption -- including dividends would modestly improve both the benchmark and timing strategies. UPRO itself targets 3x the daily </w:t>
+        <w:t xml:space="preserve"> This analysis uses price returns only (dividends excluded for SPY and related calculations). This is a conservative assumption -- including SPY dividends (~1.3% annual yield) would improve the SPY benchmark by roughly 1.5-2% CAGR annually, making the comparison </w:t>
+      </w:r>
+      <w:r>
+        <w:rPr>
+          <w:i/>
+        </w:rPr>
+        <w:t>more favorable to SPY</w:t>
+      </w:r>
+      <w:r>
+        <w:t xml:space="preserve"> relative to the timing strategies. UPRO itself targets 3x the daily </w:t>
       </w:r>
       <w:r>
         <w:rPr>
@@ -11974,7 +11997,7 @@
         <w:t>price</w:t>
       </w:r>
       <w:r>
-        <w:t xml:space="preserve"> return of the S&amp;P 500 (before fees), so this is the appropriate comparison for the UPRO-specific results.</w:t>
+        <w:t xml:space="preserve"> return of the S&amp;P 500 (before fees) and does not distribute dividends, so price returns are the appropriate apples-to-apples comparison for the UPRO-specific results.</w:t>
       </w:r>
     </w:p>
     <w:p>
@@ -11998,22 +12021,22 @@
     </w:p>
     <w:p>
       <w:r>
-        <w:t>Over the 2009-2026 test period, simple drawdown-triggered exits meaningfully improved UPRO's risk profile without exotic indicators, frequent trading, or complex portfolio construction. The DD25%/Cool40 rule -- exit at a 25% drawdown, wait 40 trading days before re-entering -- delivered a 0.86 Sharpe ratio while cutting the maximum drawdown from -77% to -42%.</w:t>
+        <w:t>Over the 2009-2026 test period, simple drawdown-triggered exits meaningfully improved UPRO's risk profile without exotic indicators, frequent trading, or complex portfolio construction. The DD25%/Cool40 rule -- exit at a 25% drawdown, wait 40 trading days before re-entering -- delivered a 0.85 Sharpe ratio while cutting the maximum drawdown from -77% to -42%.</w:t>
       </w:r>
     </w:p>
     <w:p>
       <w:r>
-        <w:t>Parking idle cash in TLT during cooling periods pushes the result further: a 0.89 Sharpe ratio, $11.1M terminal wealth (beating buy-and-hold's $10.2M), and a -55% max drawdown. The TLT variant exploits the flight-to-quality effect -- when stocks crash, long-term Treasuries tend to rally -- turning the cooling period from dead time into a productive hedge.</w:t>
+        <w:t>Parking idle cash in TLT during cooling periods pushes the result further: a 0.88 Sharpe ratio, $10.4M terminal wealth (beating buy-and-hold's $9.5M), and a -55% max drawdown. Block-bootstrap analysis (10,000 iterations, 20-day blocks) confirms the TLT variant's Sharpe advantage is robust: median bootstrapped Sharpe of 0.92 vs 0.89 for T-bill cash, with a 100% probability of positive Sharpe across all bootstrap samples. The TLT variant exploits the flight-to-quality effect -- when stocks crash, long-term Treasuries tend to rally -- turning the cooling period from dead time into a productive hedge.</w:t>
       </w:r>
     </w:p>
     <w:p>
       <w:r>
-        <w:t>The trade-off is explicit. The T-bill variant caps max drawdown at -42% but gives up 12% of buy-and-hold's terminal wealth. The TLT variant beats buy-and-hold on wealth but accepts a -55% max drawdown. Pick the one that matches your risk tolerance.</w:t>
+        <w:t>The trade-off is explicit. The T-bill variant caps max drawdown at -42% but gives up about 12% of buy-and-hold's terminal wealth. The TLT variant beats buy-and-hold on wealth but accepts a -55% max drawdown. Pick the one that matches your risk tolerance.</w:t>
       </w:r>
     </w:p>
     <w:p>
       <w:r>
-        <w:t>Robustness testing paints a mixed but honest picture. On the encouraging side: the DD25%/Cool40 parameters sit in a broad plateau of strong performance (not a fragile peak), walk-forward validation suggests the approach works out-of-sample, and exit diagnostics confirm the 25% trigger identifies genuine SPY stress episodes. On the cautionary side: block-bootstrap analysis shows the strategy beats buy-and-hold on Sharpe in only 35% of randomly reordered return histories, meaning the Sharpe advantage is regime-conditional -- it depends on the specific pattern of bull runs followed by sharp corrections that characterized 2009-2026. The strategy is a useful practical overlay for regimes resembling recent history, not evidence of a regime-invariant alpha source.</w:t>
+        <w:t>Robustness testing paints a mixed but honest picture. On the encouraging side: the DD25%/Cool40 parameters sit in a broad plateau of strong performance (not a fragile peak), walk-forward validation suggests the approach works out-of-sample, and exit diagnostics confirm the 25% trigger identifies genuine SPY stress episodes. On the cautionary side: block-bootstrap analysis shows the strategy beats buy-and-hold on Sharpe in only 36% of randomly reordered return histories, meaning the Sharpe advantage is regime-conditional -- it depends on the specific pattern of bull runs followed by sharp corrections that characterized 2009-2026. The strategy is a useful practical overlay for regimes resembling recent history, not evidence of a regime-invariant alpha source.</w:t>
       </w:r>
     </w:p>
     <w:p>
@@ -12053,7 +12076,7 @@
           <w:color w:val="666666"/>
           <w:sz w:val="20"/>
         </w:rPr>
-        <w:t>The analysis uses historical data from June 2009 through March 2026. Past performance does not guarantee future results. This article is for informational purposes only and does not constitute investment advice.</w:t>
+        <w:t>The analysis uses historical data from 1950 (for extended S&amp;P 500 analysis) and June 2009 (for UPRO-specific results) through March 2026. Past performance does not guarantee future results. This article is for informational purposes only and does not constitute investment advice.</w:t>
       </w:r>
     </w:p>
     <w:sectPr>

</xml_diff>

<commit_message>
Fix dividend disclaimer: data uses auto-adjusted prices, not price-only
The article incorrectly claimed "price returns only (dividends excluded)"
but build_docx.py uses auto_adjust=True which includes dividends.
Rewritten to accurately describe dividend-adjusted total returns.

Co-Authored-By: Claude Opus 4.6 <noreply@anthropic.com>
</commit_message>
<xml_diff>
--- a/UPRO_Timing_Strategies_Article.docx
+++ b/UPRO_Timing_Strategies_Article.docx
@@ -11976,28 +11976,10 @@
         <w:rPr>
           <w:b/>
         </w:rPr>
-        <w:t>Price returns vs total returns.</w:t>
+        <w:t>Dividends.</w:t>
       </w:r>
       <w:r>
-        <w:t xml:space="preserve"> This analysis uses price returns only (dividends excluded for SPY and related calculations). This is a conservative assumption -- including SPY dividends (~1.3% annual yield) would improve the SPY benchmark by roughly 1.5-2% CAGR annually, making the comparison </w:t>
-      </w:r>
-      <w:r>
-        <w:rPr>
-          <w:i/>
-        </w:rPr>
-        <w:t>more favorable to SPY</w:t>
-      </w:r>
-      <w:r>
-        <w:t xml:space="preserve"> relative to the timing strategies. UPRO itself targets 3x the daily </w:t>
-      </w:r>
-      <w:r>
-        <w:rPr>
-          <w:i/>
-        </w:rPr>
-        <w:t>price</w:t>
-      </w:r>
-      <w:r>
-        <w:t xml:space="preserve"> return of the S&amp;P 500 (before fees) and does not distribute dividends, so price returns are the appropriate apples-to-apples comparison for the UPRO-specific results.</w:t>
+        <w:t xml:space="preserve"> All prices in this analysis are dividend-adjusted (Yahoo Finance auto-adjust), meaning returns include reinvested distributions for all instruments. SPY pays approximately 1.2% annually in dividends; UPRO pays smaller quarterly distributions (~0.8% annually). Both are captured in the data. When a timing strategy is holding UPRO, returns include UPRO's distributions; when in cash, the portfolio earns the T-bill rate. This is an apples-to-apples comparison: both UPRO buy-and-hold and the timing strategies reflect total returns.</w:t>
       </w:r>
     </w:p>
     <w:p>

</xml_diff>

<commit_message>
Update article with corrected bootstrap results and VIX re-entry note
- Fixed methodology note: data is dividend-adjusted, not price-only
- Updated summary and conclusion with honest bootstrap findings:
  TLT's advantage is regime-dependent (median Sharpe 0.72 vs 0.73
  for T-bills), not the previously claimed 0.92 vs 0.89
- Both variants maintain 99.8%+ probability of positive Sharpe
- Added VIX-gated re-entry section: tested and rejected, VIX stays
  elevated during best buying opportunities
- Rebuilt Word doc and charts

Co-Authored-By: Claude Opus 4.6 <noreply@anthropic.com>
</commit_message>
<xml_diff>
--- a/UPRO_Timing_Strategies_Article.docx
+++ b/UPRO_Timing_Strategies_Article.docx
@@ -48,7 +48,7 @@
         <w:pStyle w:val="ListBullet"/>
       </w:pPr>
       <w:r>
-        <w:t>An enhancement: parking idle cash in TLT (long-term Treasuries) instead of T-bills during cooling periods pushes the Sharpe to 0.88 and terminal wealth to $10.4M -- actually beating UPRO buy-and-hold -- by harvesting flight-to-quality rallies when stocks crash. Block-bootstrap analysis confirms TLT's Sharpe advantage is robust: median bootstrapped Sharpe of 0.92 vs 0.89 for T-bill cash.</w:t>
+        <w:t>An enhancement: parking idle cash in TLT (long-term Treasuries) instead of T-bills during cooling periods pushes the Sharpe to 0.88 and terminal wealth to $10.4M -- actually beating UPRO buy-and-hold -- by harvesting flight-to-quality rallies when stocks crash. Block-bootstrap analysis (reshuffling paired UPRO/TLT return blocks and re-running the strategy) shows both variants maintain positive Sharpe in 99.8%+ of simulations, though TLT's advantage over T-bills is regime-dependent rather than structural.</w:t>
       </w:r>
     </w:p>
     <w:p>
@@ -181,7 +181,7 @@
         <w:t>Data:</w:t>
       </w:r>
       <w:r>
-        <w:t xml:space="preserve"> Yahoo Finance, split-adjusted (auto_adjust), price returns only. Dividends are excluded, which is a conservative assumption -- actual returns for SPY would be modestly higher.</w:t>
+        <w:t xml:space="preserve"> Yahoo Finance, dividend-adjusted (auto_adjust). All returns include reinvested distributions for all instruments (see Limitations section for details).</w:t>
       </w:r>
     </w:p>
     <w:p>
@@ -4471,7 +4471,7 @@
         <w:t>35 percentage points better</w:t>
       </w:r>
       <w:r>
-        <w:t xml:space="preserve"> (-41.8% vs -76.8%). The Sharpe ratio improved from 0.77 to 0.85 over this test period. 31 trade signals (~15 round trips) over 16+ years. You're invested 86% of the time.</w:t>
+        <w:t xml:space="preserve"> (-41.8% vs -76.8%). The Sharpe ratio improved from 0.77 to 0.85 over this test period. 31 trade signals (~15 round trips) over 16+ years. You're invested 86% of the time. (As we'll see shortly, a different cash vehicle during cooling periods can erase most of this wealth gap.)</w:t>
       </w:r>
     </w:p>
     <w:p>
@@ -9576,6 +9576,19 @@
     <w:p>
       <w:r>
         <w:t>The volatility-normalized variants all underperform the fixed 25% rule. The best (k=7) achieves a 0.71 Sharpe with more trades (43 vs. 31). This is a failed generalization test: the theoretically "smarter" adaptive threshold does not improve on the simple fixed rule over this period. The likely explanation is practical rather than deep -- a constant threshold produces fewer false signals during calm periods (when rolling volatility is low and the normalized threshold would be too tight) and remains effective during crises (when volatility spikes and the normalized threshold would be too loose). The result increases confidence that 25% is a practically useful threshold for UPRO, but it does not demonstrate that the number has any structural optimality beyond being well-matched to UPRO's realized volatility during 2009-2026.</w:t>
+      </w:r>
+    </w:p>
+    <w:p>
+      <w:pPr>
+        <w:pStyle w:val="Heading2"/>
+      </w:pPr>
+      <w:r>
+        <w:t>VIX-Gated Re-Entry</w:t>
+      </w:r>
+    </w:p>
+    <w:p>
+      <w:r>
+        <w:t>Another natural refinement: instead of unconditionally re-entering after the 40-day cooling period, require the VIX to drop below a threshold (e.g., 25 or 30) before re-entering. The intuition is appealing -- don't buy back into a still-volatile market. I tested several combinations of shortened cooling periods (10 and 20 days) with VIX gates (25 and 30), as well as the full 40-day cooling period with a VIX gate. All variants underperformed the baseline DD25%/Cool40 on both terminal wealth and Sharpe ratio. The reason: VIX tends to stay elevated precisely during the sharp recovery rallies that drive most of the strategy's re-entry gains. Waiting for VIX to normalize means missing those recoveries and frequently whipsawing into a worse entry point. The unconditional 40-day cooling period, despite its simplicity, outperforms the "smarter" VIX-gated alternatives.</w:t>
       </w:r>
     </w:p>
     <w:p>
@@ -12008,7 +12021,7 @@
     </w:p>
     <w:p>
       <w:r>
-        <w:t>Parking idle cash in TLT during cooling periods pushes the result further: a 0.88 Sharpe ratio, $10.4M terminal wealth (beating buy-and-hold's $9.5M), and a -55% max drawdown. Block-bootstrap analysis (10,000 iterations, 20-day blocks) confirms the TLT variant's Sharpe advantage is robust: median bootstrapped Sharpe of 0.92 vs 0.89 for T-bill cash, with a 100% probability of positive Sharpe across all bootstrap samples. The TLT variant exploits the flight-to-quality effect -- when stocks crash, long-term Treasuries tend to rally -- turning the cooling period from dead time into a productive hedge.</w:t>
+        <w:t>Parking idle cash in TLT during cooling periods pushes the result further: a 0.88 Sharpe ratio, $10.4M terminal wealth (beating buy-and-hold's $9.5M), and a -55% max drawdown. Block-bootstrap analysis (10,000 iterations reshuffling paired 20-day blocks of UPRO/TLT returns and re-running the DD exit strategy on each synthetic path) shows both variants produce positive Sharpe in 99.8%+ of simulations -- confirming the strategy's risk-adjusted edge is real, not a lucky accident. However, TLT's median bootstrapped Sharpe (0.72) is essentially equal to T-bill's (0.73), meaning TLT's historical advantage (0.88 vs 0.85) depends on the specific sequencing of flight-to-quality episodes during 2009-2026 rather than a structural edge that generalizes to arbitrary return orderings. The TLT variant exploits the flight-to-quality effect -- when stocks crash, long-term Treasuries tend to rally -- turning the cooling period from dead time into a productive hedge. But investors should understand that this benefit is regime-conditional: it works when equity drawdowns coincide with bond rallies (2011, 2018, 2020), not when both assets fall together (2022).</w:t>
       </w:r>
     </w:p>
     <w:p>

</xml_diff>